<commit_message>
Added explation about rgb led
</commit_message>
<xml_diff>
--- a/ספר פרוייקט שלי וסשה.docx
+++ b/ספר פרוייקט שלי וסשה.docx
@@ -1,6 +1,6 @@
 
 <file path=word/document.xml><?xml version="1.0" encoding="utf-8"?>
-<w:document xmlns:wpc="http://schemas.microsoft.com/office/word/2010/wordprocessingCanvas" xmlns:cx="http://schemas.microsoft.com/office/drawing/2014/chartex" xmlns:cx1="http://schemas.microsoft.com/office/drawing/2015/9/8/chartex" xmlns:cx2="http://schemas.microsoft.com/office/drawing/2015/10/21/chartex" xmlns:cx3="http://schemas.microsoft.com/office/drawing/2016/5/9/chartex" xmlns:cx4="http://schemas.microsoft.com/office/drawing/2016/5/10/chartex" xmlns:cx5="http://schemas.microsoft.com/office/drawing/2016/5/11/chartex" xmlns:cx6="http://schemas.microsoft.com/office/drawing/2016/5/12/chartex" xmlns:cx7="http://schemas.microsoft.com/office/drawing/2016/5/13/chartex" xmlns:cx8="http://schemas.microsoft.com/office/drawing/2016/5/14/chartex" xmlns:mc="http://schemas.openxmlformats.org/markup-compatibility/2006" xmlns:aink="http://schemas.microsoft.com/office/drawing/2016/ink" xmlns:am3d="http://schemas.microsoft.com/office/drawing/2017/model3d" xmlns:o="urn:schemas-microsoft-com:office:office" xmlns:oel="http://schemas.microsoft.com/office/2019/extlst" xmlns:r="http://schemas.openxmlformats.org/officeDocument/2006/relationships" xmlns:m="http://schemas.openxmlformats.org/officeDocument/2006/math" xmlns:v="urn:schemas-microsoft-com:vml" xmlns:wp14="http://schemas.microsoft.com/office/word/2010/wordprocessingDrawing" xmlns:wp="http://schemas.openxmlformats.org/drawingml/2006/wordprocessingDrawing" xmlns:w10="urn:schemas-microsoft-com:office:word" xmlns:w="http://schemas.openxmlformats.org/wordprocessingml/2006/main" xmlns:w14="http://schemas.microsoft.com/office/word/2010/wordml" xmlns:w15="http://schemas.microsoft.com/office/word/2012/wordml" xmlns:w16cex="http://schemas.microsoft.com/office/word/2018/wordml/cex" xmlns:w16cid="http://schemas.microsoft.com/office/word/2016/wordml/cid" xmlns:w16="http://schemas.microsoft.com/office/word/2018/wordml" xmlns:w16du="http://schemas.microsoft.com/office/word/2023/wordml/word16du" xmlns:w16sdtdh="http://schemas.microsoft.com/office/word/2020/wordml/sdtdatahash" xmlns:w16se="http://schemas.microsoft.com/office/word/2015/wordml/symex" xmlns:wpg="http://schemas.microsoft.com/office/word/2010/wordprocessingGroup" xmlns:wpi="http://schemas.microsoft.com/office/word/2010/wordprocessingInk" xmlns:wne="http://schemas.microsoft.com/office/word/2006/wordml" xmlns:wps="http://schemas.microsoft.com/office/word/2010/wordprocessingShape" mc:Ignorable="w14 w15 w16se w16cid w16 w16cex w16sdtdh w16du wp14">
+<w:document xmlns:wpc="http://schemas.microsoft.com/office/word/2010/wordprocessingCanvas" xmlns:cx="http://schemas.microsoft.com/office/drawing/2014/chartex" xmlns:cx1="http://schemas.microsoft.com/office/drawing/2015/9/8/chartex" xmlns:cx2="http://schemas.microsoft.com/office/drawing/2015/10/21/chartex" xmlns:cx3="http://schemas.microsoft.com/office/drawing/2016/5/9/chartex" xmlns:cx4="http://schemas.microsoft.com/office/drawing/2016/5/10/chartex" xmlns:cx5="http://schemas.microsoft.com/office/drawing/2016/5/11/chartex" xmlns:cx6="http://schemas.microsoft.com/office/drawing/2016/5/12/chartex" xmlns:cx7="http://schemas.microsoft.com/office/drawing/2016/5/13/chartex" xmlns:cx8="http://schemas.microsoft.com/office/drawing/2016/5/14/chartex" xmlns:mc="http://schemas.openxmlformats.org/markup-compatibility/2006" xmlns:aink="http://schemas.microsoft.com/office/drawing/2016/ink" xmlns:am3d="http://schemas.microsoft.com/office/drawing/2017/model3d" xmlns:o="urn:schemas-microsoft-com:office:office" xmlns:r="http://schemas.openxmlformats.org/officeDocument/2006/relationships" xmlns:m="http://schemas.openxmlformats.org/officeDocument/2006/math" xmlns:v="urn:schemas-microsoft-com:vml" xmlns:wp14="http://schemas.microsoft.com/office/word/2010/wordprocessingDrawing" xmlns:wp="http://schemas.openxmlformats.org/drawingml/2006/wordprocessingDrawing" xmlns:w10="urn:schemas-microsoft-com:office:word" xmlns:w="http://schemas.openxmlformats.org/wordprocessingml/2006/main" xmlns:w14="http://schemas.microsoft.com/office/word/2010/wordml" xmlns:w15="http://schemas.microsoft.com/office/word/2012/wordml" xmlns:w16cid="http://schemas.microsoft.com/office/word/2016/wordml/cid" xmlns:w16se="http://schemas.microsoft.com/office/word/2015/wordml/symex" xmlns:wpg="http://schemas.microsoft.com/office/word/2010/wordprocessingGroup" xmlns:wpi="http://schemas.microsoft.com/office/word/2010/wordprocessingInk" xmlns:wne="http://schemas.microsoft.com/office/word/2006/wordml" xmlns:wps="http://schemas.microsoft.com/office/word/2010/wordprocessingShape" mc:Ignorable="w14 w15 w16se w16cid wp14">
   <w:body>
     <w:p>
       <w:pPr>
@@ -495,6 +495,7 @@
           <w:rFonts w:ascii="Tahoma" w:hAnsi="Tahoma" w:cs="Tahoma"/>
           <w:rtl/>
         </w:rPr>
+        <w:lastRenderedPageBreak/>
         <w:t>הפרויקט מתאים לשימושים תעשייתיים, חינוכיים ומשחקיים, והוא מציע גישה גמישה המאפשרת התאמה לתחומים מגוונים, תוך שמירה על עלויות נמוכות ופשטות יחסית ביישום.</w:t>
       </w:r>
     </w:p>
@@ -2797,7 +2798,7 @@
               </wp:inline>
             </w:drawing>
           </mc:Choice>
-          <mc:Fallback>
+          <mc:Fallback xmlns:w16sdtdh="http://schemas.microsoft.com/office/word/2020/wordml/sdtdatahash" xmlns:w16du="http://schemas.microsoft.com/office/word/2023/wordml/word16du" xmlns:w16="http://schemas.microsoft.com/office/word/2018/wordml" xmlns:w16cex="http://schemas.microsoft.com/office/word/2018/wordml/cex" xmlns:oel="http://schemas.microsoft.com/office/2019/extlst">
             <w:pict>
               <v:roundrect w14:anchorId="17ED87AC" id="מלבן מעוגל 6" o:spid="_x0000_s1026" style="width:9.45pt;height:9.45pt;visibility:visible;mso-wrap-style:square;mso-left-percent:-10001;mso-top-percent:-10001;mso-position-horizontal:absolute;mso-position-horizontal-relative:char;mso-position-vertical:absolute;mso-position-vertical-relative:line;mso-left-percent:-10001;mso-top-percent:-10001;v-text-anchor:top" arcsize="10923f" o:gfxdata="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" fillcolor="#a8d08d">
                 <o:lock v:ext="edit" aspectratio="t"/>
@@ -2919,7 +2920,7 @@
               </wp:inline>
             </w:drawing>
           </mc:Choice>
-          <mc:Fallback>
+          <mc:Fallback xmlns:w16sdtdh="http://schemas.microsoft.com/office/word/2020/wordml/sdtdatahash" xmlns:w16du="http://schemas.microsoft.com/office/word/2023/wordml/word16du" xmlns:w16="http://schemas.microsoft.com/office/word/2018/wordml" xmlns:w16cex="http://schemas.microsoft.com/office/word/2018/wordml/cex" xmlns:oel="http://schemas.microsoft.com/office/2019/extlst">
             <w:pict>
               <v:roundrect w14:anchorId="075500E5" id="מלבן מעוגל 5" o:spid="_x0000_s1026" style="width:9.45pt;height:9.45pt;visibility:visible;mso-wrap-style:square;mso-left-percent:-10001;mso-top-percent:-10001;mso-position-horizontal:absolute;mso-position-horizontal-relative:char;mso-position-vertical:absolute;mso-position-vertical-relative:line;mso-left-percent:-10001;mso-top-percent:-10001;v-text-anchor:top" arcsize="10923f" o:gfxdata="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">
                 <o:lock v:ext="edit" aspectratio="t"/>
@@ -3526,6 +3527,7 @@
           <w:rFonts w:ascii="Tahoma" w:hAnsi="Tahoma" w:cs="Tahoma"/>
           <w:rtl/>
         </w:rPr>
+        <w:lastRenderedPageBreak/>
         <w:t>3.</w:t>
       </w:r>
       <w:r>
@@ -3574,15 +3576,7 @@
           <w:rFonts w:ascii="Tahoma" w:hAnsi="Tahoma" w:cs="Tahoma"/>
           <w:rtl/>
         </w:rPr>
-        <w:t xml:space="preserve"> כאשר </w:t>
-      </w:r>
-      <w:r>
-        <w:rPr>
-          <w:rFonts w:ascii="Tahoma" w:hAnsi="Tahoma" w:cs="Tahoma"/>
-          <w:rtl/>
-        </w:rPr>
-        <w:lastRenderedPageBreak/>
-        <w:t>מתחיל להחשיך.</w:t>
+        <w:t xml:space="preserve"> כאשר מתחיל להחשיך.</w:t>
       </w:r>
       <w:r>
         <w:rPr>
@@ -4318,6 +4312,13 @@
           <w:rtl/>
         </w:rPr>
         <w:br/>
+      </w:r>
+      <w:r>
+        <w:rPr>
+          <w:rFonts w:ascii="Tahoma" w:hAnsi="Tahoma" w:cs="Tahoma"/>
+          <w:rtl/>
+        </w:rPr>
+        <w:lastRenderedPageBreak/>
         <w:t>3. ___________________________________________________________________</w:t>
       </w:r>
       <w:r>
@@ -4370,13 +4371,6 @@
           <w:rtl/>
         </w:rPr>
         <w:br/>
-      </w:r>
-      <w:r>
-        <w:rPr>
-          <w:rFonts w:ascii="Tahoma" w:hAnsi="Tahoma" w:cs="Tahoma"/>
-          <w:rtl/>
-        </w:rPr>
-        <w:lastRenderedPageBreak/>
         <w:t>תאריך: ______________</w:t>
       </w:r>
       <w:r>
@@ -4697,7 +4691,25 @@
           <w:rtl/>
         </w:rPr>
         <w:br/>
-        <w:t xml:space="preserve">6. הכרת האמצעים לפיתוח מעגל המשלב תוכנה וחומרה                                                                      7. כתיבת תוכנית בשפת </w:t>
+        <w:t xml:space="preserve">6. הכרת האמצעים לפיתוח מעגל המשלב תוכנה וחומרה                                                                      7. כתיבת </w:t>
+      </w:r>
+      <w:proofErr w:type="spellStart"/>
+      <w:r>
+        <w:rPr>
+          <w:rFonts w:ascii="Tahoma" w:hAnsi="Tahoma" w:cs="Tahoma"/>
+          <w:u w:val="single"/>
+          <w:rtl/>
+        </w:rPr>
+        <w:t>תוכנית</w:t>
+      </w:r>
+      <w:proofErr w:type="spellEnd"/>
+      <w:r>
+        <w:rPr>
+          <w:rFonts w:ascii="Tahoma" w:hAnsi="Tahoma" w:cs="Tahoma"/>
+          <w:u w:val="single"/>
+          <w:rtl/>
+        </w:rPr>
+        <w:t xml:space="preserve"> בשפת </w:t>
       </w:r>
       <w:r>
         <w:rPr>
@@ -5056,6 +5068,7 @@
           <w:bCs/>
           <w:rtl/>
         </w:rPr>
+        <w:lastRenderedPageBreak/>
         <w:t>ביבליוגרפיה</w:t>
       </w:r>
       <w:r>
@@ -5285,13 +5298,6 @@
           <w:rtl/>
         </w:rPr>
         <w:br/>
-      </w:r>
-      <w:r>
-        <w:rPr>
-          <w:rFonts w:ascii="Tahoma" w:hAnsi="Tahoma" w:cs="Tahoma"/>
-          <w:rtl/>
-        </w:rPr>
-        <w:lastRenderedPageBreak/>
         <w:t>השכלה:_</w:t>
       </w:r>
       <w:r>
@@ -5597,7 +5603,7 @@
               </wp:inline>
             </w:drawing>
           </mc:Choice>
-          <mc:Fallback>
+          <mc:Fallback xmlns:w16sdtdh="http://schemas.microsoft.com/office/word/2020/wordml/sdtdatahash" xmlns:w16du="http://schemas.microsoft.com/office/word/2023/wordml/word16du" xmlns:w16="http://schemas.microsoft.com/office/word/2018/wordml" xmlns:w16cex="http://schemas.microsoft.com/office/word/2018/wordml/cex" xmlns:oel="http://schemas.microsoft.com/office/2019/extlst">
             <w:pict>
               <v:roundrect w14:anchorId="1D42CF48" id="מלבן מעוגל 4" o:spid="_x0000_s1026" style="width:9.45pt;height:9.45pt;visibility:visible;mso-wrap-style:square;mso-left-percent:-10001;mso-top-percent:-10001;mso-position-horizontal:absolute;mso-position-horizontal-relative:char;mso-position-vertical:absolute;mso-position-vertical-relative:line;mso-left-percent:-10001;mso-top-percent:-10001;v-text-anchor:top" arcsize="10923f" o:gfxdata="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">
                 <o:lock v:ext="edit" aspectratio="t"/>
@@ -5685,7 +5691,7 @@
               </wp:inline>
             </w:drawing>
           </mc:Choice>
-          <mc:Fallback>
+          <mc:Fallback xmlns:w16sdtdh="http://schemas.microsoft.com/office/word/2020/wordml/sdtdatahash" xmlns:w16du="http://schemas.microsoft.com/office/word/2023/wordml/word16du" xmlns:w16="http://schemas.microsoft.com/office/word/2018/wordml" xmlns:w16cex="http://schemas.microsoft.com/office/word/2018/wordml/cex" xmlns:oel="http://schemas.microsoft.com/office/2019/extlst">
             <w:pict>
               <v:roundrect w14:anchorId="070688B8" id="מלבן מעוגל 3" o:spid="_x0000_s1026" style="width:9.45pt;height:9.45pt;visibility:visible;mso-wrap-style:square;mso-left-percent:-10001;mso-top-percent:-10001;mso-position-horizontal:absolute;mso-position-horizontal-relative:char;mso-position-vertical:absolute;mso-position-vertical-relative:line;mso-left-percent:-10001;mso-top-percent:-10001;v-text-anchor:top" arcsize="10923f" o:gfxdata="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">
                 <o:lock v:ext="edit" aspectratio="t"/>
@@ -5819,7 +5825,7 @@
               </wp:inline>
             </w:drawing>
           </mc:Choice>
-          <mc:Fallback>
+          <mc:Fallback xmlns:w16sdtdh="http://schemas.microsoft.com/office/word/2020/wordml/sdtdatahash" xmlns:w16du="http://schemas.microsoft.com/office/word/2023/wordml/word16du" xmlns:w16="http://schemas.microsoft.com/office/word/2018/wordml" xmlns:w16cex="http://schemas.microsoft.com/office/word/2018/wordml/cex" xmlns:oel="http://schemas.microsoft.com/office/2019/extlst">
             <w:pict>
               <v:roundrect w14:anchorId="10070B32" id="מלבן מעוגל 2" o:spid="_x0000_s1026" style="width:9.45pt;height:9.45pt;visibility:visible;mso-wrap-style:square;mso-left-percent:-10001;mso-top-percent:-10001;mso-position-horizontal:absolute;mso-position-horizontal-relative:char;mso-position-vertical:absolute;mso-position-vertical-relative:line;mso-left-percent:-10001;mso-top-percent:-10001;v-text-anchor:top" arcsize="10923f" o:gfxdata="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">
                 <o:lock v:ext="edit" aspectratio="t"/>
@@ -5963,7 +5969,7 @@
               </wp:inline>
             </w:drawing>
           </mc:Choice>
-          <mc:Fallback>
+          <mc:Fallback xmlns:w16sdtdh="http://schemas.microsoft.com/office/word/2020/wordml/sdtdatahash" xmlns:w16du="http://schemas.microsoft.com/office/word/2023/wordml/word16du" xmlns:w16="http://schemas.microsoft.com/office/word/2018/wordml" xmlns:w16cex="http://schemas.microsoft.com/office/word/2018/wordml/cex" xmlns:oel="http://schemas.microsoft.com/office/2019/extlst">
             <w:pict>
               <v:roundrect w14:anchorId="4AE4CB54" id="מלבן מעוגל 1" o:spid="_x0000_s1026" style="width:9.45pt;height:9.45pt;visibility:visible;mso-wrap-style:square;mso-left-percent:-10001;mso-top-percent:-10001;mso-position-horizontal:absolute;mso-position-horizontal-relative:char;mso-position-vertical:absolute;mso-position-vertical-relative:line;mso-left-percent:-10001;mso-top-percent:-10001;v-text-anchor:top" arcsize="10923f" o:gfxdata="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">
                 <o:lock v:ext="edit" aspectratio="t"/>
@@ -5979,7 +5985,15 @@
           <w:rFonts w:ascii="Tahoma" w:hAnsi="Tahoma" w:cs="Tahoma"/>
           <w:rtl/>
         </w:rPr>
-        <w:t xml:space="preserve"> הבקשה אינה מאושרת מהנימוק(ים) שלהלן: ____________________________________</w:t>
+        <w:t xml:space="preserve"> הבקשה אינה מאושרת מהנימוק(ים) שלהלן: </w:t>
+      </w:r>
+      <w:r>
+        <w:rPr>
+          <w:rFonts w:ascii="Tahoma" w:hAnsi="Tahoma" w:cs="Tahoma"/>
+          <w:rtl/>
+        </w:rPr>
+        <w:lastRenderedPageBreak/>
+        <w:t>____________________________________</w:t>
       </w:r>
       <w:r>
         <w:rPr>
@@ -6526,7 +6540,15 @@
           <w:rFonts w:ascii="Tahoma" w:hAnsi="Tahoma" w:cs="Tahoma"/>
           <w:rtl/>
         </w:rPr>
-        <w:t>, תכנון אלגוריתמים חכמים, ואינטגרציה של מערכות חומרה ותוכנה מתקדמות. המערכת שפותחה כאן היא דוגמה לפיתוח טכנולוגי המשלב חשיבה יצירתית עם כלים הנדסיים וטכנולוגיים מתקדמים, תוך התאמה למגמות עתידיות בעולם הרכב והמערכות האוטונומיות.</w:t>
+        <w:t xml:space="preserve">, תכנון אלגוריתמים חכמים, ואינטגרציה של מערכות חומרה ותוכנה מתקדמות. המערכת שפותחה כאן היא דוגמה </w:t>
+      </w:r>
+      <w:r>
+        <w:rPr>
+          <w:rFonts w:ascii="Tahoma" w:hAnsi="Tahoma" w:cs="Tahoma"/>
+          <w:rtl/>
+        </w:rPr>
+        <w:lastRenderedPageBreak/>
+        <w:t>לפיתוח טכנולוגי המשלב חשיבה יצירתית עם כלים הנדסיים וטכנולוגיים מתקדמים, תוך התאמה למגמות עתידיות בעולם הרכב והמערכות האוטונומיות.</w:t>
       </w:r>
       <w:r>
         <w:rPr>
@@ -7065,7 +7087,23 @@
           <w:rFonts w:ascii="Tahoma" w:hAnsi="Tahoma" w:cs="Tahoma"/>
           <w:rtl/>
         </w:rPr>
-        <w:t xml:space="preserve"> (חיישן אור): מתאים את עוצמת התאורה של נורות הלד בהתאם לתנאי האור בסביבה.</w:t>
+        <w:t xml:space="preserve"> (חיישן אור): מתאים את עוצמת התאורה של נורות </w:t>
+      </w:r>
+      <w:proofErr w:type="spellStart"/>
+      <w:r>
+        <w:rPr>
+          <w:rFonts w:ascii="Tahoma" w:hAnsi="Tahoma" w:cs="Tahoma"/>
+          <w:rtl/>
+        </w:rPr>
+        <w:t>הלד</w:t>
+      </w:r>
+      <w:proofErr w:type="spellEnd"/>
+      <w:r>
+        <w:rPr>
+          <w:rFonts w:ascii="Tahoma" w:hAnsi="Tahoma" w:cs="Tahoma"/>
+          <w:rtl/>
+        </w:rPr>
+        <w:t xml:space="preserve"> בהתאם לתנאי האור בסביבה.</w:t>
       </w:r>
     </w:p>
     <w:p>
@@ -7403,7 +7441,23 @@
           <w:rFonts w:ascii="Tahoma" w:hAnsi="Tahoma" w:cs="Tahoma"/>
           <w:rtl/>
         </w:rPr>
-        <w:t xml:space="preserve"> (חיישן אור): מתאים את עוצמת התאורה של נורות הלד בהתאם לתנאי האור בסביבה.</w:t>
+        <w:t xml:space="preserve"> (חיישן אור): מתאים את עוצמת התאורה של נורות </w:t>
+      </w:r>
+      <w:proofErr w:type="spellStart"/>
+      <w:r>
+        <w:rPr>
+          <w:rFonts w:ascii="Tahoma" w:hAnsi="Tahoma" w:cs="Tahoma"/>
+          <w:rtl/>
+        </w:rPr>
+        <w:t>הלד</w:t>
+      </w:r>
+      <w:proofErr w:type="spellEnd"/>
+      <w:r>
+        <w:rPr>
+          <w:rFonts w:ascii="Tahoma" w:hAnsi="Tahoma" w:cs="Tahoma"/>
+          <w:rtl/>
+        </w:rPr>
+        <w:t xml:space="preserve"> בהתאם לתנאי האור בסביבה.</w:t>
       </w:r>
     </w:p>
     <w:p>
@@ -7446,6 +7500,7 @@
           <w:rFonts w:ascii="Tahoma" w:hAnsi="Tahoma" w:cs="Tahoma"/>
           <w:rtl/>
         </w:rPr>
+        <w:lastRenderedPageBreak/>
         <w:t xml:space="preserve">מסך </w:t>
       </w:r>
       <w:r>
@@ -9072,6 +9127,7 @@
           <w:rFonts w:ascii="Tahoma" w:hAnsi="Tahoma" w:cs="Tahoma"/>
           <w:rtl/>
         </w:rPr>
+        <w:lastRenderedPageBreak/>
         <w:br w:type="page"/>
       </w:r>
     </w:p>
@@ -9562,13 +9618,23 @@
           <w:rtl/>
         </w:rPr>
       </w:pPr>
-      <w:r>
-        <w:rPr>
-          <w:rFonts w:ascii="Tahoma" w:hAnsi="Tahoma" w:cs="Tahoma"/>
-          <w:sz w:val="24"/>
-          <w:szCs w:val="24"/>
-        </w:rPr>
-        <w:t xml:space="preserve">Xtensa LX6 </w:t>
+      <w:proofErr w:type="spellStart"/>
+      <w:r>
+        <w:rPr>
+          <w:rFonts w:ascii="Tahoma" w:hAnsi="Tahoma" w:cs="Tahoma"/>
+          <w:sz w:val="24"/>
+          <w:szCs w:val="24"/>
+        </w:rPr>
+        <w:t>Xtensa</w:t>
+      </w:r>
+      <w:proofErr w:type="spellEnd"/>
+      <w:r>
+        <w:rPr>
+          <w:rFonts w:ascii="Tahoma" w:hAnsi="Tahoma" w:cs="Tahoma"/>
+          <w:sz w:val="24"/>
+          <w:szCs w:val="24"/>
+        </w:rPr>
+        <w:t xml:space="preserve"> LX6 </w:t>
       </w:r>
       <w:proofErr w:type="gramStart"/>
       <w:r>
@@ -9844,6 +9910,7 @@
           <w:sz w:val="24"/>
           <w:szCs w:val="24"/>
         </w:rPr>
+        <w:lastRenderedPageBreak/>
         <w:t xml:space="preserve">ULP </w:t>
       </w:r>
       <w:proofErr w:type="gramStart"/>
@@ -10476,6 +10543,7 @@
         </w:rPr>
         <w:t xml:space="preserve">Switch &amp; </w:t>
       </w:r>
+      <w:proofErr w:type="spellStart"/>
       <w:proofErr w:type="gramStart"/>
       <w:r>
         <w:rPr>
@@ -10485,6 +10553,7 @@
         </w:rPr>
         <w:t>Balun</w:t>
       </w:r>
+      <w:proofErr w:type="spellEnd"/>
       <w:r>
         <w:rPr>
           <w:rFonts w:ascii="Tahoma" w:hAnsi="Tahoma" w:cs="Tahoma" w:hint="cs"/>
@@ -11484,8 +11553,37 @@
           <w:sz w:val="24"/>
           <w:szCs w:val="24"/>
         </w:rPr>
-        <w:t>RSA (Rivest-Shamir-Adleman</w:t>
-      </w:r>
+        <w:lastRenderedPageBreak/>
+        <w:t>RSA (</w:t>
+      </w:r>
+      <w:proofErr w:type="spellStart"/>
+      <w:r>
+        <w:rPr>
+          <w:rFonts w:ascii="Tahoma" w:hAnsi="Tahoma" w:cs="Tahoma"/>
+          <w:sz w:val="24"/>
+          <w:szCs w:val="24"/>
+        </w:rPr>
+        <w:t>Rivest</w:t>
+      </w:r>
+      <w:proofErr w:type="spellEnd"/>
+      <w:r>
+        <w:rPr>
+          <w:rFonts w:ascii="Tahoma" w:hAnsi="Tahoma" w:cs="Tahoma"/>
+          <w:sz w:val="24"/>
+          <w:szCs w:val="24"/>
+        </w:rPr>
+        <w:t>-Shamir-</w:t>
+      </w:r>
+      <w:proofErr w:type="spellStart"/>
+      <w:r>
+        <w:rPr>
+          <w:rFonts w:ascii="Tahoma" w:hAnsi="Tahoma" w:cs="Tahoma"/>
+          <w:sz w:val="24"/>
+          <w:szCs w:val="24"/>
+        </w:rPr>
+        <w:t>Adleman</w:t>
+      </w:r>
+      <w:proofErr w:type="spellEnd"/>
       <w:proofErr w:type="gramStart"/>
       <w:r>
         <w:rPr>
@@ -11729,7 +11827,6 @@
           <w:sz w:val="24"/>
           <w:szCs w:val="24"/>
         </w:rPr>
-        <w:lastRenderedPageBreak/>
         <w:t xml:space="preserve">Embedded Flash or </w:t>
       </w:r>
       <w:proofErr w:type="gramStart"/>
@@ -12137,6 +12234,7 @@
           <w:szCs w:val="24"/>
           <w:rtl/>
         </w:rPr>
+        <w:lastRenderedPageBreak/>
         <w:t>ה-</w:t>
       </w:r>
       <w:r>
@@ -12256,7 +12354,6 @@
           <w:szCs w:val="28"/>
           <w:rtl/>
         </w:rPr>
-        <w:lastRenderedPageBreak/>
         <w:t>יתרונות</w:t>
       </w:r>
     </w:p>
@@ -12459,8 +12556,18 @@
           <w:sz w:val="24"/>
           <w:szCs w:val="24"/>
         </w:rPr>
-        <w:t>GPIO, General Purpose Input/Output</w:t>
-      </w:r>
+        <w:t xml:space="preserve">GPIO, General Purpose </w:t>
+      </w:r>
+      <w:proofErr w:type="spellStart"/>
+      <w:r>
+        <w:rPr>
+          <w:rFonts w:ascii="Tahoma" w:hAnsi="Tahoma" w:cs="Tahoma"/>
+          <w:sz w:val="24"/>
+          <w:szCs w:val="24"/>
+        </w:rPr>
+        <w:t>Input/Output</w:t>
+      </w:r>
+      <w:proofErr w:type="spellEnd"/>
       <w:r>
         <w:rPr>
           <w:rFonts w:ascii="Tahoma" w:hAnsi="Tahoma" w:cs="Tahoma"/>
@@ -12916,6 +13023,7 @@
           <w:szCs w:val="24"/>
           <w:rtl/>
         </w:rPr>
+        <w:lastRenderedPageBreak/>
         <w:t>מתח כניסה (</w:t>
       </w:r>
       <w:r>
@@ -13282,7 +13390,6 @@
           <w:szCs w:val="24"/>
           <w:rtl/>
         </w:rPr>
-        <w:lastRenderedPageBreak/>
         <w:t xml:space="preserve">יציאת </w:t>
       </w:r>
       <w:r>
@@ -13916,6 +14023,7 @@
           <w:szCs w:val="28"/>
           <w:rtl/>
         </w:rPr>
+        <w:lastRenderedPageBreak/>
         <w:t>יכולת עיבוד חזקה</w:t>
       </w:r>
       <w:r>
@@ -13963,6 +14071,7 @@
         </w:rPr>
         <w:t xml:space="preserve"> כולל מעבד </w:t>
       </w:r>
+      <w:proofErr w:type="spellStart"/>
       <w:r>
         <w:rPr>
           <w:rFonts w:ascii="Tahoma" w:hAnsi="Tahoma" w:cs="Tahoma"/>
@@ -13971,6 +14080,7 @@
         </w:rPr>
         <w:t>Xtensa</w:t>
       </w:r>
+      <w:proofErr w:type="spellEnd"/>
       <w:r>
         <w:rPr>
           <w:rFonts w:ascii="Tahoma" w:hAnsi="Tahoma" w:cs="Tahoma"/>
@@ -14296,17 +14406,7 @@
           <w:szCs w:val="24"/>
           <w:rtl/>
         </w:rPr>
-        <w:t xml:space="preserve"> מספק גמישות רבה לחיבור למכשירים סמוכים כמו טלפונים חכמים או חיישנים. כמו כן, תמיכתו </w:t>
-      </w:r>
-      <w:r>
-        <w:rPr>
-          <w:rFonts w:ascii="Tahoma" w:hAnsi="Tahoma" w:cs="Tahoma"/>
-          <w:sz w:val="24"/>
-          <w:szCs w:val="24"/>
-          <w:rtl/>
-        </w:rPr>
-        <w:lastRenderedPageBreak/>
-        <w:t>ב-</w:t>
+        <w:t xml:space="preserve"> מספק גמישות רבה לחיבור למכשירים סמוכים כמו טלפונים חכמים או חיישנים. כמו כן, תמיכתו ב-</w:t>
       </w:r>
       <w:r>
         <w:rPr>
@@ -14743,7 +14843,17 @@
           <w:szCs w:val="24"/>
           <w:rtl/>
         </w:rPr>
-        <w:t xml:space="preserve"> חדשניות מבטיח אמינות ומוכנות לטכנולוגיות מתקדמות, מה שהופך אותו לבחירה מועדפת לפיתוח פרויקטים חכמים. היכולת להשתמש בניסיון ובידע המצטבר של הקהילה מקלה על פיתוח פתרונות מותאמים אישית וביצוע אינטגרציה עם מערכות קיימות.</w:t>
+        <w:t xml:space="preserve"> חדשניות מבטיח אמינות ומוכנות לטכנולוגיות מתקדמות, מה שהופך אותו לבחירה מועדפת לפיתוח </w:t>
+      </w:r>
+      <w:r>
+        <w:rPr>
+          <w:rFonts w:ascii="Tahoma" w:hAnsi="Tahoma" w:cs="Tahoma"/>
+          <w:sz w:val="24"/>
+          <w:szCs w:val="24"/>
+          <w:rtl/>
+        </w:rPr>
+        <w:lastRenderedPageBreak/>
+        <w:t>פרויקטים חכמים. היכולת להשתמש בניסיון ובידע המצטבר של הקהילה מקלה על פיתוח פתרונות מותאמים אישית וביצוע אינטגרציה עם מערכות קיימות.</w:t>
       </w:r>
     </w:p>
     <w:p>
@@ -14939,44 +15049,1111 @@
     <w:p>
       <w:pPr>
         <w:rPr>
-          <w:rFonts w:ascii="Tahoma" w:hAnsi="Tahoma" w:cs="Tahoma"/>
-          <w:sz w:val="28"/>
-          <w:szCs w:val="28"/>
-          <w:rtl/>
-        </w:rPr>
-      </w:pPr>
+          <w:rFonts w:ascii="Tahoma" w:eastAsiaTheme="majorEastAsia" w:hAnsi="Tahoma" w:cs="Tahoma"/>
+          <w:b/>
+          <w:bCs/>
+          <w:i/>
+          <w:iCs/>
+          <w:sz w:val="56"/>
+          <w:szCs w:val="56"/>
+          <w:rtl/>
+        </w:rPr>
+      </w:pPr>
+      <w:r>
+        <w:rPr>
+          <w:rtl/>
+        </w:rPr>
+        <w:br w:type="page"/>
+      </w:r>
     </w:p>
     <w:p>
       <w:pPr>
         <w:pStyle w:val="1"/>
         <w:rPr>
           <w:rtl/>
-          <w:lang w:val="en-IL"/>
-        </w:rPr>
-      </w:pPr>
+        </w:rPr>
+      </w:pPr>
+      <w:r>
+        <w:rPr>
+          <w:rFonts w:hint="cs"/>
+          <w:rtl/>
+        </w:rPr>
+        <w:lastRenderedPageBreak/>
+        <w:t xml:space="preserve">נורת </w:t>
+      </w:r>
+      <w:r>
+        <w:rPr>
+          <w:rFonts w:hint="cs"/>
+        </w:rPr>
+        <w:t>RGB</w:t>
+      </w:r>
+    </w:p>
+    <w:p>
+      <w:pPr>
+        <w:rPr>
+          <w:rFonts w:cs="Calibri"/>
+          <w:sz w:val="24"/>
+          <w:szCs w:val="24"/>
+        </w:rPr>
+      </w:pPr>
+      <w:r>
+        <w:rPr>
+          <w:rFonts w:cs="Calibri"/>
+          <w:b/>
+          <w:bCs/>
+          <w:sz w:val="24"/>
+          <w:szCs w:val="24"/>
+          <w:rtl/>
+        </w:rPr>
+        <w:t>נורת</w:t>
+      </w:r>
+      <w:r>
+        <w:rPr>
+          <w:rFonts w:cs="Calibri"/>
+          <w:b/>
+          <w:bCs/>
+          <w:sz w:val="24"/>
+          <w:szCs w:val="24"/>
+        </w:rPr>
+        <w:t xml:space="preserve"> RGB LED (SMD 5050)</w:t>
+      </w:r>
+      <w:r>
+        <w:rPr>
+          <w:rFonts w:cs="Calibri"/>
+          <w:b/>
+          <w:bCs/>
+          <w:sz w:val="24"/>
+          <w:szCs w:val="24"/>
+        </w:rPr>
+        <w:t xml:space="preserve"> </w:t>
+      </w:r>
+      <w:bookmarkStart w:id="17" w:name="_GoBack"/>
+      <w:bookmarkEnd w:id="17"/>
+    </w:p>
+    <w:p>
+      <w:pPr>
+        <w:rPr>
+          <w:rFonts w:cs="Calibri" w:hint="cs"/>
+          <w:sz w:val="24"/>
+          <w:szCs w:val="24"/>
+          <w:rtl/>
+        </w:rPr>
+      </w:pPr>
+      <w:r>
+        <w:rPr>
+          <w:rFonts w:cs="Calibri"/>
+          <w:sz w:val="24"/>
+          <w:szCs w:val="24"/>
+          <w:rtl/>
+        </w:rPr>
+        <w:t xml:space="preserve">נורת </w:t>
+      </w:r>
+      <w:r>
+        <w:rPr>
+          <w:rFonts w:cs="Calibri" w:hint="cs"/>
+          <w:sz w:val="24"/>
+          <w:szCs w:val="24"/>
+          <w:rtl/>
+        </w:rPr>
+        <w:t>ה</w:t>
+      </w:r>
+      <w:r>
+        <w:rPr>
+          <w:rFonts w:cs="Calibri"/>
+          <w:sz w:val="24"/>
+          <w:szCs w:val="24"/>
+        </w:rPr>
+        <w:t xml:space="preserve"> </w:t>
+      </w:r>
+      <w:r>
+        <w:rPr>
+          <w:rFonts w:cs="Calibri"/>
+          <w:sz w:val="24"/>
+          <w:szCs w:val="24"/>
+        </w:rPr>
+        <w:t>RGB LED</w:t>
+      </w:r>
+      <w:r>
+        <w:rPr>
+          <w:rFonts w:cs="Calibri"/>
+          <w:sz w:val="24"/>
+          <w:szCs w:val="24"/>
+          <w:rtl/>
+        </w:rPr>
+        <w:t xml:space="preserve"> מסוג </w:t>
+      </w:r>
+      <w:r>
+        <w:rPr>
+          <w:rFonts w:cs="Calibri"/>
+          <w:sz w:val="24"/>
+          <w:szCs w:val="24"/>
+        </w:rPr>
+        <w:t xml:space="preserve"> SMD 5050 </w:t>
+      </w:r>
+      <w:r>
+        <w:rPr>
+          <w:rFonts w:cs="Calibri"/>
+          <w:sz w:val="24"/>
+          <w:szCs w:val="24"/>
+          <w:rtl/>
+        </w:rPr>
+        <w:t>היא נורה בעלת מבנה קומפקטי ויעיל, המשלב שלוש נורות קטנות בצבעים אדום</w:t>
+      </w:r>
+      <w:r>
+        <w:rPr>
+          <w:rFonts w:cs="Calibri"/>
+          <w:sz w:val="24"/>
+          <w:szCs w:val="24"/>
+        </w:rPr>
+        <w:t xml:space="preserve"> (Red), </w:t>
+      </w:r>
+      <w:r>
+        <w:rPr>
+          <w:rFonts w:cs="Calibri"/>
+          <w:sz w:val="24"/>
+          <w:szCs w:val="24"/>
+          <w:rtl/>
+        </w:rPr>
+        <w:t>ירוק</w:t>
+      </w:r>
+      <w:r>
+        <w:rPr>
+          <w:rFonts w:cs="Calibri"/>
+          <w:sz w:val="24"/>
+          <w:szCs w:val="24"/>
+        </w:rPr>
+        <w:t xml:space="preserve"> (Green) </w:t>
+      </w:r>
+      <w:r>
+        <w:rPr>
+          <w:rFonts w:cs="Calibri"/>
+          <w:sz w:val="24"/>
+          <w:szCs w:val="24"/>
+          <w:rtl/>
+        </w:rPr>
+        <w:t>וכחול</w:t>
+      </w:r>
+      <w:r>
+        <w:rPr>
+          <w:rFonts w:cs="Calibri"/>
+          <w:sz w:val="24"/>
+          <w:szCs w:val="24"/>
+        </w:rPr>
+        <w:t xml:space="preserve"> (Blue), </w:t>
+      </w:r>
+      <w:r>
+        <w:rPr>
+          <w:rFonts w:cs="Calibri"/>
+          <w:sz w:val="24"/>
+          <w:szCs w:val="24"/>
+          <w:rtl/>
+        </w:rPr>
+        <w:t>הממוקמות בתוך גוף נורה אחד. כל אחת מהנורות מכוסה בשכבה שקופה של חומר אפוקסי ומורכבת על גבי לוח מודפס</w:t>
+      </w:r>
+      <w:r>
+        <w:rPr>
+          <w:rFonts w:cs="Calibri"/>
+          <w:sz w:val="24"/>
+          <w:szCs w:val="24"/>
+        </w:rPr>
+        <w:t xml:space="preserve"> (PCB) </w:t>
+      </w:r>
+      <w:r>
+        <w:rPr>
+          <w:rFonts w:cs="Calibri"/>
+          <w:sz w:val="24"/>
+          <w:szCs w:val="24"/>
+          <w:rtl/>
+        </w:rPr>
+        <w:t xml:space="preserve">או משטח אחר, דבר המאפשר שילוב קל במעגלים אלקטרוניים. מידותיה הפיזיות הן </w:t>
+      </w:r>
+      <w:r>
+        <w:rPr>
+          <w:rFonts w:cs="Calibri"/>
+          <w:sz w:val="24"/>
+          <w:szCs w:val="24"/>
+        </w:rPr>
+        <w:t>5.0mm x 5.0mm</w:t>
+      </w:r>
+      <w:r>
+        <w:rPr>
+          <w:rFonts w:cs="Calibri" w:hint="cs"/>
+          <w:sz w:val="24"/>
+          <w:szCs w:val="24"/>
+          <w:rtl/>
+        </w:rPr>
+        <w:t xml:space="preserve"> מה</w:t>
+      </w:r>
+      <w:r>
+        <w:rPr>
+          <w:rFonts w:cs="Calibri"/>
+          <w:sz w:val="24"/>
+          <w:szCs w:val="24"/>
+          <w:rtl/>
+        </w:rPr>
+        <w:t xml:space="preserve"> שהופך אותה לקומפקטית ומתאימה לשימוש במגוון יישומים אלקטרוניים, כולל מערכות</w:t>
+      </w:r>
+      <w:r>
+        <w:rPr>
+          <w:rFonts w:cs="Calibri"/>
+          <w:sz w:val="24"/>
+          <w:szCs w:val="24"/>
+        </w:rPr>
+        <w:t xml:space="preserve"> IoT </w:t>
+      </w:r>
+      <w:r>
+        <w:rPr>
+          <w:rFonts w:cs="Calibri" w:hint="cs"/>
+          <w:sz w:val="24"/>
+          <w:szCs w:val="24"/>
+          <w:rtl/>
+        </w:rPr>
+        <w:t>כמו בפרויקט שלנו.</w:t>
+      </w:r>
+    </w:p>
+    <w:p>
+      <w:pPr>
+        <w:rPr>
+          <w:rFonts w:cs="Calibri"/>
+          <w:sz w:val="24"/>
+          <w:szCs w:val="24"/>
+        </w:rPr>
+      </w:pPr>
+      <w:r>
+        <w:rPr>
+          <w:rFonts w:cs="Calibri"/>
+          <w:b/>
+          <w:bCs/>
+          <w:sz w:val="24"/>
+          <w:szCs w:val="24"/>
+          <w:rtl/>
+        </w:rPr>
+        <w:t>תכונות טכניות</w:t>
+      </w:r>
+      <w:r>
+        <w:rPr>
+          <w:rFonts w:cs="Calibri"/>
+          <w:b/>
+          <w:bCs/>
+          <w:sz w:val="24"/>
+          <w:szCs w:val="24"/>
+        </w:rPr>
+        <w:t>:</w:t>
+      </w:r>
+    </w:p>
+    <w:p>
+      <w:pPr>
+        <w:numPr>
+          <w:ilvl w:val="0"/>
+          <w:numId w:val="34"/>
+        </w:numPr>
+        <w:rPr>
+          <w:rFonts w:cs="Calibri"/>
+          <w:sz w:val="24"/>
+          <w:szCs w:val="24"/>
+        </w:rPr>
+      </w:pPr>
+      <w:r>
+        <w:rPr>
+          <w:rFonts w:cs="Calibri"/>
+          <w:b/>
+          <w:bCs/>
+          <w:sz w:val="24"/>
+          <w:szCs w:val="24"/>
+          <w:rtl/>
+        </w:rPr>
+        <w:t>מתח הפעלה מומלץ</w:t>
+      </w:r>
+      <w:r>
+        <w:rPr>
+          <w:rFonts w:cs="Calibri"/>
+          <w:b/>
+          <w:bCs/>
+          <w:sz w:val="24"/>
+          <w:szCs w:val="24"/>
+        </w:rPr>
+        <w:t>:</w:t>
+      </w:r>
+      <w:r>
+        <w:rPr>
+          <w:rFonts w:cs="Calibri"/>
+          <w:sz w:val="24"/>
+          <w:szCs w:val="24"/>
+        </w:rPr>
+        <w:t xml:space="preserve"> </w:t>
+      </w:r>
+      <w:r>
+        <w:rPr>
+          <w:rFonts w:cs="Calibri" w:hint="cs"/>
+          <w:sz w:val="24"/>
+          <w:szCs w:val="24"/>
+          <w:rtl/>
+        </w:rPr>
+        <w:t xml:space="preserve"> </w:t>
+      </w:r>
+      <w:r>
+        <w:rPr>
+          <w:rFonts w:cs="Calibri"/>
+          <w:sz w:val="24"/>
+          <w:szCs w:val="24"/>
+        </w:rPr>
+        <w:t>5v</w:t>
+      </w:r>
+    </w:p>
+    <w:p>
+      <w:pPr>
+        <w:numPr>
+          <w:ilvl w:val="0"/>
+          <w:numId w:val="34"/>
+        </w:numPr>
+        <w:rPr>
+          <w:rFonts w:cs="Calibri"/>
+          <w:sz w:val="24"/>
+          <w:szCs w:val="24"/>
+        </w:rPr>
+      </w:pPr>
+      <w:r>
+        <w:rPr>
+          <w:rFonts w:cs="Calibri"/>
+          <w:b/>
+          <w:bCs/>
+          <w:sz w:val="24"/>
+          <w:szCs w:val="24"/>
+          <w:rtl/>
+        </w:rPr>
+        <w:t>זרם מקסימלי</w:t>
+      </w:r>
+      <w:r>
+        <w:rPr>
+          <w:rFonts w:cs="Calibri"/>
+          <w:b/>
+          <w:bCs/>
+          <w:sz w:val="24"/>
+          <w:szCs w:val="24"/>
+        </w:rPr>
+        <w:t>:</w:t>
+      </w:r>
+      <w:r>
+        <w:rPr>
+          <w:rFonts w:cs="Calibri"/>
+          <w:sz w:val="24"/>
+          <w:szCs w:val="24"/>
+        </w:rPr>
+        <w:t xml:space="preserve"> </w:t>
+      </w:r>
+      <w:r>
+        <w:rPr>
+          <w:rFonts w:cs="Calibri" w:hint="cs"/>
+          <w:sz w:val="24"/>
+          <w:szCs w:val="24"/>
+          <w:rtl/>
+        </w:rPr>
+        <w:t xml:space="preserve"> </w:t>
+      </w:r>
+      <w:r>
+        <w:rPr>
+          <w:rFonts w:cs="Calibri"/>
+          <w:sz w:val="24"/>
+          <w:szCs w:val="24"/>
+        </w:rPr>
+        <w:t>60mA</w:t>
+      </w:r>
+    </w:p>
+    <w:p>
+      <w:pPr>
+        <w:numPr>
+          <w:ilvl w:val="0"/>
+          <w:numId w:val="34"/>
+        </w:numPr>
+        <w:rPr>
+          <w:rFonts w:cs="Calibri"/>
+          <w:sz w:val="24"/>
+          <w:szCs w:val="24"/>
+        </w:rPr>
+      </w:pPr>
+      <w:r>
+        <w:rPr>
+          <w:rFonts w:cs="Calibri"/>
+          <w:b/>
+          <w:bCs/>
+          <w:sz w:val="24"/>
+          <w:szCs w:val="24"/>
+          <w:rtl/>
+        </w:rPr>
+        <w:t>מתח עבודה אופייני לפי צבע</w:t>
+      </w:r>
+      <w:r>
+        <w:rPr>
+          <w:rFonts w:cs="Calibri"/>
+          <w:b/>
+          <w:bCs/>
+          <w:sz w:val="24"/>
+          <w:szCs w:val="24"/>
+        </w:rPr>
+        <w:t>:</w:t>
+      </w:r>
+      <w:r>
+        <w:rPr>
+          <w:rFonts w:cs="Calibri"/>
+          <w:sz w:val="24"/>
+          <w:szCs w:val="24"/>
+        </w:rPr>
+        <w:t xml:space="preserve"> </w:t>
+      </w:r>
+    </w:p>
+    <w:p>
+      <w:pPr>
+        <w:numPr>
+          <w:ilvl w:val="1"/>
+          <w:numId w:val="34"/>
+        </w:numPr>
+        <w:rPr>
+          <w:rFonts w:cs="Calibri"/>
+          <w:sz w:val="24"/>
+          <w:szCs w:val="24"/>
+        </w:rPr>
+      </w:pPr>
+      <w:r>
+        <w:rPr>
+          <w:rFonts w:cs="Calibri"/>
+          <w:sz w:val="24"/>
+          <w:szCs w:val="24"/>
+          <w:rtl/>
+        </w:rPr>
+        <w:t xml:space="preserve">אדום – </w:t>
+      </w:r>
+      <w:r>
+        <w:rPr>
+          <w:rFonts w:cs="Calibri"/>
+          <w:sz w:val="24"/>
+          <w:szCs w:val="24"/>
+        </w:rPr>
+        <w:t>2.4v</w:t>
+      </w:r>
+    </w:p>
+    <w:p>
+      <w:pPr>
+        <w:numPr>
+          <w:ilvl w:val="1"/>
+          <w:numId w:val="34"/>
+        </w:numPr>
+        <w:rPr>
+          <w:rFonts w:cs="Calibri"/>
+          <w:sz w:val="24"/>
+          <w:szCs w:val="24"/>
+        </w:rPr>
+      </w:pPr>
+      <w:r>
+        <w:rPr>
+          <w:rFonts w:cs="Calibri"/>
+          <w:sz w:val="24"/>
+          <w:szCs w:val="24"/>
+          <w:rtl/>
+        </w:rPr>
+        <w:t>ירוק –</w:t>
+      </w:r>
+      <w:r>
+        <w:rPr>
+          <w:rFonts w:cs="Calibri" w:hint="cs"/>
+          <w:sz w:val="24"/>
+          <w:szCs w:val="24"/>
+          <w:rtl/>
+        </w:rPr>
+        <w:t xml:space="preserve"> </w:t>
+      </w:r>
+      <w:r>
+        <w:rPr>
+          <w:rFonts w:cs="Calibri"/>
+          <w:sz w:val="24"/>
+          <w:szCs w:val="24"/>
+        </w:rPr>
+        <w:t>2.8v</w:t>
+      </w:r>
+    </w:p>
+    <w:p>
+      <w:pPr>
+        <w:numPr>
+          <w:ilvl w:val="1"/>
+          <w:numId w:val="34"/>
+        </w:numPr>
+        <w:rPr>
+          <w:rFonts w:cs="Calibri"/>
+          <w:sz w:val="24"/>
+          <w:szCs w:val="24"/>
+        </w:rPr>
+      </w:pPr>
+      <w:r>
+        <w:rPr>
+          <w:rFonts w:cs="Calibri"/>
+          <w:sz w:val="24"/>
+          <w:szCs w:val="24"/>
+          <w:rtl/>
+        </w:rPr>
+        <w:t>כחול –</w:t>
+      </w:r>
+      <w:r>
+        <w:rPr>
+          <w:rFonts w:cs="Calibri" w:hint="cs"/>
+          <w:sz w:val="24"/>
+          <w:szCs w:val="24"/>
+          <w:rtl/>
+        </w:rPr>
+        <w:t xml:space="preserve"> </w:t>
+      </w:r>
+      <w:r>
+        <w:rPr>
+          <w:rFonts w:cs="Calibri"/>
+          <w:sz w:val="24"/>
+          <w:szCs w:val="24"/>
+        </w:rPr>
+        <w:t>3.2v</w:t>
+      </w:r>
+    </w:p>
+    <w:p>
+      <w:pPr>
+        <w:rPr>
+          <w:rFonts w:cs="Calibri"/>
+          <w:sz w:val="24"/>
+          <w:szCs w:val="24"/>
+        </w:rPr>
+      </w:pPr>
+      <w:r>
+        <w:rPr>
+          <w:rFonts w:cs="Calibri"/>
+          <w:b/>
+          <w:bCs/>
+          <w:sz w:val="24"/>
+          <w:szCs w:val="24"/>
+          <w:rtl/>
+        </w:rPr>
+        <w:t>שליטה בצבעים ובבהירות</w:t>
+      </w:r>
+      <w:r>
+        <w:rPr>
+          <w:rFonts w:cs="Calibri"/>
+          <w:b/>
+          <w:bCs/>
+          <w:sz w:val="24"/>
+          <w:szCs w:val="24"/>
+        </w:rPr>
+        <w:t>:</w:t>
+      </w:r>
+      <w:r>
+        <w:rPr>
+          <w:rFonts w:cs="Calibri"/>
+          <w:sz w:val="24"/>
+          <w:szCs w:val="24"/>
+        </w:rPr>
+        <w:br/>
+      </w:r>
+      <w:r>
+        <w:rPr>
+          <w:rFonts w:cs="Calibri"/>
+          <w:sz w:val="24"/>
+          <w:szCs w:val="24"/>
+          <w:rtl/>
+        </w:rPr>
+        <w:t xml:space="preserve">הנורה תומכת בשליטה על עוצמת ההארה של כל צבע בנפרד, באמצעות פקודות </w:t>
+      </w:r>
+      <w:r>
+        <w:rPr>
+          <w:rFonts w:cs="Calibri"/>
+          <w:sz w:val="24"/>
+          <w:szCs w:val="24"/>
+        </w:rPr>
+        <w:t>PWM</w:t>
+      </w:r>
+      <w:r>
+        <w:rPr>
+          <w:rFonts w:cs="Calibri" w:hint="cs"/>
+          <w:sz w:val="24"/>
+          <w:szCs w:val="24"/>
+          <w:rtl/>
+        </w:rPr>
+        <w:t xml:space="preserve"> </w:t>
+      </w:r>
+      <w:r>
+        <w:rPr>
+          <w:rFonts w:cs="Calibri"/>
+          <w:sz w:val="24"/>
+          <w:szCs w:val="24"/>
+          <w:rtl/>
+        </w:rPr>
+        <w:t>שמאפשרות שינוי עוצמה ב-256 רמות שונות לכל צבע. באמצעות ויסות העוצמה של שלושת הצבעים ניתן ליצור מגוון רחב של צבעים, כולל צבעים משניים המתקבלים משילוב של שני צבעים עיקריים באותה עוצמה</w:t>
+      </w:r>
+      <w:r>
+        <w:rPr>
+          <w:rFonts w:cs="Calibri"/>
+          <w:sz w:val="24"/>
+          <w:szCs w:val="24"/>
+        </w:rPr>
+        <w:t>:</w:t>
+      </w:r>
+      <w:r>
+        <w:rPr>
+          <w:rFonts w:cs="Calibri"/>
+          <w:sz w:val="24"/>
+          <w:szCs w:val="24"/>
+        </w:rPr>
+        <w:br/>
+      </w:r>
+      <w:r>
+        <w:rPr>
+          <w:rFonts w:cs="Calibri"/>
+          <w:sz w:val="24"/>
+          <w:szCs w:val="24"/>
+          <w:rtl/>
+        </w:rPr>
+        <w:t xml:space="preserve">כאשר כל שלושת הצבעים דולקים במלוא העוצמה, התוצאה היא אור </w:t>
+      </w:r>
+      <w:r>
+        <w:rPr>
+          <w:rFonts w:cs="Calibri" w:hint="cs"/>
+          <w:sz w:val="24"/>
+          <w:szCs w:val="24"/>
+          <w:rtl/>
+        </w:rPr>
+        <w:t xml:space="preserve">לבן. </w:t>
+      </w:r>
+      <w:r>
+        <w:rPr>
+          <w:rFonts w:cs="Calibri"/>
+          <w:sz w:val="24"/>
+          <w:szCs w:val="24"/>
+          <w:rtl/>
+        </w:rPr>
+        <w:t>עם זאת, השגת לבן מדויק דורשת כיול עדין של עוצמות ההארה</w:t>
+      </w:r>
+      <w:r>
+        <w:rPr>
+          <w:rFonts w:cs="Calibri"/>
+          <w:sz w:val="24"/>
+          <w:szCs w:val="24"/>
+        </w:rPr>
+        <w:t>.</w:t>
+      </w:r>
+    </w:p>
+    <w:p>
+      <w:pPr>
+        <w:rPr>
+          <w:rFonts w:cs="Calibri"/>
+          <w:sz w:val="24"/>
+          <w:szCs w:val="24"/>
+        </w:rPr>
+      </w:pPr>
+      <w:r>
+        <w:rPr>
+          <w:rFonts w:cs="Calibri"/>
+          <w:b/>
+          <w:bCs/>
+          <w:sz w:val="24"/>
+          <w:szCs w:val="24"/>
+          <w:rtl/>
+        </w:rPr>
+        <w:t>חיבורים ב</w:t>
+      </w:r>
+      <w:r>
+        <w:rPr>
+          <w:rFonts w:cs="Calibri" w:hint="cs"/>
+          <w:b/>
+          <w:bCs/>
+          <w:sz w:val="24"/>
+          <w:szCs w:val="24"/>
+          <w:rtl/>
+        </w:rPr>
+        <w:t>לוח הפרויקט</w:t>
+      </w:r>
+      <w:r>
+        <w:rPr>
+          <w:rFonts w:cs="Calibri"/>
+          <w:sz w:val="24"/>
+          <w:szCs w:val="24"/>
+        </w:rPr>
+        <w:br/>
+      </w:r>
+      <w:r>
+        <w:rPr>
+          <w:rFonts w:cs="Calibri"/>
+          <w:sz w:val="24"/>
+          <w:szCs w:val="24"/>
+          <w:rtl/>
+        </w:rPr>
+        <w:t>נורת ה</w:t>
+      </w:r>
+      <w:r>
+        <w:rPr>
+          <w:rFonts w:cs="Calibri"/>
+          <w:sz w:val="24"/>
+          <w:szCs w:val="24"/>
+        </w:rPr>
+        <w:t xml:space="preserve">-RGB LED </w:t>
+      </w:r>
+      <w:r>
+        <w:rPr>
+          <w:rFonts w:cs="Calibri"/>
+          <w:sz w:val="24"/>
+          <w:szCs w:val="24"/>
+          <w:rtl/>
+        </w:rPr>
+        <w:t>מחוברת לפינים הבאים</w:t>
+      </w:r>
+      <w:r>
+        <w:rPr>
+          <w:rFonts w:cs="Calibri"/>
+          <w:sz w:val="24"/>
+          <w:szCs w:val="24"/>
+        </w:rPr>
+        <w:t>:</w:t>
+      </w:r>
+    </w:p>
+    <w:p>
+      <w:pPr>
+        <w:numPr>
+          <w:ilvl w:val="0"/>
+          <w:numId w:val="36"/>
+        </w:numPr>
+        <w:rPr>
+          <w:rFonts w:cs="Calibri"/>
+          <w:sz w:val="24"/>
+          <w:szCs w:val="24"/>
+        </w:rPr>
+      </w:pPr>
+      <w:r>
+        <w:rPr>
+          <w:rFonts w:cs="Calibri"/>
+          <w:b/>
+          <w:bCs/>
+          <w:sz w:val="24"/>
+          <w:szCs w:val="24"/>
+          <w:rtl/>
+        </w:rPr>
+        <w:t>אדום</w:t>
+      </w:r>
+      <w:r>
+        <w:rPr>
+          <w:rFonts w:cs="Calibri"/>
+          <w:b/>
+          <w:bCs/>
+          <w:sz w:val="24"/>
+          <w:szCs w:val="24"/>
+        </w:rPr>
+        <w:t xml:space="preserve"> (</w:t>
+      </w:r>
+      <w:proofErr w:type="spellStart"/>
+      <w:r>
+        <w:rPr>
+          <w:rFonts w:cs="Calibri"/>
+          <w:b/>
+          <w:bCs/>
+          <w:sz w:val="24"/>
+          <w:szCs w:val="24"/>
+        </w:rPr>
+        <w:t>R_Led</w:t>
+      </w:r>
+      <w:proofErr w:type="spellEnd"/>
+      <w:r>
+        <w:rPr>
+          <w:rFonts w:cs="Calibri"/>
+          <w:b/>
+          <w:bCs/>
+          <w:sz w:val="24"/>
+          <w:szCs w:val="24"/>
+        </w:rPr>
+        <w:t>):</w:t>
+      </w:r>
+      <w:r>
+        <w:rPr>
+          <w:rFonts w:cs="Calibri"/>
+          <w:sz w:val="24"/>
+          <w:szCs w:val="24"/>
+        </w:rPr>
+        <w:t xml:space="preserve"> </w:t>
+      </w:r>
+      <w:r>
+        <w:rPr>
+          <w:rFonts w:cs="Calibri"/>
+          <w:sz w:val="24"/>
+          <w:szCs w:val="24"/>
+          <w:rtl/>
+        </w:rPr>
+        <w:t>פין 26</w:t>
+      </w:r>
+    </w:p>
+    <w:p>
+      <w:pPr>
+        <w:numPr>
+          <w:ilvl w:val="0"/>
+          <w:numId w:val="36"/>
+        </w:numPr>
+        <w:rPr>
+          <w:rFonts w:cs="Calibri"/>
+          <w:sz w:val="24"/>
+          <w:szCs w:val="24"/>
+        </w:rPr>
+      </w:pPr>
+      <w:r>
+        <w:rPr>
+          <w:rFonts w:cs="Calibri"/>
+          <w:b/>
+          <w:bCs/>
+          <w:sz w:val="24"/>
+          <w:szCs w:val="24"/>
+          <w:rtl/>
+        </w:rPr>
+        <w:t>ירוק</w:t>
+      </w:r>
+      <w:r>
+        <w:rPr>
+          <w:rFonts w:cs="Calibri"/>
+          <w:b/>
+          <w:bCs/>
+          <w:sz w:val="24"/>
+          <w:szCs w:val="24"/>
+        </w:rPr>
+        <w:t xml:space="preserve"> (</w:t>
+      </w:r>
+      <w:proofErr w:type="spellStart"/>
+      <w:r>
+        <w:rPr>
+          <w:rFonts w:cs="Calibri"/>
+          <w:b/>
+          <w:bCs/>
+          <w:sz w:val="24"/>
+          <w:szCs w:val="24"/>
+        </w:rPr>
+        <w:t>G_Led</w:t>
+      </w:r>
+      <w:proofErr w:type="spellEnd"/>
+      <w:r>
+        <w:rPr>
+          <w:rFonts w:cs="Calibri"/>
+          <w:b/>
+          <w:bCs/>
+          <w:sz w:val="24"/>
+          <w:szCs w:val="24"/>
+        </w:rPr>
+        <w:t>):</w:t>
+      </w:r>
+      <w:r>
+        <w:rPr>
+          <w:rFonts w:cs="Calibri"/>
+          <w:sz w:val="24"/>
+          <w:szCs w:val="24"/>
+        </w:rPr>
+        <w:t xml:space="preserve"> </w:t>
+      </w:r>
+      <w:r>
+        <w:rPr>
+          <w:rFonts w:cs="Calibri"/>
+          <w:sz w:val="24"/>
+          <w:szCs w:val="24"/>
+          <w:rtl/>
+        </w:rPr>
+        <w:t>פין 27</w:t>
+      </w:r>
+    </w:p>
+    <w:p>
+      <w:pPr>
+        <w:numPr>
+          <w:ilvl w:val="0"/>
+          <w:numId w:val="36"/>
+        </w:numPr>
+        <w:rPr>
+          <w:rFonts w:cs="Calibri"/>
+          <w:sz w:val="24"/>
+          <w:szCs w:val="24"/>
+        </w:rPr>
+      </w:pPr>
+      <w:r>
+        <w:rPr>
+          <w:rFonts w:cs="Calibri"/>
+          <w:b/>
+          <w:bCs/>
+          <w:sz w:val="24"/>
+          <w:szCs w:val="24"/>
+          <w:rtl/>
+        </w:rPr>
+        <w:t>כחול</w:t>
+      </w:r>
+      <w:r>
+        <w:rPr>
+          <w:rFonts w:cs="Calibri"/>
+          <w:b/>
+          <w:bCs/>
+          <w:sz w:val="24"/>
+          <w:szCs w:val="24"/>
+        </w:rPr>
+        <w:t xml:space="preserve"> (</w:t>
+      </w:r>
+      <w:proofErr w:type="spellStart"/>
+      <w:r>
+        <w:rPr>
+          <w:rFonts w:cs="Calibri"/>
+          <w:b/>
+          <w:bCs/>
+          <w:sz w:val="24"/>
+          <w:szCs w:val="24"/>
+        </w:rPr>
+        <w:t>B_Led</w:t>
+      </w:r>
+      <w:proofErr w:type="spellEnd"/>
+      <w:r>
+        <w:rPr>
+          <w:rFonts w:cs="Calibri"/>
+          <w:b/>
+          <w:bCs/>
+          <w:sz w:val="24"/>
+          <w:szCs w:val="24"/>
+        </w:rPr>
+        <w:t>):</w:t>
+      </w:r>
+      <w:r>
+        <w:rPr>
+          <w:rFonts w:cs="Calibri"/>
+          <w:sz w:val="24"/>
+          <w:szCs w:val="24"/>
+        </w:rPr>
+        <w:t xml:space="preserve"> </w:t>
+      </w:r>
+      <w:r>
+        <w:rPr>
+          <w:rFonts w:cs="Calibri"/>
+          <w:sz w:val="24"/>
+          <w:szCs w:val="24"/>
+          <w:rtl/>
+        </w:rPr>
+        <w:t>פין 2</w:t>
+      </w:r>
+    </w:p>
+    <w:p>
+      <w:pPr>
+        <w:rPr>
+          <w:rFonts w:cs="Calibri"/>
+          <w:sz w:val="24"/>
+          <w:szCs w:val="24"/>
+          <w:rtl/>
+        </w:rPr>
+      </w:pPr>
+      <w:r>
+        <w:rPr>
+          <w:rFonts w:cs="Calibri"/>
+          <w:b/>
+          <w:bCs/>
+          <w:sz w:val="24"/>
+          <w:szCs w:val="24"/>
+          <w:rtl/>
+        </w:rPr>
+        <w:t>שימושים נפוצים</w:t>
+      </w:r>
+      <w:r>
+        <w:rPr>
+          <w:rFonts w:cs="Calibri"/>
+          <w:b/>
+          <w:bCs/>
+          <w:sz w:val="24"/>
+          <w:szCs w:val="24"/>
+        </w:rPr>
+        <w:t>:</w:t>
+      </w:r>
+      <w:r>
+        <w:rPr>
+          <w:rFonts w:cs="Calibri"/>
+          <w:sz w:val="24"/>
+          <w:szCs w:val="24"/>
+        </w:rPr>
+        <w:br/>
+      </w:r>
+      <w:r>
+        <w:rPr>
+          <w:rFonts w:cs="Calibri"/>
+          <w:sz w:val="24"/>
+          <w:szCs w:val="24"/>
+          <w:rtl/>
+        </w:rPr>
+        <w:t>הנורה נפוצה במערכות תאורה חכמות, התקני</w:t>
+      </w:r>
+      <w:r>
+        <w:rPr>
+          <w:rFonts w:cs="Calibri"/>
+          <w:sz w:val="24"/>
+          <w:szCs w:val="24"/>
+        </w:rPr>
+        <w:t xml:space="preserve"> IoT, </w:t>
+      </w:r>
+      <w:r>
+        <w:rPr>
+          <w:rFonts w:cs="Calibri"/>
+          <w:sz w:val="24"/>
+          <w:szCs w:val="24"/>
+          <w:rtl/>
+        </w:rPr>
+        <w:t>תאורת אווירה, תצוגות דינמיות ופרויקטים אלקטרוניים יצירתיים. השימוש בשליטת</w:t>
+      </w:r>
+      <w:r>
+        <w:rPr>
+          <w:rFonts w:cs="Calibri"/>
+          <w:sz w:val="24"/>
+          <w:szCs w:val="24"/>
+        </w:rPr>
+        <w:t xml:space="preserve"> PWM </w:t>
+      </w:r>
+      <w:r>
+        <w:rPr>
+          <w:rFonts w:cs="Calibri"/>
+          <w:sz w:val="24"/>
+          <w:szCs w:val="24"/>
+          <w:rtl/>
+        </w:rPr>
+        <w:t>מאפשר ליצור אפקטים מיוחדים כמו עמעום, מעבר צבעים חלק והדלקה מדורגת</w:t>
+      </w:r>
+      <w:r>
+        <w:rPr>
+          <w:rFonts w:cs="Calibri"/>
+          <w:sz w:val="24"/>
+          <w:szCs w:val="24"/>
+        </w:rPr>
+        <w:t>.</w:t>
+      </w:r>
       <w:r>
         <w:rPr>
           <w:rtl/>
         </w:rPr>
         <w:br w:type="page"/>
       </w:r>
+    </w:p>
+    <w:p>
+      <w:pPr>
+        <w:pStyle w:val="1"/>
+        <w:rPr>
+          <w:rtl/>
+          <w:lang/>
+        </w:rPr>
+      </w:pPr>
       <w:r>
         <w:rPr>
           <w:rFonts w:hint="cs"/>
           <w:rtl/>
         </w:rPr>
         <w:lastRenderedPageBreak/>
-        <w:t xml:space="preserve">סביבת עבודה </w:t>
-      </w:r>
-      <w:r>
-        <w:rPr>
-          <w:rtl/>
-        </w:rPr>
-        <w:t>–</w:t>
-      </w:r>
-      <w:r>
-        <w:rPr>
-          <w:lang w:val="en-IL"/>
+        <w:t>סביבת עבודה</w:t>
+      </w:r>
+      <w:r>
+        <w:rPr>
+          <w:rFonts w:hint="cs"/>
+          <w:rtl/>
+        </w:rPr>
+        <w:t xml:space="preserve"> -</w:t>
+      </w:r>
+      <w:r>
+        <w:rPr>
+          <w:rFonts w:hint="cs"/>
+          <w:rtl/>
+        </w:rPr>
+        <w:t xml:space="preserve"> </w:t>
+      </w:r>
+      <w:r>
+        <w:rPr>
+          <w:lang/>
         </w:rPr>
         <w:t>Arduino IDE</w:t>
       </w:r>
@@ -14985,215 +16162,215 @@
       <w:pPr>
         <w:rPr>
           <w:rtl/>
-          <w:lang w:val="en-IL"/>
-        </w:rPr>
-      </w:pPr>
-    </w:p>
-    <w:p>
-      <w:pPr>
-        <w:rPr>
-          <w:rtl/>
-          <w:lang w:val="en-IL"/>
-        </w:rPr>
-      </w:pPr>
-    </w:p>
-    <w:p>
-      <w:pPr>
-        <w:rPr>
-          <w:rtl/>
-          <w:lang w:val="en-IL"/>
-        </w:rPr>
-      </w:pPr>
-    </w:p>
-    <w:p>
-      <w:pPr>
-        <w:rPr>
-          <w:rtl/>
-          <w:lang w:val="en-IL"/>
-        </w:rPr>
-      </w:pPr>
-    </w:p>
-    <w:p>
-      <w:pPr>
-        <w:rPr>
-          <w:rtl/>
-          <w:lang w:val="en-IL"/>
-        </w:rPr>
-      </w:pPr>
-    </w:p>
-    <w:p>
-      <w:pPr>
-        <w:rPr>
-          <w:rtl/>
-          <w:lang w:val="en-IL"/>
-        </w:rPr>
-      </w:pPr>
-    </w:p>
-    <w:p>
-      <w:pPr>
-        <w:rPr>
-          <w:rtl/>
-          <w:lang w:val="en-IL"/>
-        </w:rPr>
-      </w:pPr>
-    </w:p>
-    <w:p>
-      <w:pPr>
-        <w:rPr>
-          <w:rtl/>
-          <w:lang w:val="en-IL"/>
-        </w:rPr>
-      </w:pPr>
-    </w:p>
-    <w:p>
-      <w:pPr>
-        <w:rPr>
-          <w:rtl/>
-          <w:lang w:val="en-IL"/>
-        </w:rPr>
-      </w:pPr>
-    </w:p>
-    <w:p>
-      <w:pPr>
-        <w:rPr>
-          <w:rtl/>
-          <w:lang w:val="en-IL"/>
-        </w:rPr>
-      </w:pPr>
-    </w:p>
-    <w:p>
-      <w:pPr>
-        <w:rPr>
-          <w:rtl/>
-          <w:lang w:val="en-IL"/>
-        </w:rPr>
-      </w:pPr>
-    </w:p>
-    <w:p>
-      <w:pPr>
-        <w:rPr>
-          <w:rtl/>
-          <w:lang w:val="en-IL"/>
-        </w:rPr>
-      </w:pPr>
-    </w:p>
-    <w:p>
-      <w:pPr>
-        <w:rPr>
-          <w:rtl/>
-          <w:lang w:val="en-IL"/>
-        </w:rPr>
-      </w:pPr>
-    </w:p>
-    <w:p>
-      <w:pPr>
-        <w:rPr>
-          <w:rtl/>
-          <w:lang w:val="en-IL"/>
-        </w:rPr>
-      </w:pPr>
-    </w:p>
-    <w:p>
-      <w:pPr>
-        <w:rPr>
-          <w:rtl/>
-          <w:lang w:val="en-IL"/>
-        </w:rPr>
-      </w:pPr>
-    </w:p>
-    <w:p>
-      <w:pPr>
-        <w:rPr>
-          <w:rtl/>
-          <w:lang w:val="en-IL"/>
-        </w:rPr>
-      </w:pPr>
-    </w:p>
-    <w:p>
-      <w:pPr>
-        <w:rPr>
-          <w:rtl/>
-          <w:lang w:val="en-IL"/>
-        </w:rPr>
-      </w:pPr>
-    </w:p>
-    <w:p>
-      <w:pPr>
-        <w:rPr>
-          <w:rtl/>
-          <w:lang w:val="en-IL"/>
-        </w:rPr>
-      </w:pPr>
-    </w:p>
-    <w:p>
-      <w:pPr>
-        <w:rPr>
-          <w:rtl/>
-          <w:lang w:val="en-IL"/>
-        </w:rPr>
-      </w:pPr>
-    </w:p>
-    <w:p>
-      <w:pPr>
-        <w:rPr>
-          <w:rtl/>
-          <w:lang w:val="en-IL"/>
-        </w:rPr>
-      </w:pPr>
-    </w:p>
-    <w:p>
-      <w:pPr>
-        <w:rPr>
-          <w:rtl/>
-          <w:lang w:val="en-IL"/>
-        </w:rPr>
-      </w:pPr>
-    </w:p>
-    <w:p>
-      <w:pPr>
-        <w:rPr>
-          <w:rtl/>
-          <w:lang w:val="en-IL"/>
-        </w:rPr>
-      </w:pPr>
-    </w:p>
-    <w:p>
-      <w:pPr>
-        <w:rPr>
-          <w:rtl/>
-          <w:lang w:val="en-IL"/>
-        </w:rPr>
-      </w:pPr>
-    </w:p>
-    <w:p>
-      <w:pPr>
-        <w:rPr>
-          <w:rtl/>
-          <w:lang w:val="en-IL"/>
-        </w:rPr>
-      </w:pPr>
-    </w:p>
-    <w:p>
-      <w:pPr>
-        <w:rPr>
-          <w:rtl/>
-          <w:lang w:val="en-IL"/>
-        </w:rPr>
-      </w:pPr>
-    </w:p>
-    <w:p>
-      <w:pPr>
-        <w:rPr>
-          <w:rtl/>
-          <w:lang w:val="en-IL"/>
-        </w:rPr>
-      </w:pPr>
-    </w:p>
-    <w:p>
-      <w:pPr>
-        <w:rPr>
-          <w:rtl/>
-          <w:lang w:val="en-IL"/>
+          <w:lang/>
+        </w:rPr>
+      </w:pPr>
+    </w:p>
+    <w:p>
+      <w:pPr>
+        <w:rPr>
+          <w:rtl/>
+          <w:lang/>
+        </w:rPr>
+      </w:pPr>
+    </w:p>
+    <w:p>
+      <w:pPr>
+        <w:rPr>
+          <w:rtl/>
+          <w:lang/>
+        </w:rPr>
+      </w:pPr>
+    </w:p>
+    <w:p>
+      <w:pPr>
+        <w:rPr>
+          <w:rtl/>
+          <w:lang/>
+        </w:rPr>
+      </w:pPr>
+    </w:p>
+    <w:p>
+      <w:pPr>
+        <w:rPr>
+          <w:rtl/>
+          <w:lang/>
+        </w:rPr>
+      </w:pPr>
+    </w:p>
+    <w:p>
+      <w:pPr>
+        <w:rPr>
+          <w:rtl/>
+          <w:lang/>
+        </w:rPr>
+      </w:pPr>
+    </w:p>
+    <w:p>
+      <w:pPr>
+        <w:rPr>
+          <w:rtl/>
+          <w:lang/>
+        </w:rPr>
+      </w:pPr>
+    </w:p>
+    <w:p>
+      <w:pPr>
+        <w:rPr>
+          <w:rtl/>
+          <w:lang/>
+        </w:rPr>
+      </w:pPr>
+    </w:p>
+    <w:p>
+      <w:pPr>
+        <w:rPr>
+          <w:rtl/>
+          <w:lang/>
+        </w:rPr>
+      </w:pPr>
+    </w:p>
+    <w:p>
+      <w:pPr>
+        <w:rPr>
+          <w:rtl/>
+          <w:lang/>
+        </w:rPr>
+      </w:pPr>
+    </w:p>
+    <w:p>
+      <w:pPr>
+        <w:rPr>
+          <w:rtl/>
+          <w:lang/>
+        </w:rPr>
+      </w:pPr>
+    </w:p>
+    <w:p>
+      <w:pPr>
+        <w:rPr>
+          <w:rtl/>
+          <w:lang/>
+        </w:rPr>
+      </w:pPr>
+    </w:p>
+    <w:p>
+      <w:pPr>
+        <w:rPr>
+          <w:rtl/>
+          <w:lang/>
+        </w:rPr>
+      </w:pPr>
+    </w:p>
+    <w:p>
+      <w:pPr>
+        <w:rPr>
+          <w:rtl/>
+          <w:lang/>
+        </w:rPr>
+      </w:pPr>
+    </w:p>
+    <w:p>
+      <w:pPr>
+        <w:rPr>
+          <w:rtl/>
+          <w:lang/>
+        </w:rPr>
+      </w:pPr>
+    </w:p>
+    <w:p>
+      <w:pPr>
+        <w:rPr>
+          <w:rtl/>
+          <w:lang/>
+        </w:rPr>
+      </w:pPr>
+    </w:p>
+    <w:p>
+      <w:pPr>
+        <w:rPr>
+          <w:rtl/>
+          <w:lang/>
+        </w:rPr>
+      </w:pPr>
+    </w:p>
+    <w:p>
+      <w:pPr>
+        <w:rPr>
+          <w:rtl/>
+          <w:lang/>
+        </w:rPr>
+      </w:pPr>
+    </w:p>
+    <w:p>
+      <w:pPr>
+        <w:rPr>
+          <w:rtl/>
+          <w:lang/>
+        </w:rPr>
+      </w:pPr>
+    </w:p>
+    <w:p>
+      <w:pPr>
+        <w:rPr>
+          <w:rtl/>
+          <w:lang/>
+        </w:rPr>
+      </w:pPr>
+    </w:p>
+    <w:p>
+      <w:pPr>
+        <w:rPr>
+          <w:rtl/>
+          <w:lang/>
+        </w:rPr>
+      </w:pPr>
+    </w:p>
+    <w:p>
+      <w:pPr>
+        <w:rPr>
+          <w:rtl/>
+          <w:lang/>
+        </w:rPr>
+      </w:pPr>
+    </w:p>
+    <w:p>
+      <w:pPr>
+        <w:rPr>
+          <w:rtl/>
+          <w:lang/>
+        </w:rPr>
+      </w:pPr>
+    </w:p>
+    <w:p>
+      <w:pPr>
+        <w:rPr>
+          <w:rtl/>
+          <w:lang/>
+        </w:rPr>
+      </w:pPr>
+    </w:p>
+    <w:p>
+      <w:pPr>
+        <w:rPr>
+          <w:rtl/>
+          <w:lang/>
+        </w:rPr>
+      </w:pPr>
+    </w:p>
+    <w:p>
+      <w:pPr>
+        <w:rPr>
+          <w:rtl/>
+          <w:lang/>
+        </w:rPr>
+      </w:pPr>
+    </w:p>
+    <w:p>
+      <w:pPr>
+        <w:rPr>
+          <w:rtl/>
+          <w:lang/>
         </w:rPr>
       </w:pPr>
     </w:p>
@@ -15204,7 +16381,7 @@
           <w:rtl/>
         </w:rPr>
       </w:pPr>
-      <w:bookmarkStart w:id="17" w:name="_Toc185509461"/>
+      <w:bookmarkStart w:id="18" w:name="_Toc185509461"/>
       <w:r>
         <w:rPr>
           <w:rFonts w:hint="cs"/>
@@ -15226,7 +16403,7 @@
         </w:rPr>
         <w:t xml:space="preserve"> 17.9.24</w:t>
       </w:r>
-      <w:bookmarkEnd w:id="17"/>
+      <w:bookmarkEnd w:id="18"/>
     </w:p>
     <w:p>
       <w:pPr>
@@ -15587,7 +16764,7 @@
       <w:r>
         <w:rPr>
           <w:rFonts w:ascii="Tahoma" w:hAnsi="Tahoma" w:cs="Tahoma"/>
-          <w:lang w:val="en-IL"/>
+          <w:lang/>
         </w:rPr>
         <w:t>Arduino IDE</w:t>
       </w:r>
@@ -15980,6 +17157,7 @@
           <w:rFonts w:ascii="Tahoma" w:hAnsi="Tahoma" w:cs="Tahoma"/>
           <w:rtl/>
         </w:rPr>
+        <w:lastRenderedPageBreak/>
         <w:t xml:space="preserve">במהלך הניסוי למדתי כיצד לתכנת נורת </w:t>
       </w:r>
       <w:r>
@@ -16055,7 +17233,6 @@
           <w:rFonts w:ascii="Tahoma" w:hAnsi="Tahoma" w:cs="Tahoma"/>
           <w:rtl/>
         </w:rPr>
-        <w:lastRenderedPageBreak/>
         <w:t>הניסוי גם חיזק את ההבנה לגבי חשיבות החיבור הנכון של הנורה לרכיבי ה-</w:t>
       </w:r>
       <w:r>
@@ -16212,7 +17389,7 @@
     <w:p>
       <w:pPr>
         <w:rPr>
-          <w:rFonts w:ascii="Tahoma" w:hAnsi="Tahoma" w:cs="Tahoma" w:hint="cs"/>
+          <w:rFonts w:ascii="Tahoma" w:hAnsi="Tahoma" w:cs="Tahoma"/>
           <w:sz w:val="20"/>
           <w:szCs w:val="20"/>
           <w:rtl/>
@@ -16456,7 +17633,6 @@
           <w:szCs w:val="21"/>
         </w:rPr>
       </w:pPr>
-      <w:proofErr w:type="gramStart"/>
       <w:r>
         <w:rPr>
           <w:rFonts w:ascii="Consolas" w:eastAsia="Times New Roman" w:hAnsi="Consolas" w:cs="Times New Roman"/>
@@ -16466,7 +17642,6 @@
         </w:rPr>
         <w:t>#define</w:t>
       </w:r>
-      <w:proofErr w:type="gramEnd"/>
       <w:r>
         <w:rPr>
           <w:rFonts w:ascii="Consolas" w:eastAsia="Times New Roman" w:hAnsi="Consolas" w:cs="Times New Roman"/>
@@ -17392,7 +18567,6 @@
           <w:sz w:val="18"/>
           <w:szCs w:val="18"/>
         </w:rPr>
-        <w:lastRenderedPageBreak/>
         <w:t xml:space="preserve">  </w:t>
       </w:r>
       <w:proofErr w:type="spellStart"/>
@@ -19280,7 +20454,7 @@
     <w:p>
       <w:pPr>
         <w:rPr>
-          <w:rFonts w:ascii="Tahoma" w:hAnsi="Tahoma" w:cs="Tahoma" w:hint="cs"/>
+          <w:rFonts w:ascii="Tahoma" w:hAnsi="Tahoma" w:cs="Tahoma"/>
           <w:sz w:val="2"/>
           <w:szCs w:val="2"/>
           <w:rtl/>
@@ -19328,6 +20502,7 @@
           <w:sz w:val="32"/>
           <w:szCs w:val="32"/>
         </w:rPr>
+        <w:lastRenderedPageBreak/>
         <w:drawing>
           <wp:inline distT="0" distB="0" distL="0" distR="0" wp14:anchorId="30E6D977" wp14:editId="50927319">
             <wp:extent cx="6415115" cy="1263650"/>
@@ -19471,21 +20646,7 @@
           <w:rFonts w:hint="cs"/>
           <w:rtl/>
         </w:rPr>
-        <w:t xml:space="preserve">ניסוי </w:t>
-      </w:r>
-      <w:r>
-        <w:rPr>
-          <w:rFonts w:hint="cs"/>
-          <w:rtl/>
-        </w:rPr>
-        <w:t>שני</w:t>
-      </w:r>
-      <w:r>
-        <w:rPr>
-          <w:rFonts w:hint="cs"/>
-          <w:rtl/>
-        </w:rPr>
-        <w:t xml:space="preserve"> </w:t>
+        <w:t xml:space="preserve">ניסוי שני </w:t>
       </w:r>
       <w:r>
         <w:rPr>
@@ -19826,15 +20987,13 @@
         </w:rPr>
         <w:t xml:space="preserve">תצוגת </w:t>
       </w:r>
-      <w:proofErr w:type="spellStart"/>
-      <w:r>
-        <w:rPr>
-          <w:rFonts w:ascii="Tahoma" w:hAnsi="Tahoma" w:cs="Tahoma"/>
-          <w:lang w:val="en-IL"/>
+      <w:r>
+        <w:rPr>
+          <w:rFonts w:ascii="Tahoma" w:hAnsi="Tahoma" w:cs="Tahoma"/>
+          <w:lang/>
         </w:rPr>
         <w:t>Oled</w:t>
       </w:r>
-      <w:proofErr w:type="spellEnd"/>
     </w:p>
     <w:p>
       <w:pPr>
@@ -19859,7 +21018,7 @@
       <w:r>
         <w:rPr>
           <w:rFonts w:ascii="Tahoma" w:hAnsi="Tahoma" w:cs="Tahoma"/>
-          <w:lang w:val="en-IL"/>
+          <w:lang/>
         </w:rPr>
         <w:t>Arduino IDE</w:t>
       </w:r>
@@ -19952,6 +21111,7 @@
           <w:rFonts w:ascii="Tahoma" w:hAnsi="Tahoma" w:cs="Tahoma"/>
           <w:rtl/>
         </w:rPr>
+        <w:lastRenderedPageBreak/>
         <w:t xml:space="preserve">תחילה </w:t>
       </w:r>
       <w:r>
@@ -19961,12 +21121,21 @@
         </w:rPr>
         <w:t xml:space="preserve">נכתב </w:t>
       </w:r>
-      <w:r>
-        <w:rPr>
-          <w:rFonts w:ascii="Tahoma" w:hAnsi="Tahoma" w:cs="Tahoma"/>
-          <w:rtl/>
-        </w:rPr>
-        <w:t xml:space="preserve">תוכנית בשפת סי לבקר </w:t>
+      <w:proofErr w:type="spellStart"/>
+      <w:r>
+        <w:rPr>
+          <w:rFonts w:ascii="Tahoma" w:hAnsi="Tahoma" w:cs="Tahoma"/>
+          <w:rtl/>
+        </w:rPr>
+        <w:t>תוכנית</w:t>
+      </w:r>
+      <w:proofErr w:type="spellEnd"/>
+      <w:r>
+        <w:rPr>
+          <w:rFonts w:ascii="Tahoma" w:hAnsi="Tahoma" w:cs="Tahoma"/>
+          <w:rtl/>
+        </w:rPr>
+        <w:t xml:space="preserve"> בשפת סי לבקר </w:t>
       </w:r>
       <w:r>
         <w:rPr>
@@ -20449,8 +21618,21 @@
           <w:rFonts w:ascii="Tahoma" w:hAnsi="Tahoma" w:cs="Tahoma" w:hint="cs"/>
           <w:rtl/>
         </w:rPr>
-        <w:lastRenderedPageBreak/>
-        <w:t xml:space="preserve">חשוב מאוד!! לאחר ניסוי </w:t>
+        <w:t>חשוב מאוד!! לאחר ניסוי וטעייה הב</w:t>
+      </w:r>
+      <w:r>
+        <w:rPr>
+          <w:rFonts w:ascii="Tahoma" w:hAnsi="Tahoma" w:cs="Tahoma" w:hint="cs"/>
+          <w:rtl/>
+        </w:rPr>
+        <w:t>נו</w:t>
+      </w:r>
+      <w:r>
+        <w:rPr>
+          <w:rFonts w:ascii="Tahoma" w:hAnsi="Tahoma" w:cs="Tahoma" w:hint="cs"/>
+          <w:rtl/>
+        </w:rPr>
+        <w:t xml:space="preserve"> שעל מנת שהתכונית לעבוד עלינו להוריד את הספריות המתאימות לסביבת </w:t>
       </w:r>
       <w:proofErr w:type="spellStart"/>
       <w:r>
@@ -20458,7 +21640,7 @@
           <w:rFonts w:ascii="Tahoma" w:hAnsi="Tahoma" w:cs="Tahoma" w:hint="cs"/>
           <w:rtl/>
         </w:rPr>
-        <w:t>וטעייה</w:t>
+        <w:t>תוכנית</w:t>
       </w:r>
       <w:proofErr w:type="spellEnd"/>
       <w:r>
@@ -20466,21 +21648,7 @@
           <w:rFonts w:ascii="Tahoma" w:hAnsi="Tahoma" w:cs="Tahoma" w:hint="cs"/>
           <w:rtl/>
         </w:rPr>
-        <w:t xml:space="preserve"> הב</w:t>
-      </w:r>
-      <w:r>
-        <w:rPr>
-          <w:rFonts w:ascii="Tahoma" w:hAnsi="Tahoma" w:cs="Tahoma" w:hint="cs"/>
-          <w:rtl/>
-        </w:rPr>
-        <w:t>נו</w:t>
-      </w:r>
-      <w:r>
-        <w:rPr>
-          <w:rFonts w:ascii="Tahoma" w:hAnsi="Tahoma" w:cs="Tahoma" w:hint="cs"/>
-          <w:rtl/>
-        </w:rPr>
-        <w:t xml:space="preserve"> שעל מנת שהתכונית לעבוד עלינו להוריד את הספריות המתאימות לסביבת תוכנית, בין אם זה </w:t>
+        <w:t xml:space="preserve">, בין אם זה </w:t>
       </w:r>
       <w:proofErr w:type="spellStart"/>
       <w:r>
@@ -20682,6 +21850,7 @@
           <w:szCs w:val="24"/>
           <w:rtl/>
         </w:rPr>
+        <w:lastRenderedPageBreak/>
         <w:drawing>
           <wp:inline distT="0" distB="0" distL="0" distR="0" wp14:anchorId="64398488" wp14:editId="60E1BE41">
             <wp:extent cx="2152950" cy="3212935"/>
@@ -20830,7 +21999,6 @@
           <w:szCs w:val="21"/>
         </w:rPr>
       </w:pPr>
-      <w:proofErr w:type="gramStart"/>
       <w:r>
         <w:rPr>
           <w:rFonts w:ascii="Consolas" w:eastAsia="Times New Roman" w:hAnsi="Consolas" w:cs="Times New Roman"/>
@@ -20840,7 +22008,6 @@
         </w:rPr>
         <w:t>#include</w:t>
       </w:r>
-      <w:proofErr w:type="gramEnd"/>
       <w:r>
         <w:rPr>
           <w:rFonts w:ascii="Consolas" w:eastAsia="Times New Roman" w:hAnsi="Consolas" w:cs="Times New Roman"/>
@@ -20892,7 +22059,6 @@
           <w:szCs w:val="21"/>
         </w:rPr>
       </w:pPr>
-      <w:proofErr w:type="gramStart"/>
       <w:r>
         <w:rPr>
           <w:rFonts w:ascii="Consolas" w:eastAsia="Times New Roman" w:hAnsi="Consolas" w:cs="Times New Roman"/>
@@ -20902,7 +22068,6 @@
         </w:rPr>
         <w:t>#include</w:t>
       </w:r>
-      <w:proofErr w:type="gramEnd"/>
       <w:r>
         <w:rPr>
           <w:rFonts w:ascii="Consolas" w:eastAsia="Times New Roman" w:hAnsi="Consolas" w:cs="Times New Roman"/>
@@ -21451,7 +22616,6 @@
           <w:sz w:val="21"/>
           <w:szCs w:val="21"/>
         </w:rPr>
-        <w:lastRenderedPageBreak/>
         <w:t>{</w:t>
       </w:r>
     </w:p>
@@ -22881,7 +24045,6 @@
         <w:rPr>
           <w:rtl/>
         </w:rPr>
-        <w:lastRenderedPageBreak/>
         <w:t>ניסוי</w:t>
       </w:r>
       <w:r>
@@ -22940,7 +24103,7 @@
         <w:rPr>
           <w:rFonts w:ascii="Tahoma" w:hAnsi="Tahoma" w:cs="Tahoma"/>
           <w:rtl/>
-          <w:lang w:val="en-IL"/>
+          <w:lang/>
         </w:rPr>
       </w:pPr>
       <w:r>
@@ -22953,7 +24116,7 @@
       <w:r>
         <w:rPr>
           <w:rFonts w:ascii="Tahoma" w:hAnsi="Tahoma" w:cs="Tahoma"/>
-          <w:lang w:val="en-IL"/>
+          <w:lang/>
         </w:rPr>
         <w:t>Ultrasonic</w:t>
       </w:r>
@@ -22973,7 +24136,7 @@
       <w:r>
         <w:rPr>
           <w:rFonts w:ascii="Tahoma" w:hAnsi="Tahoma" w:cs="Tahoma"/>
-          <w:lang w:val="en-IL"/>
+          <w:lang/>
         </w:rPr>
         <w:t>led</w:t>
       </w:r>
@@ -22981,7 +24144,7 @@
         <w:rPr>
           <w:rFonts w:ascii="Tahoma" w:hAnsi="Tahoma" w:cs="Tahoma"/>
           <w:rtl/>
-          <w:lang w:val="en-IL"/>
+          <w:lang/>
         </w:rPr>
         <w:t>.</w:t>
       </w:r>
@@ -23014,6 +24177,7 @@
           <w:szCs w:val="28"/>
           <w:rtl/>
         </w:rPr>
+        <w:lastRenderedPageBreak/>
         <w:t>מטרת הניסי</w:t>
       </w:r>
     </w:p>
@@ -23034,7 +24198,7 @@
       <w:r>
         <w:rPr>
           <w:rFonts w:ascii="Tahoma" w:hAnsi="Tahoma" w:cs="Tahoma"/>
-          <w:lang w:val="en-IL"/>
+          <w:lang/>
         </w:rPr>
         <w:t>Ultrasonic</w:t>
       </w:r>
@@ -23141,15 +24305,13 @@
         </w:rPr>
         <w:t xml:space="preserve">תצוגת </w:t>
       </w:r>
-      <w:proofErr w:type="spellStart"/>
-      <w:r>
-        <w:rPr>
-          <w:rFonts w:ascii="Tahoma" w:hAnsi="Tahoma" w:cs="Tahoma"/>
-          <w:lang w:val="en-IL"/>
+      <w:r>
+        <w:rPr>
+          <w:rFonts w:ascii="Tahoma" w:hAnsi="Tahoma" w:cs="Tahoma"/>
+          <w:lang/>
         </w:rPr>
         <w:t>Oled</w:t>
       </w:r>
-      <w:proofErr w:type="spellEnd"/>
     </w:p>
     <w:p>
       <w:pPr>
@@ -23174,7 +24336,7 @@
       <w:r>
         <w:rPr>
           <w:rFonts w:ascii="Tahoma" w:hAnsi="Tahoma" w:cs="Tahoma"/>
-          <w:lang w:val="en-IL"/>
+          <w:lang/>
         </w:rPr>
         <w:t>Ultrasonic</w:t>
       </w:r>
@@ -23202,7 +24364,7 @@
       <w:r>
         <w:rPr>
           <w:rFonts w:ascii="Tahoma" w:hAnsi="Tahoma" w:cs="Tahoma"/>
-          <w:lang w:val="en-IL"/>
+          <w:lang/>
         </w:rPr>
         <w:t>Arduino IDE</w:t>
       </w:r>
@@ -23330,7 +24492,7 @@
       <w:r>
         <w:rPr>
           <w:rFonts w:ascii="Tahoma" w:hAnsi="Tahoma" w:cs="Tahoma"/>
-          <w:lang w:val="en-IL"/>
+          <w:lang/>
         </w:rPr>
         <w:t>led</w:t>
       </w:r>
@@ -23344,7 +24506,7 @@
       <w:r>
         <w:rPr>
           <w:rFonts w:ascii="Tahoma" w:hAnsi="Tahoma" w:cs="Tahoma"/>
-          <w:lang w:val="en-IL"/>
+          <w:lang/>
         </w:rPr>
         <w:t>Ultrasonic</w:t>
       </w:r>
@@ -23355,13 +24517,109 @@
         </w:rPr>
         <w:t>. מחברים את הרכיבים לבקר דרך מטריצה; מסך ה</w:t>
       </w:r>
+      <w:r>
+        <w:rPr>
+          <w:rFonts w:ascii="Tahoma" w:hAnsi="Tahoma" w:cs="Tahoma"/>
+          <w:lang/>
+        </w:rPr>
+        <w:t>Oled</w:t>
+      </w:r>
+      <w:r>
+        <w:rPr>
+          <w:rFonts w:ascii="Tahoma" w:hAnsi="Tahoma" w:cs="Tahoma"/>
+          <w:rtl/>
+        </w:rPr>
+        <w:t xml:space="preserve">: </w:t>
+      </w:r>
+      <w:r>
+        <w:rPr>
+          <w:rFonts w:ascii="Tahoma" w:hAnsi="Tahoma" w:cs="Tahoma"/>
+        </w:rPr>
+        <w:t>SDA</w:t>
+      </w:r>
+      <w:r>
+        <w:rPr>
+          <w:rFonts w:ascii="Tahoma" w:hAnsi="Tahoma" w:cs="Tahoma"/>
+          <w:rtl/>
+        </w:rPr>
+        <w:t xml:space="preserve"> להדק 22, </w:t>
+      </w:r>
+      <w:r>
+        <w:rPr>
+          <w:rFonts w:ascii="Tahoma" w:hAnsi="Tahoma" w:cs="Tahoma"/>
+        </w:rPr>
+        <w:t>SCL</w:t>
+      </w:r>
+      <w:r>
+        <w:rPr>
+          <w:rFonts w:ascii="Tahoma" w:hAnsi="Tahoma" w:cs="Tahoma"/>
+          <w:rtl/>
+        </w:rPr>
+        <w:t xml:space="preserve"> להדק 21, לאדמה ולמתח. </w:t>
+      </w:r>
+      <w:r>
+        <w:rPr>
+          <w:rFonts w:ascii="Tahoma" w:hAnsi="Tahoma" w:cs="Tahoma"/>
+          <w:lang/>
+        </w:rPr>
+        <w:t>Ultrasonic</w:t>
+      </w:r>
+      <w:r>
+        <w:rPr>
+          <w:rFonts w:ascii="Tahoma" w:hAnsi="Tahoma" w:cs="Tahoma"/>
+          <w:rtl/>
+        </w:rPr>
+        <w:t xml:space="preserve">: </w:t>
+      </w:r>
+      <w:r>
+        <w:rPr>
+          <w:rFonts w:ascii="Tahoma" w:hAnsi="Tahoma" w:cs="Tahoma"/>
+        </w:rPr>
+        <w:t>ECHO</w:t>
+      </w:r>
+      <w:r>
+        <w:rPr>
+          <w:rFonts w:ascii="Tahoma" w:hAnsi="Tahoma" w:cs="Tahoma"/>
+          <w:rtl/>
+        </w:rPr>
+        <w:t xml:space="preserve"> להדק 33, </w:t>
+      </w:r>
+      <w:r>
+        <w:rPr>
+          <w:rFonts w:ascii="Tahoma" w:hAnsi="Tahoma" w:cs="Tahoma"/>
+        </w:rPr>
+        <w:t>TRIGER</w:t>
+      </w:r>
+      <w:r>
+        <w:rPr>
+          <w:rFonts w:ascii="Tahoma" w:hAnsi="Tahoma" w:cs="Tahoma"/>
+          <w:rtl/>
+        </w:rPr>
+        <w:t xml:space="preserve"> להדק 32, לאדמה ולמתח. אחרי שעשינו את כל החיבורים, התחלנו כתיבת קוד התוכנית. בסיום, הרצנו את התוכנית ושינינו את המרחקים בסימולציה כדי שנוחל לראות על מסך את התוצאות. </w:t>
+      </w:r>
+    </w:p>
+    <w:p>
+      <w:pPr>
+        <w:rPr>
+          <w:rFonts w:ascii="Tahoma" w:hAnsi="Tahoma" w:cs="Tahoma"/>
+          <w:rtl/>
+          <w:lang/>
+        </w:rPr>
+      </w:pPr>
+      <w:r>
+        <w:rPr>
+          <w:rFonts w:ascii="Tahoma" w:hAnsi="Tahoma" w:cs="Tahoma"/>
+          <w:rtl/>
+        </w:rPr>
+        <w:t xml:space="preserve">אחרי שראינו </w:t>
+      </w:r>
       <w:proofErr w:type="spellStart"/>
       <w:r>
         <w:rPr>
           <w:rFonts w:ascii="Tahoma" w:hAnsi="Tahoma" w:cs="Tahoma"/>
-          <w:lang w:val="en-IL"/>
-        </w:rPr>
-        <w:t>Oled</w:t>
+          <w:rtl/>
+        </w:rPr>
+        <w:t>שהכל</w:t>
       </w:r>
       <w:proofErr w:type="spellEnd"/>
       <w:r>
@@ -23369,110 +24627,12 @@
           <w:rFonts w:ascii="Tahoma" w:hAnsi="Tahoma" w:cs="Tahoma"/>
           <w:rtl/>
         </w:rPr>
-        <w:t xml:space="preserve">: </w:t>
-      </w:r>
-      <w:r>
-        <w:rPr>
-          <w:rFonts w:ascii="Tahoma" w:hAnsi="Tahoma" w:cs="Tahoma"/>
-        </w:rPr>
-        <w:t>SDA</w:t>
-      </w:r>
-      <w:r>
-        <w:rPr>
-          <w:rFonts w:ascii="Tahoma" w:hAnsi="Tahoma" w:cs="Tahoma"/>
-          <w:rtl/>
-        </w:rPr>
-        <w:t xml:space="preserve"> להדק 22, </w:t>
-      </w:r>
-      <w:r>
-        <w:rPr>
-          <w:rFonts w:ascii="Tahoma" w:hAnsi="Tahoma" w:cs="Tahoma"/>
-        </w:rPr>
-        <w:t>SCL</w:t>
-      </w:r>
-      <w:r>
-        <w:rPr>
-          <w:rFonts w:ascii="Tahoma" w:hAnsi="Tahoma" w:cs="Tahoma"/>
-          <w:rtl/>
-        </w:rPr>
-        <w:t xml:space="preserve"> להדק 21, לאדמה ולמתח. </w:t>
-      </w:r>
-      <w:r>
-        <w:rPr>
-          <w:rFonts w:ascii="Tahoma" w:hAnsi="Tahoma" w:cs="Tahoma"/>
-          <w:lang w:val="en-IL"/>
-        </w:rPr>
-        <w:t>Ultrasonic</w:t>
-      </w:r>
-      <w:r>
-        <w:rPr>
-          <w:rFonts w:ascii="Tahoma" w:hAnsi="Tahoma" w:cs="Tahoma"/>
-          <w:rtl/>
-        </w:rPr>
-        <w:t xml:space="preserve">: </w:t>
-      </w:r>
-      <w:r>
-        <w:rPr>
-          <w:rFonts w:ascii="Tahoma" w:hAnsi="Tahoma" w:cs="Tahoma"/>
-        </w:rPr>
-        <w:t>ECHO</w:t>
-      </w:r>
-      <w:r>
-        <w:rPr>
-          <w:rFonts w:ascii="Tahoma" w:hAnsi="Tahoma" w:cs="Tahoma"/>
-          <w:rtl/>
-        </w:rPr>
-        <w:t xml:space="preserve"> להדק 33, </w:t>
-      </w:r>
-      <w:r>
-        <w:rPr>
-          <w:rFonts w:ascii="Tahoma" w:hAnsi="Tahoma" w:cs="Tahoma"/>
-        </w:rPr>
-        <w:t>TRIGER</w:t>
-      </w:r>
-      <w:r>
-        <w:rPr>
-          <w:rFonts w:ascii="Tahoma" w:hAnsi="Tahoma" w:cs="Tahoma"/>
-          <w:rtl/>
-        </w:rPr>
-        <w:t xml:space="preserve"> להדק 32, לאדמה ולמתח. אחרי שעשינו את כל החיבורים, התחלנו כתיבת קוד התוכנית. בסיום, הרצנו את התוכנית ושינינו את המרחקים בסימולציה כדי שנוחל לראות על מסך את התוצאות. </w:t>
-      </w:r>
-    </w:p>
-    <w:p>
-      <w:pPr>
-        <w:rPr>
-          <w:rFonts w:ascii="Tahoma" w:hAnsi="Tahoma" w:cs="Tahoma"/>
-          <w:rtl/>
-          <w:lang w:val="en-IL"/>
-        </w:rPr>
-      </w:pPr>
-      <w:r>
-        <w:rPr>
-          <w:rFonts w:ascii="Tahoma" w:hAnsi="Tahoma" w:cs="Tahoma"/>
-          <w:rtl/>
-        </w:rPr>
-        <w:t xml:space="preserve">אחרי שראינו </w:t>
-      </w:r>
-      <w:proofErr w:type="spellStart"/>
-      <w:r>
-        <w:rPr>
-          <w:rFonts w:ascii="Tahoma" w:hAnsi="Tahoma" w:cs="Tahoma"/>
-          <w:rtl/>
-        </w:rPr>
-        <w:t>שהכל</w:t>
-      </w:r>
-      <w:proofErr w:type="spellEnd"/>
-      <w:r>
-        <w:rPr>
-          <w:rFonts w:ascii="Tahoma" w:hAnsi="Tahoma" w:cs="Tahoma"/>
-          <w:rtl/>
-        </w:rPr>
         <w:t xml:space="preserve"> עבד בסימולציה, עברנו לחלק המעשי. בחלק המעשי חיברנו את התצוגה ואת החיישן לבקר דרך אותו ההדקים כמו בסימולציה. העברנו את הקוד לתוכנה </w:t>
       </w:r>
       <w:r>
         <w:rPr>
           <w:rFonts w:ascii="Tahoma" w:hAnsi="Tahoma" w:cs="Tahoma"/>
-          <w:lang w:val="en-IL"/>
+          <w:lang/>
         </w:rPr>
         <w:t>Arduino IDE</w:t>
       </w:r>
@@ -23480,14 +24640,14 @@
         <w:rPr>
           <w:rFonts w:ascii="Tahoma" w:hAnsi="Tahoma" w:cs="Tahoma"/>
           <w:rtl/>
-          <w:lang w:val="en-IL"/>
+          <w:lang/>
         </w:rPr>
         <w:t xml:space="preserve"> וחיברנו בין הבקר למחשב בעזרת כבל </w:t>
       </w:r>
       <w:r>
         <w:rPr>
           <w:rFonts w:ascii="Tahoma" w:hAnsi="Tahoma" w:cs="Tahoma"/>
-          <w:lang w:val="en-IL"/>
+          <w:lang/>
         </w:rPr>
         <w:t>USB</w:t>
       </w:r>
@@ -23495,7 +24655,7 @@
         <w:rPr>
           <w:rFonts w:ascii="Tahoma" w:hAnsi="Tahoma" w:cs="Tahoma"/>
           <w:rtl/>
-          <w:lang w:val="en-IL"/>
+          <w:lang/>
         </w:rPr>
         <w:t xml:space="preserve"> כדי לצרוב את התוכנית. לאחר צריבה לקחנו דף והתחלנו להזיז אותו במרחקים שונים מהחיישן כדי לראות את תוצאות הניסוי.</w:t>
       </w:r>
@@ -23556,7 +24716,7 @@
       <w:r>
         <w:rPr>
           <w:rFonts w:ascii="Tahoma" w:hAnsi="Tahoma" w:cs="Tahoma"/>
-          <w:lang w:val="en-IL"/>
+          <w:lang/>
         </w:rPr>
         <w:t>led</w:t>
       </w:r>
@@ -23647,7 +24807,6 @@
           <w:szCs w:val="28"/>
           <w:rtl/>
         </w:rPr>
-        <w:lastRenderedPageBreak/>
         <w:t>מס</w:t>
       </w:r>
       <w:r>
@@ -23816,13 +24975,13 @@
         <w:rPr>
           <w:rFonts w:ascii="Tahoma" w:hAnsi="Tahoma" w:cs="Tahoma"/>
           <w:rtl/>
-          <w:lang w:val="en-IL"/>
-        </w:rPr>
-      </w:pPr>
-      <w:r>
-        <w:rPr>
-          <w:rFonts w:ascii="Tahoma" w:hAnsi="Tahoma" w:cs="Tahoma"/>
-          <w:lang w:val="en-IL"/>
+          <w:lang/>
+        </w:rPr>
+      </w:pPr>
+      <w:r>
+        <w:rPr>
+          <w:rFonts w:ascii="Tahoma" w:hAnsi="Tahoma" w:cs="Tahoma"/>
+          <w:lang/>
         </w:rPr>
         <w:t>https://wokwi.com/projects/417704377996250113</w:t>
       </w:r>
@@ -23909,19 +25068,19 @@
           <w:numId w:val="33"/>
         </w:numPr>
         <w:rPr>
+          <w:rFonts w:ascii="Tahoma" w:hAnsi="Tahoma" w:cs="Tahoma"/>
+          <w:sz w:val="28"/>
+          <w:szCs w:val="28"/>
+          <w:rtl/>
+        </w:rPr>
+      </w:pPr>
+      <w:r>
+        <w:rPr>
           <w:rFonts w:ascii="Tahoma" w:hAnsi="Tahoma" w:cs="Tahoma" w:hint="cs"/>
           <w:sz w:val="28"/>
           <w:szCs w:val="28"/>
           <w:rtl/>
         </w:rPr>
-      </w:pPr>
-      <w:r>
-        <w:rPr>
-          <w:rFonts w:ascii="Tahoma" w:hAnsi="Tahoma" w:cs="Tahoma" w:hint="cs"/>
-          <w:sz w:val="28"/>
-          <w:szCs w:val="28"/>
-          <w:rtl/>
-        </w:rPr>
         <w:t>קוד התוכנית</w:t>
       </w:r>
     </w:p>
@@ -24015,7 +25174,6 @@
           <w:szCs w:val="21"/>
         </w:rPr>
       </w:pPr>
-      <w:proofErr w:type="gramStart"/>
       <w:r>
         <w:rPr>
           <w:rFonts w:ascii="Consolas" w:eastAsia="Times New Roman" w:hAnsi="Consolas" w:cs="Times New Roman"/>
@@ -24025,7 +25183,6 @@
         </w:rPr>
         <w:t>#include</w:t>
       </w:r>
-      <w:proofErr w:type="gramEnd"/>
       <w:r>
         <w:rPr>
           <w:rFonts w:ascii="Consolas" w:eastAsia="Times New Roman" w:hAnsi="Consolas" w:cs="Times New Roman"/>
@@ -24095,7 +25252,6 @@
           <w:szCs w:val="21"/>
         </w:rPr>
       </w:pPr>
-      <w:proofErr w:type="gramStart"/>
       <w:r>
         <w:rPr>
           <w:rFonts w:ascii="Consolas" w:eastAsia="Times New Roman" w:hAnsi="Consolas" w:cs="Times New Roman"/>
@@ -24105,7 +25261,6 @@
         </w:rPr>
         <w:t>#include</w:t>
       </w:r>
-      <w:proofErr w:type="gramEnd"/>
       <w:r>
         <w:rPr>
           <w:rFonts w:ascii="Consolas" w:eastAsia="Times New Roman" w:hAnsi="Consolas" w:cs="Times New Roman"/>
@@ -24155,7 +25310,6 @@
           <w:szCs w:val="21"/>
         </w:rPr>
       </w:pPr>
-      <w:proofErr w:type="gramStart"/>
       <w:r>
         <w:rPr>
           <w:rFonts w:ascii="Consolas" w:eastAsia="Times New Roman" w:hAnsi="Consolas" w:cs="Times New Roman"/>
@@ -24165,7 +25319,6 @@
         </w:rPr>
         <w:t>#define</w:t>
       </w:r>
-      <w:proofErr w:type="gramEnd"/>
       <w:r>
         <w:rPr>
           <w:rFonts w:ascii="Consolas" w:eastAsia="Times New Roman" w:hAnsi="Consolas" w:cs="Times New Roman"/>
@@ -24304,7 +25457,6 @@
           <w:szCs w:val="21"/>
         </w:rPr>
       </w:pPr>
-      <w:proofErr w:type="gramStart"/>
       <w:r>
         <w:rPr>
           <w:rFonts w:ascii="Consolas" w:eastAsia="Times New Roman" w:hAnsi="Consolas" w:cs="Times New Roman"/>
@@ -24314,7 +25466,6 @@
         </w:rPr>
         <w:t>#define</w:t>
       </w:r>
-      <w:proofErr w:type="gramEnd"/>
       <w:r>
         <w:rPr>
           <w:rFonts w:ascii="Consolas" w:eastAsia="Times New Roman" w:hAnsi="Consolas" w:cs="Times New Roman"/>
@@ -24771,7 +25922,6 @@
           <w:sz w:val="21"/>
           <w:szCs w:val="21"/>
         </w:rPr>
-        <w:lastRenderedPageBreak/>
         <w:t>display</w:t>
       </w:r>
       <w:r>
@@ -24861,6 +26011,7 @@
           <w:sz w:val="21"/>
           <w:szCs w:val="21"/>
         </w:rPr>
+        <w:lastRenderedPageBreak/>
         <w:t>display</w:t>
       </w:r>
       <w:r>
@@ -26075,7 +27226,6 @@
         </w:rPr>
         <w:t>/</w:t>
       </w:r>
-      <w:proofErr w:type="gramStart"/>
       <w:r>
         <w:rPr>
           <w:rFonts w:ascii="Consolas" w:eastAsia="Times New Roman" w:hAnsi="Consolas" w:cs="Times New Roman"/>
@@ -26094,7 +27244,6 @@
         </w:rPr>
         <w:t>;</w:t>
       </w:r>
-      <w:proofErr w:type="gramEnd"/>
       <w:r>
         <w:rPr>
           <w:rFonts w:ascii="Consolas" w:eastAsia="Times New Roman" w:hAnsi="Consolas" w:cs="Times New Roman"/>
@@ -26439,7 +27588,6 @@
         </w:rPr>
         <w:t>space</w:t>
       </w:r>
-      <w:proofErr w:type="gramStart"/>
       <w:r>
         <w:rPr>
           <w:rFonts w:ascii="Consolas" w:eastAsia="Times New Roman" w:hAnsi="Consolas" w:cs="Times New Roman"/>
@@ -26449,7 +27597,6 @@
         </w:rPr>
         <w:t>);</w:t>
       </w:r>
-      <w:proofErr w:type="gramEnd"/>
       <w:r>
         <w:rPr>
           <w:rFonts w:ascii="Consolas" w:eastAsia="Times New Roman" w:hAnsi="Consolas" w:cs="Times New Roman"/>
@@ -26519,7 +27666,6 @@
         </w:rPr>
         <w:t>"cm"</w:t>
       </w:r>
-      <w:proofErr w:type="gramStart"/>
       <w:r>
         <w:rPr>
           <w:rFonts w:ascii="Consolas" w:eastAsia="Times New Roman" w:hAnsi="Consolas" w:cs="Times New Roman"/>
@@ -26529,7 +27675,6 @@
         </w:rPr>
         <w:t>);</w:t>
       </w:r>
-      <w:proofErr w:type="gramEnd"/>
     </w:p>
     <w:p>
       <w:pPr>
@@ -26631,7 +27776,7 @@
     <w:p>
       <w:pPr>
         <w:rPr>
-          <w:rFonts w:ascii="David" w:hAnsi="David" w:cs="David" w:hint="cs"/>
+          <w:rFonts w:ascii="David" w:hAnsi="David" w:cs="David"/>
           <w:sz w:val="32"/>
           <w:szCs w:val="32"/>
           <w:rtl/>
@@ -26965,7 +28110,7 @@
 </file>
 
 <file path=word/endnotes.xml><?xml version="1.0" encoding="utf-8"?>
-<w:endnotes xmlns:wpc="http://schemas.microsoft.com/office/word/2010/wordprocessingCanvas" xmlns:cx="http://schemas.microsoft.com/office/drawing/2014/chartex" xmlns:cx1="http://schemas.microsoft.com/office/drawing/2015/9/8/chartex" xmlns:cx2="http://schemas.microsoft.com/office/drawing/2015/10/21/chartex" xmlns:cx3="http://schemas.microsoft.com/office/drawing/2016/5/9/chartex" xmlns:cx4="http://schemas.microsoft.com/office/drawing/2016/5/10/chartex" xmlns:cx5="http://schemas.microsoft.com/office/drawing/2016/5/11/chartex" xmlns:cx6="http://schemas.microsoft.com/office/drawing/2016/5/12/chartex" xmlns:cx7="http://schemas.microsoft.com/office/drawing/2016/5/13/chartex" xmlns:cx8="http://schemas.microsoft.com/office/drawing/2016/5/14/chartex" xmlns:mc="http://schemas.openxmlformats.org/markup-compatibility/2006" xmlns:aink="http://schemas.microsoft.com/office/drawing/2016/ink" xmlns:am3d="http://schemas.microsoft.com/office/drawing/2017/model3d" xmlns:o="urn:schemas-microsoft-com:office:office" xmlns:oel="http://schemas.microsoft.com/office/2019/extlst" xmlns:r="http://schemas.openxmlformats.org/officeDocument/2006/relationships" xmlns:m="http://schemas.openxmlformats.org/officeDocument/2006/math" xmlns:v="urn:schemas-microsoft-com:vml" xmlns:wp14="http://schemas.microsoft.com/office/word/2010/wordprocessingDrawing" xmlns:wp="http://schemas.openxmlformats.org/drawingml/2006/wordprocessingDrawing" xmlns:w10="urn:schemas-microsoft-com:office:word" xmlns:w="http://schemas.openxmlformats.org/wordprocessingml/2006/main" xmlns:w14="http://schemas.microsoft.com/office/word/2010/wordml" xmlns:w15="http://schemas.microsoft.com/office/word/2012/wordml" xmlns:w16cex="http://schemas.microsoft.com/office/word/2018/wordml/cex" xmlns:w16cid="http://schemas.microsoft.com/office/word/2016/wordml/cid" xmlns:w16="http://schemas.microsoft.com/office/word/2018/wordml" xmlns:w16du="http://schemas.microsoft.com/office/word/2023/wordml/word16du" xmlns:w16sdtdh="http://schemas.microsoft.com/office/word/2020/wordml/sdtdatahash" xmlns:w16se="http://schemas.microsoft.com/office/word/2015/wordml/symex" xmlns:wpg="http://schemas.microsoft.com/office/word/2010/wordprocessingGroup" xmlns:wpi="http://schemas.microsoft.com/office/word/2010/wordprocessingInk" xmlns:wne="http://schemas.microsoft.com/office/word/2006/wordml" xmlns:wps="http://schemas.microsoft.com/office/word/2010/wordprocessingShape" mc:Ignorable="w14 w15 w16se w16cid w16 w16cex w16sdtdh w16du wp14">
+<w:endnotes xmlns:wpc="http://schemas.microsoft.com/office/word/2010/wordprocessingCanvas" xmlns:cx="http://schemas.microsoft.com/office/drawing/2014/chartex" xmlns:cx1="http://schemas.microsoft.com/office/drawing/2015/9/8/chartex" xmlns:cx2="http://schemas.microsoft.com/office/drawing/2015/10/21/chartex" xmlns:cx3="http://schemas.microsoft.com/office/drawing/2016/5/9/chartex" xmlns:cx4="http://schemas.microsoft.com/office/drawing/2016/5/10/chartex" xmlns:cx5="http://schemas.microsoft.com/office/drawing/2016/5/11/chartex" xmlns:cx6="http://schemas.microsoft.com/office/drawing/2016/5/12/chartex" xmlns:cx7="http://schemas.microsoft.com/office/drawing/2016/5/13/chartex" xmlns:cx8="http://schemas.microsoft.com/office/drawing/2016/5/14/chartex" xmlns:mc="http://schemas.openxmlformats.org/markup-compatibility/2006" xmlns:aink="http://schemas.microsoft.com/office/drawing/2016/ink" xmlns:am3d="http://schemas.microsoft.com/office/drawing/2017/model3d" xmlns:o="urn:schemas-microsoft-com:office:office" xmlns:r="http://schemas.openxmlformats.org/officeDocument/2006/relationships" xmlns:m="http://schemas.openxmlformats.org/officeDocument/2006/math" xmlns:v="urn:schemas-microsoft-com:vml" xmlns:wp14="http://schemas.microsoft.com/office/word/2010/wordprocessingDrawing" xmlns:wp="http://schemas.openxmlformats.org/drawingml/2006/wordprocessingDrawing" xmlns:w10="urn:schemas-microsoft-com:office:word" xmlns:w="http://schemas.openxmlformats.org/wordprocessingml/2006/main" xmlns:w14="http://schemas.microsoft.com/office/word/2010/wordml" xmlns:w15="http://schemas.microsoft.com/office/word/2012/wordml" xmlns:w16cid="http://schemas.microsoft.com/office/word/2016/wordml/cid" xmlns:w16se="http://schemas.microsoft.com/office/word/2015/wordml/symex" xmlns:wpg="http://schemas.microsoft.com/office/word/2010/wordprocessingGroup" xmlns:wpi="http://schemas.microsoft.com/office/word/2010/wordprocessingInk" xmlns:wne="http://schemas.microsoft.com/office/word/2006/wordml" xmlns:wps="http://schemas.microsoft.com/office/word/2010/wordprocessingShape" mc:Ignorable="w14 w15 w16se w16cid wp14">
   <w:endnote w:type="separator" w:id="-1">
     <w:p>
       <w:pPr>
@@ -26975,6 +28120,7 @@
         <w:separator/>
       </w:r>
     </w:p>
+    <w:p/>
   </w:endnote>
   <w:endnote w:type="continuationSeparator" w:id="0">
     <w:p>
@@ -26985,12 +28131,13 @@
         <w:continuationSeparator/>
       </w:r>
     </w:p>
+    <w:p/>
   </w:endnote>
 </w:endnotes>
 </file>
 
 <file path=word/footer1.xml><?xml version="1.0" encoding="utf-8"?>
-<w:ftr xmlns:wpc="http://schemas.microsoft.com/office/word/2010/wordprocessingCanvas" xmlns:cx="http://schemas.microsoft.com/office/drawing/2014/chartex" xmlns:cx1="http://schemas.microsoft.com/office/drawing/2015/9/8/chartex" xmlns:cx2="http://schemas.microsoft.com/office/drawing/2015/10/21/chartex" xmlns:cx3="http://schemas.microsoft.com/office/drawing/2016/5/9/chartex" xmlns:cx4="http://schemas.microsoft.com/office/drawing/2016/5/10/chartex" xmlns:cx5="http://schemas.microsoft.com/office/drawing/2016/5/11/chartex" xmlns:cx6="http://schemas.microsoft.com/office/drawing/2016/5/12/chartex" xmlns:cx7="http://schemas.microsoft.com/office/drawing/2016/5/13/chartex" xmlns:cx8="http://schemas.microsoft.com/office/drawing/2016/5/14/chartex" xmlns:mc="http://schemas.openxmlformats.org/markup-compatibility/2006" xmlns:aink="http://schemas.microsoft.com/office/drawing/2016/ink" xmlns:am3d="http://schemas.microsoft.com/office/drawing/2017/model3d" xmlns:o="urn:schemas-microsoft-com:office:office" xmlns:oel="http://schemas.microsoft.com/office/2019/extlst" xmlns:r="http://schemas.openxmlformats.org/officeDocument/2006/relationships" xmlns:m="http://schemas.openxmlformats.org/officeDocument/2006/math" xmlns:v="urn:schemas-microsoft-com:vml" xmlns:wp14="http://schemas.microsoft.com/office/word/2010/wordprocessingDrawing" xmlns:wp="http://schemas.openxmlformats.org/drawingml/2006/wordprocessingDrawing" xmlns:w10="urn:schemas-microsoft-com:office:word" xmlns:w="http://schemas.openxmlformats.org/wordprocessingml/2006/main" xmlns:w14="http://schemas.microsoft.com/office/word/2010/wordml" xmlns:w15="http://schemas.microsoft.com/office/word/2012/wordml" xmlns:w16cex="http://schemas.microsoft.com/office/word/2018/wordml/cex" xmlns:w16cid="http://schemas.microsoft.com/office/word/2016/wordml/cid" xmlns:w16="http://schemas.microsoft.com/office/word/2018/wordml" xmlns:w16du="http://schemas.microsoft.com/office/word/2023/wordml/word16du" xmlns:w16sdtdh="http://schemas.microsoft.com/office/word/2020/wordml/sdtdatahash" xmlns:w16se="http://schemas.microsoft.com/office/word/2015/wordml/symex" xmlns:wpg="http://schemas.microsoft.com/office/word/2010/wordprocessingGroup" xmlns:wpi="http://schemas.microsoft.com/office/word/2010/wordprocessingInk" xmlns:wne="http://schemas.microsoft.com/office/word/2006/wordml" xmlns:wps="http://schemas.microsoft.com/office/word/2010/wordprocessingShape" mc:Ignorable="w14 w15 w16se w16cid w16 w16cex w16sdtdh w16du wp14">
+<w:ftr xmlns:wpc="http://schemas.microsoft.com/office/word/2010/wordprocessingCanvas" xmlns:cx="http://schemas.microsoft.com/office/drawing/2014/chartex" xmlns:cx1="http://schemas.microsoft.com/office/drawing/2015/9/8/chartex" xmlns:cx2="http://schemas.microsoft.com/office/drawing/2015/10/21/chartex" xmlns:cx3="http://schemas.microsoft.com/office/drawing/2016/5/9/chartex" xmlns:cx4="http://schemas.microsoft.com/office/drawing/2016/5/10/chartex" xmlns:cx5="http://schemas.microsoft.com/office/drawing/2016/5/11/chartex" xmlns:cx6="http://schemas.microsoft.com/office/drawing/2016/5/12/chartex" xmlns:cx7="http://schemas.microsoft.com/office/drawing/2016/5/13/chartex" xmlns:cx8="http://schemas.microsoft.com/office/drawing/2016/5/14/chartex" xmlns:mc="http://schemas.openxmlformats.org/markup-compatibility/2006" xmlns:aink="http://schemas.microsoft.com/office/drawing/2016/ink" xmlns:am3d="http://schemas.microsoft.com/office/drawing/2017/model3d" xmlns:o="urn:schemas-microsoft-com:office:office" xmlns:r="http://schemas.openxmlformats.org/officeDocument/2006/relationships" xmlns:m="http://schemas.openxmlformats.org/officeDocument/2006/math" xmlns:v="urn:schemas-microsoft-com:vml" xmlns:wp14="http://schemas.microsoft.com/office/word/2010/wordprocessingDrawing" xmlns:wp="http://schemas.openxmlformats.org/drawingml/2006/wordprocessingDrawing" xmlns:w10="urn:schemas-microsoft-com:office:word" xmlns:w="http://schemas.openxmlformats.org/wordprocessingml/2006/main" xmlns:w14="http://schemas.microsoft.com/office/word/2010/wordml" xmlns:w15="http://schemas.microsoft.com/office/word/2012/wordml" xmlns:w16cid="http://schemas.microsoft.com/office/word/2016/wordml/cid" xmlns:w16se="http://schemas.microsoft.com/office/word/2015/wordml/symex" xmlns:wpg="http://schemas.microsoft.com/office/word/2010/wordprocessingGroup" xmlns:wpi="http://schemas.microsoft.com/office/word/2010/wordprocessingInk" xmlns:wne="http://schemas.microsoft.com/office/word/2006/wordml" xmlns:wps="http://schemas.microsoft.com/office/word/2010/wordprocessingShape" mc:Ignorable="w14 w15 w16se w16cid wp14">
   <w:sdt>
     <w:sdtPr>
       <w:rPr>
@@ -27002,6 +28149,7 @@
         <w:docPartUnique/>
       </w:docPartObj>
     </w:sdtPr>
+    <w:sdtEndPr/>
     <w:sdtContent>
       <w:p>
         <w:pPr>
@@ -27035,11 +28183,12 @@
       <w:ind w:firstLine="720"/>
     </w:pPr>
   </w:p>
+  <w:p/>
 </w:ftr>
 </file>
 
 <file path=word/footnotes.xml><?xml version="1.0" encoding="utf-8"?>
-<w:footnotes xmlns:wpc="http://schemas.microsoft.com/office/word/2010/wordprocessingCanvas" xmlns:cx="http://schemas.microsoft.com/office/drawing/2014/chartex" xmlns:cx1="http://schemas.microsoft.com/office/drawing/2015/9/8/chartex" xmlns:cx2="http://schemas.microsoft.com/office/drawing/2015/10/21/chartex" xmlns:cx3="http://schemas.microsoft.com/office/drawing/2016/5/9/chartex" xmlns:cx4="http://schemas.microsoft.com/office/drawing/2016/5/10/chartex" xmlns:cx5="http://schemas.microsoft.com/office/drawing/2016/5/11/chartex" xmlns:cx6="http://schemas.microsoft.com/office/drawing/2016/5/12/chartex" xmlns:cx7="http://schemas.microsoft.com/office/drawing/2016/5/13/chartex" xmlns:cx8="http://schemas.microsoft.com/office/drawing/2016/5/14/chartex" xmlns:mc="http://schemas.openxmlformats.org/markup-compatibility/2006" xmlns:aink="http://schemas.microsoft.com/office/drawing/2016/ink" xmlns:am3d="http://schemas.microsoft.com/office/drawing/2017/model3d" xmlns:o="urn:schemas-microsoft-com:office:office" xmlns:oel="http://schemas.microsoft.com/office/2019/extlst" xmlns:r="http://schemas.openxmlformats.org/officeDocument/2006/relationships" xmlns:m="http://schemas.openxmlformats.org/officeDocument/2006/math" xmlns:v="urn:schemas-microsoft-com:vml" xmlns:wp14="http://schemas.microsoft.com/office/word/2010/wordprocessingDrawing" xmlns:wp="http://schemas.openxmlformats.org/drawingml/2006/wordprocessingDrawing" xmlns:w10="urn:schemas-microsoft-com:office:word" xmlns:w="http://schemas.openxmlformats.org/wordprocessingml/2006/main" xmlns:w14="http://schemas.microsoft.com/office/word/2010/wordml" xmlns:w15="http://schemas.microsoft.com/office/word/2012/wordml" xmlns:w16cex="http://schemas.microsoft.com/office/word/2018/wordml/cex" xmlns:w16cid="http://schemas.microsoft.com/office/word/2016/wordml/cid" xmlns:w16="http://schemas.microsoft.com/office/word/2018/wordml" xmlns:w16du="http://schemas.microsoft.com/office/word/2023/wordml/word16du" xmlns:w16sdtdh="http://schemas.microsoft.com/office/word/2020/wordml/sdtdatahash" xmlns:w16se="http://schemas.microsoft.com/office/word/2015/wordml/symex" xmlns:wpg="http://schemas.microsoft.com/office/word/2010/wordprocessingGroup" xmlns:wpi="http://schemas.microsoft.com/office/word/2010/wordprocessingInk" xmlns:wne="http://schemas.microsoft.com/office/word/2006/wordml" xmlns:wps="http://schemas.microsoft.com/office/word/2010/wordprocessingShape" mc:Ignorable="w14 w15 w16se w16cid w16 w16cex w16sdtdh w16du wp14">
+<w:footnotes xmlns:wpc="http://schemas.microsoft.com/office/word/2010/wordprocessingCanvas" xmlns:cx="http://schemas.microsoft.com/office/drawing/2014/chartex" xmlns:cx1="http://schemas.microsoft.com/office/drawing/2015/9/8/chartex" xmlns:cx2="http://schemas.microsoft.com/office/drawing/2015/10/21/chartex" xmlns:cx3="http://schemas.microsoft.com/office/drawing/2016/5/9/chartex" xmlns:cx4="http://schemas.microsoft.com/office/drawing/2016/5/10/chartex" xmlns:cx5="http://schemas.microsoft.com/office/drawing/2016/5/11/chartex" xmlns:cx6="http://schemas.microsoft.com/office/drawing/2016/5/12/chartex" xmlns:cx7="http://schemas.microsoft.com/office/drawing/2016/5/13/chartex" xmlns:cx8="http://schemas.microsoft.com/office/drawing/2016/5/14/chartex" xmlns:mc="http://schemas.openxmlformats.org/markup-compatibility/2006" xmlns:aink="http://schemas.microsoft.com/office/drawing/2016/ink" xmlns:am3d="http://schemas.microsoft.com/office/drawing/2017/model3d" xmlns:o="urn:schemas-microsoft-com:office:office" xmlns:r="http://schemas.openxmlformats.org/officeDocument/2006/relationships" xmlns:m="http://schemas.openxmlformats.org/officeDocument/2006/math" xmlns:v="urn:schemas-microsoft-com:vml" xmlns:wp14="http://schemas.microsoft.com/office/word/2010/wordprocessingDrawing" xmlns:wp="http://schemas.openxmlformats.org/drawingml/2006/wordprocessingDrawing" xmlns:w10="urn:schemas-microsoft-com:office:word" xmlns:w="http://schemas.openxmlformats.org/wordprocessingml/2006/main" xmlns:w14="http://schemas.microsoft.com/office/word/2010/wordml" xmlns:w15="http://schemas.microsoft.com/office/word/2012/wordml" xmlns:w16cid="http://schemas.microsoft.com/office/word/2016/wordml/cid" xmlns:w16se="http://schemas.microsoft.com/office/word/2015/wordml/symex" xmlns:wpg="http://schemas.microsoft.com/office/word/2010/wordprocessingGroup" xmlns:wpi="http://schemas.microsoft.com/office/word/2010/wordprocessingInk" xmlns:wne="http://schemas.microsoft.com/office/word/2006/wordml" xmlns:wps="http://schemas.microsoft.com/office/word/2010/wordprocessingShape" mc:Ignorable="w14 w15 w16se w16cid wp14">
   <w:footnote w:type="separator" w:id="-1">
     <w:p>
       <w:pPr>
@@ -27049,6 +28198,7 @@
         <w:separator/>
       </w:r>
     </w:p>
+    <w:p/>
   </w:footnote>
   <w:footnote w:type="continuationSeparator" w:id="0">
     <w:p>
@@ -27059,12 +28209,13 @@
         <w:continuationSeparator/>
       </w:r>
     </w:p>
+    <w:p/>
   </w:footnote>
 </w:footnotes>
 </file>
 
 <file path=word/header1.xml><?xml version="1.0" encoding="utf-8"?>
-<w:hdr xmlns:wpc="http://schemas.microsoft.com/office/word/2010/wordprocessingCanvas" xmlns:cx="http://schemas.microsoft.com/office/drawing/2014/chartex" xmlns:cx1="http://schemas.microsoft.com/office/drawing/2015/9/8/chartex" xmlns:cx2="http://schemas.microsoft.com/office/drawing/2015/10/21/chartex" xmlns:cx3="http://schemas.microsoft.com/office/drawing/2016/5/9/chartex" xmlns:cx4="http://schemas.microsoft.com/office/drawing/2016/5/10/chartex" xmlns:cx5="http://schemas.microsoft.com/office/drawing/2016/5/11/chartex" xmlns:cx6="http://schemas.microsoft.com/office/drawing/2016/5/12/chartex" xmlns:cx7="http://schemas.microsoft.com/office/drawing/2016/5/13/chartex" xmlns:cx8="http://schemas.microsoft.com/office/drawing/2016/5/14/chartex" xmlns:mc="http://schemas.openxmlformats.org/markup-compatibility/2006" xmlns:aink="http://schemas.microsoft.com/office/drawing/2016/ink" xmlns:am3d="http://schemas.microsoft.com/office/drawing/2017/model3d" xmlns:o="urn:schemas-microsoft-com:office:office" xmlns:oel="http://schemas.microsoft.com/office/2019/extlst" xmlns:r="http://schemas.openxmlformats.org/officeDocument/2006/relationships" xmlns:m="http://schemas.openxmlformats.org/officeDocument/2006/math" xmlns:v="urn:schemas-microsoft-com:vml" xmlns:wp14="http://schemas.microsoft.com/office/word/2010/wordprocessingDrawing" xmlns:wp="http://schemas.openxmlformats.org/drawingml/2006/wordprocessingDrawing" xmlns:w10="urn:schemas-microsoft-com:office:word" xmlns:w="http://schemas.openxmlformats.org/wordprocessingml/2006/main" xmlns:w14="http://schemas.microsoft.com/office/word/2010/wordml" xmlns:w15="http://schemas.microsoft.com/office/word/2012/wordml" xmlns:w16cex="http://schemas.microsoft.com/office/word/2018/wordml/cex" xmlns:w16cid="http://schemas.microsoft.com/office/word/2016/wordml/cid" xmlns:w16="http://schemas.microsoft.com/office/word/2018/wordml" xmlns:w16du="http://schemas.microsoft.com/office/word/2023/wordml/word16du" xmlns:w16sdtdh="http://schemas.microsoft.com/office/word/2020/wordml/sdtdatahash" xmlns:w16se="http://schemas.microsoft.com/office/word/2015/wordml/symex" xmlns:wpg="http://schemas.microsoft.com/office/word/2010/wordprocessingGroup" xmlns:wpi="http://schemas.microsoft.com/office/word/2010/wordprocessingInk" xmlns:wne="http://schemas.microsoft.com/office/word/2006/wordml" xmlns:wps="http://schemas.microsoft.com/office/word/2010/wordprocessingShape" mc:Ignorable="w14 w15 w16se w16cid w16 w16cex w16sdtdh w16du wp14">
+<w:hdr xmlns:wpc="http://schemas.microsoft.com/office/word/2010/wordprocessingCanvas" xmlns:cx="http://schemas.microsoft.com/office/drawing/2014/chartex" xmlns:cx1="http://schemas.microsoft.com/office/drawing/2015/9/8/chartex" xmlns:cx2="http://schemas.microsoft.com/office/drawing/2015/10/21/chartex" xmlns:cx3="http://schemas.microsoft.com/office/drawing/2016/5/9/chartex" xmlns:cx4="http://schemas.microsoft.com/office/drawing/2016/5/10/chartex" xmlns:cx5="http://schemas.microsoft.com/office/drawing/2016/5/11/chartex" xmlns:cx6="http://schemas.microsoft.com/office/drawing/2016/5/12/chartex" xmlns:cx7="http://schemas.microsoft.com/office/drawing/2016/5/13/chartex" xmlns:cx8="http://schemas.microsoft.com/office/drawing/2016/5/14/chartex" xmlns:mc="http://schemas.openxmlformats.org/markup-compatibility/2006" xmlns:aink="http://schemas.microsoft.com/office/drawing/2016/ink" xmlns:am3d="http://schemas.microsoft.com/office/drawing/2017/model3d" xmlns:o="urn:schemas-microsoft-com:office:office" xmlns:r="http://schemas.openxmlformats.org/officeDocument/2006/relationships" xmlns:m="http://schemas.openxmlformats.org/officeDocument/2006/math" xmlns:v="urn:schemas-microsoft-com:vml" xmlns:wp14="http://schemas.microsoft.com/office/word/2010/wordprocessingDrawing" xmlns:wp="http://schemas.openxmlformats.org/drawingml/2006/wordprocessingDrawing" xmlns:w10="urn:schemas-microsoft-com:office:word" xmlns:w="http://schemas.openxmlformats.org/wordprocessingml/2006/main" xmlns:w14="http://schemas.microsoft.com/office/word/2010/wordml" xmlns:w15="http://schemas.microsoft.com/office/word/2012/wordml" xmlns:w16cid="http://schemas.microsoft.com/office/word/2016/wordml/cid" xmlns:w16se="http://schemas.microsoft.com/office/word/2015/wordml/symex" xmlns:wpg="http://schemas.microsoft.com/office/word/2010/wordprocessingGroup" xmlns:wpi="http://schemas.microsoft.com/office/word/2010/wordprocessingInk" xmlns:wne="http://schemas.microsoft.com/office/word/2006/wordml" xmlns:wps="http://schemas.microsoft.com/office/word/2010/wordprocessingShape" mc:Ignorable="w14 w15 w16se w16cid wp14">
   <w:p>
     <w:pPr>
       <w:pStyle w:val="af"/>
@@ -27130,11 +28281,12 @@
       </w:drawing>
     </w:r>
   </w:p>
+  <w:p/>
 </w:hdr>
 </file>
 
 <file path=word/numbering.xml><?xml version="1.0" encoding="utf-8"?>
-<w:numbering xmlns:wpc="http://schemas.microsoft.com/office/word/2010/wordprocessingCanvas" xmlns:cx="http://schemas.microsoft.com/office/drawing/2014/chartex" xmlns:cx1="http://schemas.microsoft.com/office/drawing/2015/9/8/chartex" xmlns:cx2="http://schemas.microsoft.com/office/drawing/2015/10/21/chartex" xmlns:cx3="http://schemas.microsoft.com/office/drawing/2016/5/9/chartex" xmlns:cx4="http://schemas.microsoft.com/office/drawing/2016/5/10/chartex" xmlns:cx5="http://schemas.microsoft.com/office/drawing/2016/5/11/chartex" xmlns:cx6="http://schemas.microsoft.com/office/drawing/2016/5/12/chartex" xmlns:cx7="http://schemas.microsoft.com/office/drawing/2016/5/13/chartex" xmlns:cx8="http://schemas.microsoft.com/office/drawing/2016/5/14/chartex" xmlns:mc="http://schemas.openxmlformats.org/markup-compatibility/2006" xmlns:aink="http://schemas.microsoft.com/office/drawing/2016/ink" xmlns:am3d="http://schemas.microsoft.com/office/drawing/2017/model3d" xmlns:o="urn:schemas-microsoft-com:office:office" xmlns:oel="http://schemas.microsoft.com/office/2019/extlst" xmlns:r="http://schemas.openxmlformats.org/officeDocument/2006/relationships" xmlns:m="http://schemas.openxmlformats.org/officeDocument/2006/math" xmlns:v="urn:schemas-microsoft-com:vml" xmlns:wp14="http://schemas.microsoft.com/office/word/2010/wordprocessingDrawing" xmlns:wp="http://schemas.openxmlformats.org/drawingml/2006/wordprocessingDrawing" xmlns:w10="urn:schemas-microsoft-com:office:word" xmlns:w="http://schemas.openxmlformats.org/wordprocessingml/2006/main" xmlns:w14="http://schemas.microsoft.com/office/word/2010/wordml" xmlns:w15="http://schemas.microsoft.com/office/word/2012/wordml" xmlns:w16cex="http://schemas.microsoft.com/office/word/2018/wordml/cex" xmlns:w16cid="http://schemas.microsoft.com/office/word/2016/wordml/cid" xmlns:w16="http://schemas.microsoft.com/office/word/2018/wordml" xmlns:w16du="http://schemas.microsoft.com/office/word/2023/wordml/word16du" xmlns:w16sdtdh="http://schemas.microsoft.com/office/word/2020/wordml/sdtdatahash" xmlns:w16se="http://schemas.microsoft.com/office/word/2015/wordml/symex" xmlns:wpg="http://schemas.microsoft.com/office/word/2010/wordprocessingGroup" xmlns:wpi="http://schemas.microsoft.com/office/word/2010/wordprocessingInk" xmlns:wne="http://schemas.microsoft.com/office/word/2006/wordml" xmlns:wps="http://schemas.microsoft.com/office/word/2010/wordprocessingShape" mc:Ignorable="w14 w15 w16se w16cid w16 w16cex w16sdtdh w16du wp14">
+<w:numbering xmlns:wpc="http://schemas.microsoft.com/office/word/2010/wordprocessingCanvas" xmlns:cx="http://schemas.microsoft.com/office/drawing/2014/chartex" xmlns:cx1="http://schemas.microsoft.com/office/drawing/2015/9/8/chartex" xmlns:cx2="http://schemas.microsoft.com/office/drawing/2015/10/21/chartex" xmlns:cx3="http://schemas.microsoft.com/office/drawing/2016/5/9/chartex" xmlns:cx4="http://schemas.microsoft.com/office/drawing/2016/5/10/chartex" xmlns:cx5="http://schemas.microsoft.com/office/drawing/2016/5/11/chartex" xmlns:cx6="http://schemas.microsoft.com/office/drawing/2016/5/12/chartex" xmlns:cx7="http://schemas.microsoft.com/office/drawing/2016/5/13/chartex" xmlns:cx8="http://schemas.microsoft.com/office/drawing/2016/5/14/chartex" xmlns:mc="http://schemas.openxmlformats.org/markup-compatibility/2006" xmlns:aink="http://schemas.microsoft.com/office/drawing/2016/ink" xmlns:am3d="http://schemas.microsoft.com/office/drawing/2017/model3d" xmlns:o="urn:schemas-microsoft-com:office:office" xmlns:r="http://schemas.openxmlformats.org/officeDocument/2006/relationships" xmlns:m="http://schemas.openxmlformats.org/officeDocument/2006/math" xmlns:v="urn:schemas-microsoft-com:vml" xmlns:wp14="http://schemas.microsoft.com/office/word/2010/wordprocessingDrawing" xmlns:wp="http://schemas.openxmlformats.org/drawingml/2006/wordprocessingDrawing" xmlns:w10="urn:schemas-microsoft-com:office:word" xmlns:w="http://schemas.openxmlformats.org/wordprocessingml/2006/main" xmlns:w14="http://schemas.microsoft.com/office/word/2010/wordml" xmlns:w15="http://schemas.microsoft.com/office/word/2012/wordml" xmlns:w16cid="http://schemas.microsoft.com/office/word/2016/wordml/cid" xmlns:w16se="http://schemas.microsoft.com/office/word/2015/wordml/symex" xmlns:wpg="http://schemas.microsoft.com/office/word/2010/wordprocessingGroup" xmlns:wpi="http://schemas.microsoft.com/office/word/2010/wordprocessingInk" xmlns:wne="http://schemas.microsoft.com/office/word/2006/wordml" xmlns:wps="http://schemas.microsoft.com/office/word/2010/wordprocessingShape" mc:Ignorable="w14 w15 w16se w16cid wp14">
   <w:abstractNum w:abstractNumId="0" w15:restartNumberingAfterBreak="0">
     <w:nsid w:val="06E64581"/>
     <w:multiLevelType w:val="hybridMultilevel"/>
@@ -28847,9 +29999,9 @@
     </w:lvl>
   </w:abstractNum>
   <w:abstractNum w:abstractNumId="14" w15:restartNumberingAfterBreak="0">
-    <w:nsid w:val="30C76C83"/>
+    <w:nsid w:val="2F755D9F"/>
     <w:multiLevelType w:val="multilevel"/>
-    <w:tmpl w:val="614E4446"/>
+    <w:tmpl w:val="CD802FD4"/>
     <w:lvl w:ilvl="0">
       <w:start w:val="1"/>
       <w:numFmt w:val="bullet"/>
@@ -28996,122 +30148,158 @@
     </w:lvl>
   </w:abstractNum>
   <w:abstractNum w:abstractNumId="15" w15:restartNumberingAfterBreak="0">
-    <w:nsid w:val="33005739"/>
-    <w:multiLevelType w:val="hybridMultilevel"/>
-    <w:tmpl w:val="61D6B394"/>
-    <w:lvl w:ilvl="0" w:tplc="04090005">
+    <w:nsid w:val="306C5342"/>
+    <w:multiLevelType w:val="multilevel"/>
+    <w:tmpl w:val="C2F25F70"/>
+    <w:lvl w:ilvl="0">
+      <w:start w:val="1"/>
+      <w:numFmt w:val="bullet"/>
+      <w:lvlText w:val=""/>
+      <w:lvlJc w:val="left"/>
+      <w:pPr>
+        <w:tabs>
+          <w:tab w:val="num" w:pos="720"/>
+        </w:tabs>
+        <w:ind w:left="720" w:hanging="360"/>
+      </w:pPr>
+      <w:rPr>
+        <w:rFonts w:ascii="Symbol" w:hAnsi="Symbol" w:hint="default"/>
+        <w:sz w:val="20"/>
+      </w:rPr>
+    </w:lvl>
+    <w:lvl w:ilvl="1" w:tentative="1">
+      <w:start w:val="1"/>
+      <w:numFmt w:val="bullet"/>
+      <w:lvlText w:val="o"/>
+      <w:lvlJc w:val="left"/>
+      <w:pPr>
+        <w:tabs>
+          <w:tab w:val="num" w:pos="1440"/>
+        </w:tabs>
+        <w:ind w:left="1440" w:hanging="360"/>
+      </w:pPr>
+      <w:rPr>
+        <w:rFonts w:ascii="Courier New" w:hAnsi="Courier New" w:hint="default"/>
+        <w:sz w:val="20"/>
+      </w:rPr>
+    </w:lvl>
+    <w:lvl w:ilvl="2" w:tentative="1">
       <w:start w:val="1"/>
       <w:numFmt w:val="bullet"/>
       <w:lvlText w:val=""/>
       <w:lvlJc w:val="left"/>
       <w:pPr>
-        <w:ind w:left="720" w:hanging="360"/>
+        <w:tabs>
+          <w:tab w:val="num" w:pos="2160"/>
+        </w:tabs>
+        <w:ind w:left="2160" w:hanging="360"/>
       </w:pPr>
       <w:rPr>
         <w:rFonts w:ascii="Wingdings" w:hAnsi="Wingdings" w:hint="default"/>
+        <w:sz w:val="20"/>
       </w:rPr>
     </w:lvl>
-    <w:lvl w:ilvl="1" w:tplc="04090003" w:tentative="1">
-      <w:start w:val="1"/>
-      <w:numFmt w:val="bullet"/>
-      <w:lvlText w:val="o"/>
-      <w:lvlJc w:val="left"/>
-      <w:pPr>
-        <w:ind w:left="1440" w:hanging="360"/>
-      </w:pPr>
-      <w:rPr>
-        <w:rFonts w:ascii="Courier New" w:hAnsi="Courier New" w:cs="Courier New" w:hint="default"/>
-      </w:rPr>
-    </w:lvl>
-    <w:lvl w:ilvl="2" w:tplc="04090005" w:tentative="1">
+    <w:lvl w:ilvl="3" w:tentative="1">
       <w:start w:val="1"/>
       <w:numFmt w:val="bullet"/>
       <w:lvlText w:val=""/>
       <w:lvlJc w:val="left"/>
       <w:pPr>
-        <w:ind w:left="2160" w:hanging="360"/>
+        <w:tabs>
+          <w:tab w:val="num" w:pos="2880"/>
+        </w:tabs>
+        <w:ind w:left="2880" w:hanging="360"/>
       </w:pPr>
       <w:rPr>
         <w:rFonts w:ascii="Wingdings" w:hAnsi="Wingdings" w:hint="default"/>
+        <w:sz w:val="20"/>
       </w:rPr>
     </w:lvl>
-    <w:lvl w:ilvl="3" w:tplc="04090001" w:tentative="1">
-      <w:start w:val="1"/>
-      <w:numFmt w:val="bullet"/>
-      <w:lvlText w:val=""/>
-      <w:lvlJc w:val="left"/>
-      <w:pPr>
-        <w:ind w:left="2880" w:hanging="360"/>
-      </w:pPr>
-      <w:rPr>
-        <w:rFonts w:ascii="Symbol" w:hAnsi="Symbol" w:hint="default"/>
-      </w:rPr>
-    </w:lvl>
-    <w:lvl w:ilvl="4" w:tplc="04090003" w:tentative="1">
-      <w:start w:val="1"/>
-      <w:numFmt w:val="bullet"/>
-      <w:lvlText w:val="o"/>
-      <w:lvlJc w:val="left"/>
-      <w:pPr>
-        <w:ind w:left="3600" w:hanging="360"/>
-      </w:pPr>
-      <w:rPr>
-        <w:rFonts w:ascii="Courier New" w:hAnsi="Courier New" w:cs="Courier New" w:hint="default"/>
-      </w:rPr>
-    </w:lvl>
-    <w:lvl w:ilvl="5" w:tplc="04090005" w:tentative="1">
+    <w:lvl w:ilvl="4" w:tentative="1">
       <w:start w:val="1"/>
       <w:numFmt w:val="bullet"/>
       <w:lvlText w:val=""/>
       <w:lvlJc w:val="left"/>
       <w:pPr>
-        <w:ind w:left="4320" w:hanging="360"/>
+        <w:tabs>
+          <w:tab w:val="num" w:pos="3600"/>
+        </w:tabs>
+        <w:ind w:left="3600" w:hanging="360"/>
       </w:pPr>
       <w:rPr>
         <w:rFonts w:ascii="Wingdings" w:hAnsi="Wingdings" w:hint="default"/>
+        <w:sz w:val="20"/>
       </w:rPr>
     </w:lvl>
-    <w:lvl w:ilvl="6" w:tplc="04090001" w:tentative="1">
-      <w:start w:val="1"/>
-      <w:numFmt w:val="bullet"/>
-      <w:lvlText w:val=""/>
-      <w:lvlJc w:val="left"/>
-      <w:pPr>
-        <w:ind w:left="5040" w:hanging="360"/>
-      </w:pPr>
-      <w:rPr>
-        <w:rFonts w:ascii="Symbol" w:hAnsi="Symbol" w:hint="default"/>
-      </w:rPr>
-    </w:lvl>
-    <w:lvl w:ilvl="7" w:tplc="04090003" w:tentative="1">
-      <w:start w:val="1"/>
-      <w:numFmt w:val="bullet"/>
-      <w:lvlText w:val="o"/>
-      <w:lvlJc w:val="left"/>
-      <w:pPr>
-        <w:ind w:left="5760" w:hanging="360"/>
-      </w:pPr>
-      <w:rPr>
-        <w:rFonts w:ascii="Courier New" w:hAnsi="Courier New" w:cs="Courier New" w:hint="default"/>
-      </w:rPr>
-    </w:lvl>
-    <w:lvl w:ilvl="8" w:tplc="04090005" w:tentative="1">
+    <w:lvl w:ilvl="5" w:tentative="1">
       <w:start w:val="1"/>
       <w:numFmt w:val="bullet"/>
       <w:lvlText w:val=""/>
       <w:lvlJc w:val="left"/>
       <w:pPr>
-        <w:ind w:left="6480" w:hanging="360"/>
+        <w:tabs>
+          <w:tab w:val="num" w:pos="4320"/>
+        </w:tabs>
+        <w:ind w:left="4320" w:hanging="360"/>
       </w:pPr>
       <w:rPr>
         <w:rFonts w:ascii="Wingdings" w:hAnsi="Wingdings" w:hint="default"/>
+        <w:sz w:val="20"/>
+      </w:rPr>
+    </w:lvl>
+    <w:lvl w:ilvl="6" w:tentative="1">
+      <w:start w:val="1"/>
+      <w:numFmt w:val="bullet"/>
+      <w:lvlText w:val=""/>
+      <w:lvlJc w:val="left"/>
+      <w:pPr>
+        <w:tabs>
+          <w:tab w:val="num" w:pos="5040"/>
+        </w:tabs>
+        <w:ind w:left="5040" w:hanging="360"/>
+      </w:pPr>
+      <w:rPr>
+        <w:rFonts w:ascii="Wingdings" w:hAnsi="Wingdings" w:hint="default"/>
+        <w:sz w:val="20"/>
+      </w:rPr>
+    </w:lvl>
+    <w:lvl w:ilvl="7" w:tentative="1">
+      <w:start w:val="1"/>
+      <w:numFmt w:val="bullet"/>
+      <w:lvlText w:val=""/>
+      <w:lvlJc w:val="left"/>
+      <w:pPr>
+        <w:tabs>
+          <w:tab w:val="num" w:pos="5760"/>
+        </w:tabs>
+        <w:ind w:left="5760" w:hanging="360"/>
+      </w:pPr>
+      <w:rPr>
+        <w:rFonts w:ascii="Wingdings" w:hAnsi="Wingdings" w:hint="default"/>
+        <w:sz w:val="20"/>
+      </w:rPr>
+    </w:lvl>
+    <w:lvl w:ilvl="8" w:tentative="1">
+      <w:start w:val="1"/>
+      <w:numFmt w:val="bullet"/>
+      <w:lvlText w:val=""/>
+      <w:lvlJc w:val="left"/>
+      <w:pPr>
+        <w:tabs>
+          <w:tab w:val="num" w:pos="6480"/>
+        </w:tabs>
+        <w:ind w:left="6480" w:hanging="360"/>
+      </w:pPr>
+      <w:rPr>
+        <w:rFonts w:ascii="Wingdings" w:hAnsi="Wingdings" w:hint="default"/>
+        <w:sz w:val="20"/>
       </w:rPr>
     </w:lvl>
   </w:abstractNum>
   <w:abstractNum w:abstractNumId="16" w15:restartNumberingAfterBreak="0">
-    <w:nsid w:val="36634361"/>
+    <w:nsid w:val="30C76C83"/>
     <w:multiLevelType w:val="multilevel"/>
-    <w:tmpl w:val="494E9E0A"/>
+    <w:tmpl w:val="614E4446"/>
     <w:lvl w:ilvl="0">
       <w:start w:val="1"/>
       <w:numFmt w:val="bullet"/>
@@ -29258,16 +30446,16 @@
     </w:lvl>
   </w:abstractNum>
   <w:abstractNum w:abstractNumId="17" w15:restartNumberingAfterBreak="0">
-    <w:nsid w:val="36D8307D"/>
+    <w:nsid w:val="33005739"/>
     <w:multiLevelType w:val="hybridMultilevel"/>
-    <w:tmpl w:val="9AC287E8"/>
+    <w:tmpl w:val="61D6B394"/>
     <w:lvl w:ilvl="0" w:tplc="04090005">
       <w:start w:val="1"/>
       <w:numFmt w:val="bullet"/>
       <w:lvlText w:val=""/>
       <w:lvlJc w:val="left"/>
       <w:pPr>
-        <w:ind w:left="360" w:hanging="360"/>
+        <w:ind w:left="720" w:hanging="360"/>
       </w:pPr>
       <w:rPr>
         <w:rFonts w:ascii="Wingdings" w:hAnsi="Wingdings" w:hint="default"/>
@@ -29279,7 +30467,7 @@
       <w:lvlText w:val="o"/>
       <w:lvlJc w:val="left"/>
       <w:pPr>
-        <w:ind w:left="1080" w:hanging="360"/>
+        <w:ind w:left="1440" w:hanging="360"/>
       </w:pPr>
       <w:rPr>
         <w:rFonts w:ascii="Courier New" w:hAnsi="Courier New" w:cs="Courier New" w:hint="default"/>
@@ -29291,7 +30479,7 @@
       <w:lvlText w:val=""/>
       <w:lvlJc w:val="left"/>
       <w:pPr>
-        <w:ind w:left="1800" w:hanging="360"/>
+        <w:ind w:left="2160" w:hanging="360"/>
       </w:pPr>
       <w:rPr>
         <w:rFonts w:ascii="Wingdings" w:hAnsi="Wingdings" w:hint="default"/>
@@ -29303,7 +30491,7 @@
       <w:lvlText w:val=""/>
       <w:lvlJc w:val="left"/>
       <w:pPr>
-        <w:ind w:left="2520" w:hanging="360"/>
+        <w:ind w:left="2880" w:hanging="360"/>
       </w:pPr>
       <w:rPr>
         <w:rFonts w:ascii="Symbol" w:hAnsi="Symbol" w:hint="default"/>
@@ -29315,7 +30503,7 @@
       <w:lvlText w:val="o"/>
       <w:lvlJc w:val="left"/>
       <w:pPr>
-        <w:ind w:left="3240" w:hanging="360"/>
+        <w:ind w:left="3600" w:hanging="360"/>
       </w:pPr>
       <w:rPr>
         <w:rFonts w:ascii="Courier New" w:hAnsi="Courier New" w:cs="Courier New" w:hint="default"/>
@@ -29327,7 +30515,7 @@
       <w:lvlText w:val=""/>
       <w:lvlJc w:val="left"/>
       <w:pPr>
-        <w:ind w:left="3960" w:hanging="360"/>
+        <w:ind w:left="4320" w:hanging="360"/>
       </w:pPr>
       <w:rPr>
         <w:rFonts w:ascii="Wingdings" w:hAnsi="Wingdings" w:hint="default"/>
@@ -29339,7 +30527,7 @@
       <w:lvlText w:val=""/>
       <w:lvlJc w:val="left"/>
       <w:pPr>
-        <w:ind w:left="4680" w:hanging="360"/>
+        <w:ind w:left="5040" w:hanging="360"/>
       </w:pPr>
       <w:rPr>
         <w:rFonts w:ascii="Symbol" w:hAnsi="Symbol" w:hint="default"/>
@@ -29351,7 +30539,7 @@
       <w:lvlText w:val="o"/>
       <w:lvlJc w:val="left"/>
       <w:pPr>
-        <w:ind w:left="5400" w:hanging="360"/>
+        <w:ind w:left="5760" w:hanging="360"/>
       </w:pPr>
       <w:rPr>
         <w:rFonts w:ascii="Courier New" w:hAnsi="Courier New" w:cs="Courier New" w:hint="default"/>
@@ -29363,7 +30551,7 @@
       <w:lvlText w:val=""/>
       <w:lvlJc w:val="left"/>
       <w:pPr>
-        <w:ind w:left="6120" w:hanging="360"/>
+        <w:ind w:left="6480" w:hanging="360"/>
       </w:pPr>
       <w:rPr>
         <w:rFonts w:ascii="Wingdings" w:hAnsi="Wingdings" w:hint="default"/>
@@ -29371,122 +30559,9 @@
     </w:lvl>
   </w:abstractNum>
   <w:abstractNum w:abstractNumId="18" w15:restartNumberingAfterBreak="0">
-    <w:nsid w:val="36E64821"/>
-    <w:multiLevelType w:val="hybridMultilevel"/>
-    <w:tmpl w:val="BCFCC672"/>
-    <w:lvl w:ilvl="0" w:tplc="04090001">
-      <w:start w:val="1"/>
-      <w:numFmt w:val="bullet"/>
-      <w:lvlText w:val=""/>
-      <w:lvlJc w:val="left"/>
-      <w:pPr>
-        <w:ind w:left="1440" w:hanging="360"/>
-      </w:pPr>
-      <w:rPr>
-        <w:rFonts w:ascii="Symbol" w:hAnsi="Symbol" w:hint="default"/>
-      </w:rPr>
-    </w:lvl>
-    <w:lvl w:ilvl="1" w:tplc="04090003" w:tentative="1">
-      <w:start w:val="1"/>
-      <w:numFmt w:val="bullet"/>
-      <w:lvlText w:val="o"/>
-      <w:lvlJc w:val="left"/>
-      <w:pPr>
-        <w:ind w:left="2160" w:hanging="360"/>
-      </w:pPr>
-      <w:rPr>
-        <w:rFonts w:ascii="Courier New" w:hAnsi="Courier New" w:cs="Courier New" w:hint="default"/>
-      </w:rPr>
-    </w:lvl>
-    <w:lvl w:ilvl="2" w:tplc="04090005" w:tentative="1">
-      <w:start w:val="1"/>
-      <w:numFmt w:val="bullet"/>
-      <w:lvlText w:val=""/>
-      <w:lvlJc w:val="left"/>
-      <w:pPr>
-        <w:ind w:left="2880" w:hanging="360"/>
-      </w:pPr>
-      <w:rPr>
-        <w:rFonts w:ascii="Wingdings" w:hAnsi="Wingdings" w:hint="default"/>
-      </w:rPr>
-    </w:lvl>
-    <w:lvl w:ilvl="3" w:tplc="04090001" w:tentative="1">
-      <w:start w:val="1"/>
-      <w:numFmt w:val="bullet"/>
-      <w:lvlText w:val=""/>
-      <w:lvlJc w:val="left"/>
-      <w:pPr>
-        <w:ind w:left="3600" w:hanging="360"/>
-      </w:pPr>
-      <w:rPr>
-        <w:rFonts w:ascii="Symbol" w:hAnsi="Symbol" w:hint="default"/>
-      </w:rPr>
-    </w:lvl>
-    <w:lvl w:ilvl="4" w:tplc="04090003" w:tentative="1">
-      <w:start w:val="1"/>
-      <w:numFmt w:val="bullet"/>
-      <w:lvlText w:val="o"/>
-      <w:lvlJc w:val="left"/>
-      <w:pPr>
-        <w:ind w:left="4320" w:hanging="360"/>
-      </w:pPr>
-      <w:rPr>
-        <w:rFonts w:ascii="Courier New" w:hAnsi="Courier New" w:cs="Courier New" w:hint="default"/>
-      </w:rPr>
-    </w:lvl>
-    <w:lvl w:ilvl="5" w:tplc="04090005" w:tentative="1">
-      <w:start w:val="1"/>
-      <w:numFmt w:val="bullet"/>
-      <w:lvlText w:val=""/>
-      <w:lvlJc w:val="left"/>
-      <w:pPr>
-        <w:ind w:left="5040" w:hanging="360"/>
-      </w:pPr>
-      <w:rPr>
-        <w:rFonts w:ascii="Wingdings" w:hAnsi="Wingdings" w:hint="default"/>
-      </w:rPr>
-    </w:lvl>
-    <w:lvl w:ilvl="6" w:tplc="04090001" w:tentative="1">
-      <w:start w:val="1"/>
-      <w:numFmt w:val="bullet"/>
-      <w:lvlText w:val=""/>
-      <w:lvlJc w:val="left"/>
-      <w:pPr>
-        <w:ind w:left="5760" w:hanging="360"/>
-      </w:pPr>
-      <w:rPr>
-        <w:rFonts w:ascii="Symbol" w:hAnsi="Symbol" w:hint="default"/>
-      </w:rPr>
-    </w:lvl>
-    <w:lvl w:ilvl="7" w:tplc="04090003" w:tentative="1">
-      <w:start w:val="1"/>
-      <w:numFmt w:val="bullet"/>
-      <w:lvlText w:val="o"/>
-      <w:lvlJc w:val="left"/>
-      <w:pPr>
-        <w:ind w:left="6480" w:hanging="360"/>
-      </w:pPr>
-      <w:rPr>
-        <w:rFonts w:ascii="Courier New" w:hAnsi="Courier New" w:cs="Courier New" w:hint="default"/>
-      </w:rPr>
-    </w:lvl>
-    <w:lvl w:ilvl="8" w:tplc="04090005" w:tentative="1">
-      <w:start w:val="1"/>
-      <w:numFmt w:val="bullet"/>
-      <w:lvlText w:val=""/>
-      <w:lvlJc w:val="left"/>
-      <w:pPr>
-        <w:ind w:left="7200" w:hanging="360"/>
-      </w:pPr>
-      <w:rPr>
-        <w:rFonts w:ascii="Wingdings" w:hAnsi="Wingdings" w:hint="default"/>
-      </w:rPr>
-    </w:lvl>
-  </w:abstractNum>
-  <w:abstractNum w:abstractNumId="19" w15:restartNumberingAfterBreak="0">
-    <w:nsid w:val="4055325D"/>
+    <w:nsid w:val="36634361"/>
     <w:multiLevelType w:val="multilevel"/>
-    <w:tmpl w:val="91B07514"/>
+    <w:tmpl w:val="494E9E0A"/>
     <w:lvl w:ilvl="0">
       <w:start w:val="1"/>
       <w:numFmt w:val="bullet"/>
@@ -29632,17 +30707,130 @@
       </w:rPr>
     </w:lvl>
   </w:abstractNum>
+  <w:abstractNum w:abstractNumId="19" w15:restartNumberingAfterBreak="0">
+    <w:nsid w:val="36D8307D"/>
+    <w:multiLevelType w:val="hybridMultilevel"/>
+    <w:tmpl w:val="9AC287E8"/>
+    <w:lvl w:ilvl="0" w:tplc="04090005">
+      <w:start w:val="1"/>
+      <w:numFmt w:val="bullet"/>
+      <w:lvlText w:val=""/>
+      <w:lvlJc w:val="left"/>
+      <w:pPr>
+        <w:ind w:left="360" w:hanging="360"/>
+      </w:pPr>
+      <w:rPr>
+        <w:rFonts w:ascii="Wingdings" w:hAnsi="Wingdings" w:hint="default"/>
+      </w:rPr>
+    </w:lvl>
+    <w:lvl w:ilvl="1" w:tplc="04090003" w:tentative="1">
+      <w:start w:val="1"/>
+      <w:numFmt w:val="bullet"/>
+      <w:lvlText w:val="o"/>
+      <w:lvlJc w:val="left"/>
+      <w:pPr>
+        <w:ind w:left="1080" w:hanging="360"/>
+      </w:pPr>
+      <w:rPr>
+        <w:rFonts w:ascii="Courier New" w:hAnsi="Courier New" w:cs="Courier New" w:hint="default"/>
+      </w:rPr>
+    </w:lvl>
+    <w:lvl w:ilvl="2" w:tplc="04090005" w:tentative="1">
+      <w:start w:val="1"/>
+      <w:numFmt w:val="bullet"/>
+      <w:lvlText w:val=""/>
+      <w:lvlJc w:val="left"/>
+      <w:pPr>
+        <w:ind w:left="1800" w:hanging="360"/>
+      </w:pPr>
+      <w:rPr>
+        <w:rFonts w:ascii="Wingdings" w:hAnsi="Wingdings" w:hint="default"/>
+      </w:rPr>
+    </w:lvl>
+    <w:lvl w:ilvl="3" w:tplc="04090001" w:tentative="1">
+      <w:start w:val="1"/>
+      <w:numFmt w:val="bullet"/>
+      <w:lvlText w:val=""/>
+      <w:lvlJc w:val="left"/>
+      <w:pPr>
+        <w:ind w:left="2520" w:hanging="360"/>
+      </w:pPr>
+      <w:rPr>
+        <w:rFonts w:ascii="Symbol" w:hAnsi="Symbol" w:hint="default"/>
+      </w:rPr>
+    </w:lvl>
+    <w:lvl w:ilvl="4" w:tplc="04090003" w:tentative="1">
+      <w:start w:val="1"/>
+      <w:numFmt w:val="bullet"/>
+      <w:lvlText w:val="o"/>
+      <w:lvlJc w:val="left"/>
+      <w:pPr>
+        <w:ind w:left="3240" w:hanging="360"/>
+      </w:pPr>
+      <w:rPr>
+        <w:rFonts w:ascii="Courier New" w:hAnsi="Courier New" w:cs="Courier New" w:hint="default"/>
+      </w:rPr>
+    </w:lvl>
+    <w:lvl w:ilvl="5" w:tplc="04090005" w:tentative="1">
+      <w:start w:val="1"/>
+      <w:numFmt w:val="bullet"/>
+      <w:lvlText w:val=""/>
+      <w:lvlJc w:val="left"/>
+      <w:pPr>
+        <w:ind w:left="3960" w:hanging="360"/>
+      </w:pPr>
+      <w:rPr>
+        <w:rFonts w:ascii="Wingdings" w:hAnsi="Wingdings" w:hint="default"/>
+      </w:rPr>
+    </w:lvl>
+    <w:lvl w:ilvl="6" w:tplc="04090001" w:tentative="1">
+      <w:start w:val="1"/>
+      <w:numFmt w:val="bullet"/>
+      <w:lvlText w:val=""/>
+      <w:lvlJc w:val="left"/>
+      <w:pPr>
+        <w:ind w:left="4680" w:hanging="360"/>
+      </w:pPr>
+      <w:rPr>
+        <w:rFonts w:ascii="Symbol" w:hAnsi="Symbol" w:hint="default"/>
+      </w:rPr>
+    </w:lvl>
+    <w:lvl w:ilvl="7" w:tplc="04090003" w:tentative="1">
+      <w:start w:val="1"/>
+      <w:numFmt w:val="bullet"/>
+      <w:lvlText w:val="o"/>
+      <w:lvlJc w:val="left"/>
+      <w:pPr>
+        <w:ind w:left="5400" w:hanging="360"/>
+      </w:pPr>
+      <w:rPr>
+        <w:rFonts w:ascii="Courier New" w:hAnsi="Courier New" w:cs="Courier New" w:hint="default"/>
+      </w:rPr>
+    </w:lvl>
+    <w:lvl w:ilvl="8" w:tplc="04090005" w:tentative="1">
+      <w:start w:val="1"/>
+      <w:numFmt w:val="bullet"/>
+      <w:lvlText w:val=""/>
+      <w:lvlJc w:val="left"/>
+      <w:pPr>
+        <w:ind w:left="6120" w:hanging="360"/>
+      </w:pPr>
+      <w:rPr>
+        <w:rFonts w:ascii="Wingdings" w:hAnsi="Wingdings" w:hint="default"/>
+      </w:rPr>
+    </w:lvl>
+  </w:abstractNum>
   <w:abstractNum w:abstractNumId="20" w15:restartNumberingAfterBreak="0">
-    <w:nsid w:val="41AC2C42"/>
+    <w:nsid w:val="36E64821"/>
     <w:multiLevelType w:val="hybridMultilevel"/>
-    <w:tmpl w:val="44A4A964"/>
+    <w:tmpl w:val="BCFCC672"/>
     <w:lvl w:ilvl="0" w:tplc="04090001">
       <w:start w:val="1"/>
       <w:numFmt w:val="bullet"/>
       <w:lvlText w:val=""/>
       <w:lvlJc w:val="left"/>
       <w:pPr>
-        <w:ind w:left="720" w:hanging="360"/>
+        <w:ind w:left="1440" w:hanging="360"/>
       </w:pPr>
       <w:rPr>
         <w:rFonts w:ascii="Symbol" w:hAnsi="Symbol" w:hint="default"/>
@@ -29654,7 +30842,7 @@
       <w:lvlText w:val="o"/>
       <w:lvlJc w:val="left"/>
       <w:pPr>
-        <w:ind w:left="1440" w:hanging="360"/>
+        <w:ind w:left="2160" w:hanging="360"/>
       </w:pPr>
       <w:rPr>
         <w:rFonts w:ascii="Courier New" w:hAnsi="Courier New" w:cs="Courier New" w:hint="default"/>
@@ -29666,7 +30854,7 @@
       <w:lvlText w:val=""/>
       <w:lvlJc w:val="left"/>
       <w:pPr>
-        <w:ind w:left="2160" w:hanging="360"/>
+        <w:ind w:left="2880" w:hanging="360"/>
       </w:pPr>
       <w:rPr>
         <w:rFonts w:ascii="Wingdings" w:hAnsi="Wingdings" w:hint="default"/>
@@ -29678,7 +30866,7 @@
       <w:lvlText w:val=""/>
       <w:lvlJc w:val="left"/>
       <w:pPr>
-        <w:ind w:left="2880" w:hanging="360"/>
+        <w:ind w:left="3600" w:hanging="360"/>
       </w:pPr>
       <w:rPr>
         <w:rFonts w:ascii="Symbol" w:hAnsi="Symbol" w:hint="default"/>
@@ -29690,7 +30878,7 @@
       <w:lvlText w:val="o"/>
       <w:lvlJc w:val="left"/>
       <w:pPr>
-        <w:ind w:left="3600" w:hanging="360"/>
+        <w:ind w:left="4320" w:hanging="360"/>
       </w:pPr>
       <w:rPr>
         <w:rFonts w:ascii="Courier New" w:hAnsi="Courier New" w:cs="Courier New" w:hint="default"/>
@@ -29702,7 +30890,7 @@
       <w:lvlText w:val=""/>
       <w:lvlJc w:val="left"/>
       <w:pPr>
-        <w:ind w:left="4320" w:hanging="360"/>
+        <w:ind w:left="5040" w:hanging="360"/>
       </w:pPr>
       <w:rPr>
         <w:rFonts w:ascii="Wingdings" w:hAnsi="Wingdings" w:hint="default"/>
@@ -29714,7 +30902,7 @@
       <w:lvlText w:val=""/>
       <w:lvlJc w:val="left"/>
       <w:pPr>
-        <w:ind w:left="5040" w:hanging="360"/>
+        <w:ind w:left="5760" w:hanging="360"/>
       </w:pPr>
       <w:rPr>
         <w:rFonts w:ascii="Symbol" w:hAnsi="Symbol" w:hint="default"/>
@@ -29726,7 +30914,7 @@
       <w:lvlText w:val="o"/>
       <w:lvlJc w:val="left"/>
       <w:pPr>
-        <w:ind w:left="5760" w:hanging="360"/>
+        <w:ind w:left="6480" w:hanging="360"/>
       </w:pPr>
       <w:rPr>
         <w:rFonts w:ascii="Courier New" w:hAnsi="Courier New" w:cs="Courier New" w:hint="default"/>
@@ -29738,7 +30926,7 @@
       <w:lvlText w:val=""/>
       <w:lvlJc w:val="left"/>
       <w:pPr>
-        <w:ind w:left="6480" w:hanging="360"/>
+        <w:ind w:left="7200" w:hanging="360"/>
       </w:pPr>
       <w:rPr>
         <w:rFonts w:ascii="Wingdings" w:hAnsi="Wingdings" w:hint="default"/>
@@ -29746,122 +30934,9 @@
     </w:lvl>
   </w:abstractNum>
   <w:abstractNum w:abstractNumId="21" w15:restartNumberingAfterBreak="0">
-    <w:nsid w:val="4A7937CD"/>
-    <w:multiLevelType w:val="hybridMultilevel"/>
-    <w:tmpl w:val="C5AAC1E0"/>
-    <w:lvl w:ilvl="0" w:tplc="04090001">
-      <w:start w:val="1"/>
-      <w:numFmt w:val="bullet"/>
-      <w:lvlText w:val=""/>
-      <w:lvlJc w:val="left"/>
-      <w:pPr>
-        <w:ind w:left="1440" w:hanging="360"/>
-      </w:pPr>
-      <w:rPr>
-        <w:rFonts w:ascii="Symbol" w:hAnsi="Symbol" w:hint="default"/>
-      </w:rPr>
-    </w:lvl>
-    <w:lvl w:ilvl="1" w:tplc="04090003" w:tentative="1">
-      <w:start w:val="1"/>
-      <w:numFmt w:val="bullet"/>
-      <w:lvlText w:val="o"/>
-      <w:lvlJc w:val="left"/>
-      <w:pPr>
-        <w:ind w:left="2160" w:hanging="360"/>
-      </w:pPr>
-      <w:rPr>
-        <w:rFonts w:ascii="Courier New" w:hAnsi="Courier New" w:cs="Courier New" w:hint="default"/>
-      </w:rPr>
-    </w:lvl>
-    <w:lvl w:ilvl="2" w:tplc="04090005" w:tentative="1">
-      <w:start w:val="1"/>
-      <w:numFmt w:val="bullet"/>
-      <w:lvlText w:val=""/>
-      <w:lvlJc w:val="left"/>
-      <w:pPr>
-        <w:ind w:left="2880" w:hanging="360"/>
-      </w:pPr>
-      <w:rPr>
-        <w:rFonts w:ascii="Wingdings" w:hAnsi="Wingdings" w:hint="default"/>
-      </w:rPr>
-    </w:lvl>
-    <w:lvl w:ilvl="3" w:tplc="04090001" w:tentative="1">
-      <w:start w:val="1"/>
-      <w:numFmt w:val="bullet"/>
-      <w:lvlText w:val=""/>
-      <w:lvlJc w:val="left"/>
-      <w:pPr>
-        <w:ind w:left="3600" w:hanging="360"/>
-      </w:pPr>
-      <w:rPr>
-        <w:rFonts w:ascii="Symbol" w:hAnsi="Symbol" w:hint="default"/>
-      </w:rPr>
-    </w:lvl>
-    <w:lvl w:ilvl="4" w:tplc="04090003" w:tentative="1">
-      <w:start w:val="1"/>
-      <w:numFmt w:val="bullet"/>
-      <w:lvlText w:val="o"/>
-      <w:lvlJc w:val="left"/>
-      <w:pPr>
-        <w:ind w:left="4320" w:hanging="360"/>
-      </w:pPr>
-      <w:rPr>
-        <w:rFonts w:ascii="Courier New" w:hAnsi="Courier New" w:cs="Courier New" w:hint="default"/>
-      </w:rPr>
-    </w:lvl>
-    <w:lvl w:ilvl="5" w:tplc="04090005" w:tentative="1">
-      <w:start w:val="1"/>
-      <w:numFmt w:val="bullet"/>
-      <w:lvlText w:val=""/>
-      <w:lvlJc w:val="left"/>
-      <w:pPr>
-        <w:ind w:left="5040" w:hanging="360"/>
-      </w:pPr>
-      <w:rPr>
-        <w:rFonts w:ascii="Wingdings" w:hAnsi="Wingdings" w:hint="default"/>
-      </w:rPr>
-    </w:lvl>
-    <w:lvl w:ilvl="6" w:tplc="04090001" w:tentative="1">
-      <w:start w:val="1"/>
-      <w:numFmt w:val="bullet"/>
-      <w:lvlText w:val=""/>
-      <w:lvlJc w:val="left"/>
-      <w:pPr>
-        <w:ind w:left="5760" w:hanging="360"/>
-      </w:pPr>
-      <w:rPr>
-        <w:rFonts w:ascii="Symbol" w:hAnsi="Symbol" w:hint="default"/>
-      </w:rPr>
-    </w:lvl>
-    <w:lvl w:ilvl="7" w:tplc="04090003" w:tentative="1">
-      <w:start w:val="1"/>
-      <w:numFmt w:val="bullet"/>
-      <w:lvlText w:val="o"/>
-      <w:lvlJc w:val="left"/>
-      <w:pPr>
-        <w:ind w:left="6480" w:hanging="360"/>
-      </w:pPr>
-      <w:rPr>
-        <w:rFonts w:ascii="Courier New" w:hAnsi="Courier New" w:cs="Courier New" w:hint="default"/>
-      </w:rPr>
-    </w:lvl>
-    <w:lvl w:ilvl="8" w:tplc="04090005" w:tentative="1">
-      <w:start w:val="1"/>
-      <w:numFmt w:val="bullet"/>
-      <w:lvlText w:val=""/>
-      <w:lvlJc w:val="left"/>
-      <w:pPr>
-        <w:ind w:left="7200" w:hanging="360"/>
-      </w:pPr>
-      <w:rPr>
-        <w:rFonts w:ascii="Wingdings" w:hAnsi="Wingdings" w:hint="default"/>
-      </w:rPr>
-    </w:lvl>
-  </w:abstractNum>
-  <w:abstractNum w:abstractNumId="22" w15:restartNumberingAfterBreak="0">
-    <w:nsid w:val="54C30D42"/>
+    <w:nsid w:val="4055325D"/>
     <w:multiLevelType w:val="multilevel"/>
-    <w:tmpl w:val="BB74C04A"/>
+    <w:tmpl w:val="91B07514"/>
     <w:lvl w:ilvl="0">
       <w:start w:val="1"/>
       <w:numFmt w:val="bullet"/>
@@ -30007,10 +31082,236 @@
       </w:rPr>
     </w:lvl>
   </w:abstractNum>
+  <w:abstractNum w:abstractNumId="22" w15:restartNumberingAfterBreak="0">
+    <w:nsid w:val="41AC2C42"/>
+    <w:multiLevelType w:val="hybridMultilevel"/>
+    <w:tmpl w:val="44A4A964"/>
+    <w:lvl w:ilvl="0" w:tplc="04090001">
+      <w:start w:val="1"/>
+      <w:numFmt w:val="bullet"/>
+      <w:lvlText w:val=""/>
+      <w:lvlJc w:val="left"/>
+      <w:pPr>
+        <w:ind w:left="720" w:hanging="360"/>
+      </w:pPr>
+      <w:rPr>
+        <w:rFonts w:ascii="Symbol" w:hAnsi="Symbol" w:hint="default"/>
+      </w:rPr>
+    </w:lvl>
+    <w:lvl w:ilvl="1" w:tplc="04090003" w:tentative="1">
+      <w:start w:val="1"/>
+      <w:numFmt w:val="bullet"/>
+      <w:lvlText w:val="o"/>
+      <w:lvlJc w:val="left"/>
+      <w:pPr>
+        <w:ind w:left="1440" w:hanging="360"/>
+      </w:pPr>
+      <w:rPr>
+        <w:rFonts w:ascii="Courier New" w:hAnsi="Courier New" w:cs="Courier New" w:hint="default"/>
+      </w:rPr>
+    </w:lvl>
+    <w:lvl w:ilvl="2" w:tplc="04090005" w:tentative="1">
+      <w:start w:val="1"/>
+      <w:numFmt w:val="bullet"/>
+      <w:lvlText w:val=""/>
+      <w:lvlJc w:val="left"/>
+      <w:pPr>
+        <w:ind w:left="2160" w:hanging="360"/>
+      </w:pPr>
+      <w:rPr>
+        <w:rFonts w:ascii="Wingdings" w:hAnsi="Wingdings" w:hint="default"/>
+      </w:rPr>
+    </w:lvl>
+    <w:lvl w:ilvl="3" w:tplc="04090001" w:tentative="1">
+      <w:start w:val="1"/>
+      <w:numFmt w:val="bullet"/>
+      <w:lvlText w:val=""/>
+      <w:lvlJc w:val="left"/>
+      <w:pPr>
+        <w:ind w:left="2880" w:hanging="360"/>
+      </w:pPr>
+      <w:rPr>
+        <w:rFonts w:ascii="Symbol" w:hAnsi="Symbol" w:hint="default"/>
+      </w:rPr>
+    </w:lvl>
+    <w:lvl w:ilvl="4" w:tplc="04090003" w:tentative="1">
+      <w:start w:val="1"/>
+      <w:numFmt w:val="bullet"/>
+      <w:lvlText w:val="o"/>
+      <w:lvlJc w:val="left"/>
+      <w:pPr>
+        <w:ind w:left="3600" w:hanging="360"/>
+      </w:pPr>
+      <w:rPr>
+        <w:rFonts w:ascii="Courier New" w:hAnsi="Courier New" w:cs="Courier New" w:hint="default"/>
+      </w:rPr>
+    </w:lvl>
+    <w:lvl w:ilvl="5" w:tplc="04090005" w:tentative="1">
+      <w:start w:val="1"/>
+      <w:numFmt w:val="bullet"/>
+      <w:lvlText w:val=""/>
+      <w:lvlJc w:val="left"/>
+      <w:pPr>
+        <w:ind w:left="4320" w:hanging="360"/>
+      </w:pPr>
+      <w:rPr>
+        <w:rFonts w:ascii="Wingdings" w:hAnsi="Wingdings" w:hint="default"/>
+      </w:rPr>
+    </w:lvl>
+    <w:lvl w:ilvl="6" w:tplc="04090001" w:tentative="1">
+      <w:start w:val="1"/>
+      <w:numFmt w:val="bullet"/>
+      <w:lvlText w:val=""/>
+      <w:lvlJc w:val="left"/>
+      <w:pPr>
+        <w:ind w:left="5040" w:hanging="360"/>
+      </w:pPr>
+      <w:rPr>
+        <w:rFonts w:ascii="Symbol" w:hAnsi="Symbol" w:hint="default"/>
+      </w:rPr>
+    </w:lvl>
+    <w:lvl w:ilvl="7" w:tplc="04090003" w:tentative="1">
+      <w:start w:val="1"/>
+      <w:numFmt w:val="bullet"/>
+      <w:lvlText w:val="o"/>
+      <w:lvlJc w:val="left"/>
+      <w:pPr>
+        <w:ind w:left="5760" w:hanging="360"/>
+      </w:pPr>
+      <w:rPr>
+        <w:rFonts w:ascii="Courier New" w:hAnsi="Courier New" w:cs="Courier New" w:hint="default"/>
+      </w:rPr>
+    </w:lvl>
+    <w:lvl w:ilvl="8" w:tplc="04090005" w:tentative="1">
+      <w:start w:val="1"/>
+      <w:numFmt w:val="bullet"/>
+      <w:lvlText w:val=""/>
+      <w:lvlJc w:val="left"/>
+      <w:pPr>
+        <w:ind w:left="6480" w:hanging="360"/>
+      </w:pPr>
+      <w:rPr>
+        <w:rFonts w:ascii="Wingdings" w:hAnsi="Wingdings" w:hint="default"/>
+      </w:rPr>
+    </w:lvl>
+  </w:abstractNum>
   <w:abstractNum w:abstractNumId="23" w15:restartNumberingAfterBreak="0">
-    <w:nsid w:val="5D7E72F4"/>
+    <w:nsid w:val="4A7937CD"/>
+    <w:multiLevelType w:val="hybridMultilevel"/>
+    <w:tmpl w:val="C5AAC1E0"/>
+    <w:lvl w:ilvl="0" w:tplc="04090001">
+      <w:start w:val="1"/>
+      <w:numFmt w:val="bullet"/>
+      <w:lvlText w:val=""/>
+      <w:lvlJc w:val="left"/>
+      <w:pPr>
+        <w:ind w:left="1440" w:hanging="360"/>
+      </w:pPr>
+      <w:rPr>
+        <w:rFonts w:ascii="Symbol" w:hAnsi="Symbol" w:hint="default"/>
+      </w:rPr>
+    </w:lvl>
+    <w:lvl w:ilvl="1" w:tplc="04090003" w:tentative="1">
+      <w:start w:val="1"/>
+      <w:numFmt w:val="bullet"/>
+      <w:lvlText w:val="o"/>
+      <w:lvlJc w:val="left"/>
+      <w:pPr>
+        <w:ind w:left="2160" w:hanging="360"/>
+      </w:pPr>
+      <w:rPr>
+        <w:rFonts w:ascii="Courier New" w:hAnsi="Courier New" w:cs="Courier New" w:hint="default"/>
+      </w:rPr>
+    </w:lvl>
+    <w:lvl w:ilvl="2" w:tplc="04090005" w:tentative="1">
+      <w:start w:val="1"/>
+      <w:numFmt w:val="bullet"/>
+      <w:lvlText w:val=""/>
+      <w:lvlJc w:val="left"/>
+      <w:pPr>
+        <w:ind w:left="2880" w:hanging="360"/>
+      </w:pPr>
+      <w:rPr>
+        <w:rFonts w:ascii="Wingdings" w:hAnsi="Wingdings" w:hint="default"/>
+      </w:rPr>
+    </w:lvl>
+    <w:lvl w:ilvl="3" w:tplc="04090001" w:tentative="1">
+      <w:start w:val="1"/>
+      <w:numFmt w:val="bullet"/>
+      <w:lvlText w:val=""/>
+      <w:lvlJc w:val="left"/>
+      <w:pPr>
+        <w:ind w:left="3600" w:hanging="360"/>
+      </w:pPr>
+      <w:rPr>
+        <w:rFonts w:ascii="Symbol" w:hAnsi="Symbol" w:hint="default"/>
+      </w:rPr>
+    </w:lvl>
+    <w:lvl w:ilvl="4" w:tplc="04090003" w:tentative="1">
+      <w:start w:val="1"/>
+      <w:numFmt w:val="bullet"/>
+      <w:lvlText w:val="o"/>
+      <w:lvlJc w:val="left"/>
+      <w:pPr>
+        <w:ind w:left="4320" w:hanging="360"/>
+      </w:pPr>
+      <w:rPr>
+        <w:rFonts w:ascii="Courier New" w:hAnsi="Courier New" w:cs="Courier New" w:hint="default"/>
+      </w:rPr>
+    </w:lvl>
+    <w:lvl w:ilvl="5" w:tplc="04090005" w:tentative="1">
+      <w:start w:val="1"/>
+      <w:numFmt w:val="bullet"/>
+      <w:lvlText w:val=""/>
+      <w:lvlJc w:val="left"/>
+      <w:pPr>
+        <w:ind w:left="5040" w:hanging="360"/>
+      </w:pPr>
+      <w:rPr>
+        <w:rFonts w:ascii="Wingdings" w:hAnsi="Wingdings" w:hint="default"/>
+      </w:rPr>
+    </w:lvl>
+    <w:lvl w:ilvl="6" w:tplc="04090001" w:tentative="1">
+      <w:start w:val="1"/>
+      <w:numFmt w:val="bullet"/>
+      <w:lvlText w:val=""/>
+      <w:lvlJc w:val="left"/>
+      <w:pPr>
+        <w:ind w:left="5760" w:hanging="360"/>
+      </w:pPr>
+      <w:rPr>
+        <w:rFonts w:ascii="Symbol" w:hAnsi="Symbol" w:hint="default"/>
+      </w:rPr>
+    </w:lvl>
+    <w:lvl w:ilvl="7" w:tplc="04090003" w:tentative="1">
+      <w:start w:val="1"/>
+      <w:numFmt w:val="bullet"/>
+      <w:lvlText w:val="o"/>
+      <w:lvlJc w:val="left"/>
+      <w:pPr>
+        <w:ind w:left="6480" w:hanging="360"/>
+      </w:pPr>
+      <w:rPr>
+        <w:rFonts w:ascii="Courier New" w:hAnsi="Courier New" w:cs="Courier New" w:hint="default"/>
+      </w:rPr>
+    </w:lvl>
+    <w:lvl w:ilvl="8" w:tplc="04090005" w:tentative="1">
+      <w:start w:val="1"/>
+      <w:numFmt w:val="bullet"/>
+      <w:lvlText w:val=""/>
+      <w:lvlJc w:val="left"/>
+      <w:pPr>
+        <w:ind w:left="7200" w:hanging="360"/>
+      </w:pPr>
+      <w:rPr>
+        <w:rFonts w:ascii="Wingdings" w:hAnsi="Wingdings" w:hint="default"/>
+      </w:rPr>
+    </w:lvl>
+  </w:abstractNum>
+  <w:abstractNum w:abstractNumId="24" w15:restartNumberingAfterBreak="0">
+    <w:nsid w:val="4F437FED"/>
     <w:multiLevelType w:val="multilevel"/>
-    <w:tmpl w:val="364E971A"/>
+    <w:tmpl w:val="0A6C0AF2"/>
     <w:lvl w:ilvl="0">
       <w:start w:val="1"/>
       <w:numFmt w:val="bullet"/>
@@ -30156,121 +31457,157 @@
       </w:rPr>
     </w:lvl>
   </w:abstractNum>
-  <w:abstractNum w:abstractNumId="24" w15:restartNumberingAfterBreak="0">
-    <w:nsid w:val="628960A5"/>
-    <w:multiLevelType w:val="hybridMultilevel"/>
-    <w:tmpl w:val="683A0DBA"/>
-    <w:lvl w:ilvl="0" w:tplc="04090001">
+  <w:abstractNum w:abstractNumId="25" w15:restartNumberingAfterBreak="0">
+    <w:nsid w:val="54C30D42"/>
+    <w:multiLevelType w:val="multilevel"/>
+    <w:tmpl w:val="BB74C04A"/>
+    <w:lvl w:ilvl="0">
       <w:start w:val="1"/>
       <w:numFmt w:val="bullet"/>
       <w:lvlText w:val=""/>
       <w:lvlJc w:val="left"/>
       <w:pPr>
-        <w:ind w:left="360" w:hanging="360"/>
+        <w:tabs>
+          <w:tab w:val="num" w:pos="720"/>
+        </w:tabs>
+        <w:ind w:left="720" w:hanging="360"/>
       </w:pPr>
       <w:rPr>
         <w:rFonts w:ascii="Symbol" w:hAnsi="Symbol" w:hint="default"/>
+        <w:sz w:val="20"/>
       </w:rPr>
     </w:lvl>
-    <w:lvl w:ilvl="1" w:tplc="04090003">
+    <w:lvl w:ilvl="1">
       <w:start w:val="1"/>
       <w:numFmt w:val="bullet"/>
       <w:lvlText w:val="o"/>
       <w:lvlJc w:val="left"/>
       <w:pPr>
-        <w:ind w:left="1080" w:hanging="360"/>
+        <w:tabs>
+          <w:tab w:val="num" w:pos="1440"/>
+        </w:tabs>
+        <w:ind w:left="1440" w:hanging="360"/>
       </w:pPr>
       <w:rPr>
-        <w:rFonts w:ascii="Courier New" w:hAnsi="Courier New" w:cs="Courier New" w:hint="default"/>
+        <w:rFonts w:ascii="Courier New" w:hAnsi="Courier New" w:hint="default"/>
+        <w:sz w:val="20"/>
       </w:rPr>
     </w:lvl>
-    <w:lvl w:ilvl="2" w:tplc="04090005">
+    <w:lvl w:ilvl="2" w:tentative="1">
       <w:start w:val="1"/>
       <w:numFmt w:val="bullet"/>
       <w:lvlText w:val=""/>
       <w:lvlJc w:val="left"/>
       <w:pPr>
-        <w:ind w:left="1800" w:hanging="360"/>
+        <w:tabs>
+          <w:tab w:val="num" w:pos="2160"/>
+        </w:tabs>
+        <w:ind w:left="2160" w:hanging="360"/>
       </w:pPr>
       <w:rPr>
         <w:rFonts w:ascii="Wingdings" w:hAnsi="Wingdings" w:hint="default"/>
+        <w:sz w:val="20"/>
       </w:rPr>
     </w:lvl>
-    <w:lvl w:ilvl="3" w:tplc="04090001" w:tentative="1">
-      <w:start w:val="1"/>
-      <w:numFmt w:val="bullet"/>
-      <w:lvlText w:val=""/>
-      <w:lvlJc w:val="left"/>
-      <w:pPr>
-        <w:ind w:left="2520" w:hanging="360"/>
-      </w:pPr>
-      <w:rPr>
-        <w:rFonts w:ascii="Symbol" w:hAnsi="Symbol" w:hint="default"/>
-      </w:rPr>
-    </w:lvl>
-    <w:lvl w:ilvl="4" w:tplc="04090003" w:tentative="1">
-      <w:start w:val="1"/>
-      <w:numFmt w:val="bullet"/>
-      <w:lvlText w:val="o"/>
-      <w:lvlJc w:val="left"/>
-      <w:pPr>
-        <w:ind w:left="3240" w:hanging="360"/>
-      </w:pPr>
-      <w:rPr>
-        <w:rFonts w:ascii="Courier New" w:hAnsi="Courier New" w:cs="Courier New" w:hint="default"/>
-      </w:rPr>
-    </w:lvl>
-    <w:lvl w:ilvl="5" w:tplc="04090005" w:tentative="1">
+    <w:lvl w:ilvl="3" w:tentative="1">
       <w:start w:val="1"/>
       <w:numFmt w:val="bullet"/>
       <w:lvlText w:val=""/>
       <w:lvlJc w:val="left"/>
       <w:pPr>
-        <w:ind w:left="3960" w:hanging="360"/>
+        <w:tabs>
+          <w:tab w:val="num" w:pos="2880"/>
+        </w:tabs>
+        <w:ind w:left="2880" w:hanging="360"/>
       </w:pPr>
       <w:rPr>
         <w:rFonts w:ascii="Wingdings" w:hAnsi="Wingdings" w:hint="default"/>
+        <w:sz w:val="20"/>
       </w:rPr>
     </w:lvl>
-    <w:lvl w:ilvl="6" w:tplc="04090001" w:tentative="1">
-      <w:start w:val="1"/>
-      <w:numFmt w:val="bullet"/>
-      <w:lvlText w:val=""/>
-      <w:lvlJc w:val="left"/>
-      <w:pPr>
-        <w:ind w:left="4680" w:hanging="360"/>
-      </w:pPr>
-      <w:rPr>
-        <w:rFonts w:ascii="Symbol" w:hAnsi="Symbol" w:hint="default"/>
-      </w:rPr>
-    </w:lvl>
-    <w:lvl w:ilvl="7" w:tplc="04090003" w:tentative="1">
-      <w:start w:val="1"/>
-      <w:numFmt w:val="bullet"/>
-      <w:lvlText w:val="o"/>
-      <w:lvlJc w:val="left"/>
-      <w:pPr>
-        <w:ind w:left="5400" w:hanging="360"/>
-      </w:pPr>
-      <w:rPr>
-        <w:rFonts w:ascii="Courier New" w:hAnsi="Courier New" w:cs="Courier New" w:hint="default"/>
-      </w:rPr>
-    </w:lvl>
-    <w:lvl w:ilvl="8" w:tplc="04090005" w:tentative="1">
+    <w:lvl w:ilvl="4" w:tentative="1">
       <w:start w:val="1"/>
       <w:numFmt w:val="bullet"/>
       <w:lvlText w:val=""/>
       <w:lvlJc w:val="left"/>
       <w:pPr>
-        <w:ind w:left="6120" w:hanging="360"/>
+        <w:tabs>
+          <w:tab w:val="num" w:pos="3600"/>
+        </w:tabs>
+        <w:ind w:left="3600" w:hanging="360"/>
       </w:pPr>
       <w:rPr>
         <w:rFonts w:ascii="Wingdings" w:hAnsi="Wingdings" w:hint="default"/>
+        <w:sz w:val="20"/>
+      </w:rPr>
+    </w:lvl>
+    <w:lvl w:ilvl="5" w:tentative="1">
+      <w:start w:val="1"/>
+      <w:numFmt w:val="bullet"/>
+      <w:lvlText w:val=""/>
+      <w:lvlJc w:val="left"/>
+      <w:pPr>
+        <w:tabs>
+          <w:tab w:val="num" w:pos="4320"/>
+        </w:tabs>
+        <w:ind w:left="4320" w:hanging="360"/>
+      </w:pPr>
+      <w:rPr>
+        <w:rFonts w:ascii="Wingdings" w:hAnsi="Wingdings" w:hint="default"/>
+        <w:sz w:val="20"/>
+      </w:rPr>
+    </w:lvl>
+    <w:lvl w:ilvl="6" w:tentative="1">
+      <w:start w:val="1"/>
+      <w:numFmt w:val="bullet"/>
+      <w:lvlText w:val=""/>
+      <w:lvlJc w:val="left"/>
+      <w:pPr>
+        <w:tabs>
+          <w:tab w:val="num" w:pos="5040"/>
+        </w:tabs>
+        <w:ind w:left="5040" w:hanging="360"/>
+      </w:pPr>
+      <w:rPr>
+        <w:rFonts w:ascii="Wingdings" w:hAnsi="Wingdings" w:hint="default"/>
+        <w:sz w:val="20"/>
+      </w:rPr>
+    </w:lvl>
+    <w:lvl w:ilvl="7" w:tentative="1">
+      <w:start w:val="1"/>
+      <w:numFmt w:val="bullet"/>
+      <w:lvlText w:val=""/>
+      <w:lvlJc w:val="left"/>
+      <w:pPr>
+        <w:tabs>
+          <w:tab w:val="num" w:pos="5760"/>
+        </w:tabs>
+        <w:ind w:left="5760" w:hanging="360"/>
+      </w:pPr>
+      <w:rPr>
+        <w:rFonts w:ascii="Wingdings" w:hAnsi="Wingdings" w:hint="default"/>
+        <w:sz w:val="20"/>
+      </w:rPr>
+    </w:lvl>
+    <w:lvl w:ilvl="8" w:tentative="1">
+      <w:start w:val="1"/>
+      <w:numFmt w:val="bullet"/>
+      <w:lvlText w:val=""/>
+      <w:lvlJc w:val="left"/>
+      <w:pPr>
+        <w:tabs>
+          <w:tab w:val="num" w:pos="6480"/>
+        </w:tabs>
+        <w:ind w:left="6480" w:hanging="360"/>
+      </w:pPr>
+      <w:rPr>
+        <w:rFonts w:ascii="Wingdings" w:hAnsi="Wingdings" w:hint="default"/>
+        <w:sz w:val="20"/>
       </w:rPr>
     </w:lvl>
   </w:abstractNum>
-  <w:abstractNum w:abstractNumId="25" w15:restartNumberingAfterBreak="0">
-    <w:nsid w:val="632D6FBA"/>
+  <w:abstractNum w:abstractNumId="26" w15:restartNumberingAfterBreak="0">
+    <w:nsid w:val="5D7E72F4"/>
     <w:multiLevelType w:val="multilevel"/>
     <w:tmpl w:val="364E971A"/>
     <w:lvl w:ilvl="0">
@@ -30418,41 +31755,41 @@
       </w:rPr>
     </w:lvl>
   </w:abstractNum>
-  <w:abstractNum w:abstractNumId="26" w15:restartNumberingAfterBreak="0">
-    <w:nsid w:val="64CD65C7"/>
+  <w:abstractNum w:abstractNumId="27" w15:restartNumberingAfterBreak="0">
+    <w:nsid w:val="628960A5"/>
     <w:multiLevelType w:val="hybridMultilevel"/>
-    <w:tmpl w:val="7A429F20"/>
+    <w:tmpl w:val="683A0DBA"/>
     <w:lvl w:ilvl="0" w:tplc="04090001">
       <w:start w:val="1"/>
       <w:numFmt w:val="bullet"/>
       <w:lvlText w:val=""/>
       <w:lvlJc w:val="left"/>
       <w:pPr>
-        <w:ind w:left="1440" w:hanging="360"/>
+        <w:ind w:left="360" w:hanging="360"/>
       </w:pPr>
       <w:rPr>
         <w:rFonts w:ascii="Symbol" w:hAnsi="Symbol" w:hint="default"/>
       </w:rPr>
     </w:lvl>
-    <w:lvl w:ilvl="1" w:tplc="04090003" w:tentative="1">
+    <w:lvl w:ilvl="1" w:tplc="04090003">
       <w:start w:val="1"/>
       <w:numFmt w:val="bullet"/>
       <w:lvlText w:val="o"/>
       <w:lvlJc w:val="left"/>
       <w:pPr>
-        <w:ind w:left="2160" w:hanging="360"/>
+        <w:ind w:left="1080" w:hanging="360"/>
       </w:pPr>
       <w:rPr>
         <w:rFonts w:ascii="Courier New" w:hAnsi="Courier New" w:cs="Courier New" w:hint="default"/>
       </w:rPr>
     </w:lvl>
-    <w:lvl w:ilvl="2" w:tplc="04090005" w:tentative="1">
+    <w:lvl w:ilvl="2" w:tplc="04090005">
       <w:start w:val="1"/>
       <w:numFmt w:val="bullet"/>
       <w:lvlText w:val=""/>
       <w:lvlJc w:val="left"/>
       <w:pPr>
-        <w:ind w:left="2880" w:hanging="360"/>
+        <w:ind w:left="1800" w:hanging="360"/>
       </w:pPr>
       <w:rPr>
         <w:rFonts w:ascii="Wingdings" w:hAnsi="Wingdings" w:hint="default"/>
@@ -30464,7 +31801,7 @@
       <w:lvlText w:val=""/>
       <w:lvlJc w:val="left"/>
       <w:pPr>
-        <w:ind w:left="3600" w:hanging="360"/>
+        <w:ind w:left="2520" w:hanging="360"/>
       </w:pPr>
       <w:rPr>
         <w:rFonts w:ascii="Symbol" w:hAnsi="Symbol" w:hint="default"/>
@@ -30476,7 +31813,7 @@
       <w:lvlText w:val="o"/>
       <w:lvlJc w:val="left"/>
       <w:pPr>
-        <w:ind w:left="4320" w:hanging="360"/>
+        <w:ind w:left="3240" w:hanging="360"/>
       </w:pPr>
       <w:rPr>
         <w:rFonts w:ascii="Courier New" w:hAnsi="Courier New" w:cs="Courier New" w:hint="default"/>
@@ -30488,7 +31825,7 @@
       <w:lvlText w:val=""/>
       <w:lvlJc w:val="left"/>
       <w:pPr>
-        <w:ind w:left="5040" w:hanging="360"/>
+        <w:ind w:left="3960" w:hanging="360"/>
       </w:pPr>
       <w:rPr>
         <w:rFonts w:ascii="Wingdings" w:hAnsi="Wingdings" w:hint="default"/>
@@ -30500,7 +31837,7 @@
       <w:lvlText w:val=""/>
       <w:lvlJc w:val="left"/>
       <w:pPr>
-        <w:ind w:left="5760" w:hanging="360"/>
+        <w:ind w:left="4680" w:hanging="360"/>
       </w:pPr>
       <w:rPr>
         <w:rFonts w:ascii="Symbol" w:hAnsi="Symbol" w:hint="default"/>
@@ -30512,7 +31849,7 @@
       <w:lvlText w:val="o"/>
       <w:lvlJc w:val="left"/>
       <w:pPr>
-        <w:ind w:left="6480" w:hanging="360"/>
+        <w:ind w:left="5400" w:hanging="360"/>
       </w:pPr>
       <w:rPr>
         <w:rFonts w:ascii="Courier New" w:hAnsi="Courier New" w:cs="Courier New" w:hint="default"/>
@@ -30524,15 +31861,15 @@
       <w:lvlText w:val=""/>
       <w:lvlJc w:val="left"/>
       <w:pPr>
-        <w:ind w:left="7200" w:hanging="360"/>
+        <w:ind w:left="6120" w:hanging="360"/>
       </w:pPr>
       <w:rPr>
         <w:rFonts w:ascii="Wingdings" w:hAnsi="Wingdings" w:hint="default"/>
       </w:rPr>
     </w:lvl>
   </w:abstractNum>
-  <w:abstractNum w:abstractNumId="27" w15:restartNumberingAfterBreak="0">
-    <w:nsid w:val="66190FE0"/>
+  <w:abstractNum w:abstractNumId="28" w15:restartNumberingAfterBreak="0">
+    <w:nsid w:val="632D6FBA"/>
     <w:multiLevelType w:val="multilevel"/>
     <w:tmpl w:val="364E971A"/>
     <w:lvl w:ilvl="0">
@@ -30680,8 +32017,121 @@
       </w:rPr>
     </w:lvl>
   </w:abstractNum>
-  <w:abstractNum w:abstractNumId="28" w15:restartNumberingAfterBreak="0">
-    <w:nsid w:val="6C623258"/>
+  <w:abstractNum w:abstractNumId="29" w15:restartNumberingAfterBreak="0">
+    <w:nsid w:val="64CD65C7"/>
+    <w:multiLevelType w:val="hybridMultilevel"/>
+    <w:tmpl w:val="7A429F20"/>
+    <w:lvl w:ilvl="0" w:tplc="04090001">
+      <w:start w:val="1"/>
+      <w:numFmt w:val="bullet"/>
+      <w:lvlText w:val=""/>
+      <w:lvlJc w:val="left"/>
+      <w:pPr>
+        <w:ind w:left="1440" w:hanging="360"/>
+      </w:pPr>
+      <w:rPr>
+        <w:rFonts w:ascii="Symbol" w:hAnsi="Symbol" w:hint="default"/>
+      </w:rPr>
+    </w:lvl>
+    <w:lvl w:ilvl="1" w:tplc="04090003" w:tentative="1">
+      <w:start w:val="1"/>
+      <w:numFmt w:val="bullet"/>
+      <w:lvlText w:val="o"/>
+      <w:lvlJc w:val="left"/>
+      <w:pPr>
+        <w:ind w:left="2160" w:hanging="360"/>
+      </w:pPr>
+      <w:rPr>
+        <w:rFonts w:ascii="Courier New" w:hAnsi="Courier New" w:cs="Courier New" w:hint="default"/>
+      </w:rPr>
+    </w:lvl>
+    <w:lvl w:ilvl="2" w:tplc="04090005" w:tentative="1">
+      <w:start w:val="1"/>
+      <w:numFmt w:val="bullet"/>
+      <w:lvlText w:val=""/>
+      <w:lvlJc w:val="left"/>
+      <w:pPr>
+        <w:ind w:left="2880" w:hanging="360"/>
+      </w:pPr>
+      <w:rPr>
+        <w:rFonts w:ascii="Wingdings" w:hAnsi="Wingdings" w:hint="default"/>
+      </w:rPr>
+    </w:lvl>
+    <w:lvl w:ilvl="3" w:tplc="04090001" w:tentative="1">
+      <w:start w:val="1"/>
+      <w:numFmt w:val="bullet"/>
+      <w:lvlText w:val=""/>
+      <w:lvlJc w:val="left"/>
+      <w:pPr>
+        <w:ind w:left="3600" w:hanging="360"/>
+      </w:pPr>
+      <w:rPr>
+        <w:rFonts w:ascii="Symbol" w:hAnsi="Symbol" w:hint="default"/>
+      </w:rPr>
+    </w:lvl>
+    <w:lvl w:ilvl="4" w:tplc="04090003" w:tentative="1">
+      <w:start w:val="1"/>
+      <w:numFmt w:val="bullet"/>
+      <w:lvlText w:val="o"/>
+      <w:lvlJc w:val="left"/>
+      <w:pPr>
+        <w:ind w:left="4320" w:hanging="360"/>
+      </w:pPr>
+      <w:rPr>
+        <w:rFonts w:ascii="Courier New" w:hAnsi="Courier New" w:cs="Courier New" w:hint="default"/>
+      </w:rPr>
+    </w:lvl>
+    <w:lvl w:ilvl="5" w:tplc="04090005" w:tentative="1">
+      <w:start w:val="1"/>
+      <w:numFmt w:val="bullet"/>
+      <w:lvlText w:val=""/>
+      <w:lvlJc w:val="left"/>
+      <w:pPr>
+        <w:ind w:left="5040" w:hanging="360"/>
+      </w:pPr>
+      <w:rPr>
+        <w:rFonts w:ascii="Wingdings" w:hAnsi="Wingdings" w:hint="default"/>
+      </w:rPr>
+    </w:lvl>
+    <w:lvl w:ilvl="6" w:tplc="04090001" w:tentative="1">
+      <w:start w:val="1"/>
+      <w:numFmt w:val="bullet"/>
+      <w:lvlText w:val=""/>
+      <w:lvlJc w:val="left"/>
+      <w:pPr>
+        <w:ind w:left="5760" w:hanging="360"/>
+      </w:pPr>
+      <w:rPr>
+        <w:rFonts w:ascii="Symbol" w:hAnsi="Symbol" w:hint="default"/>
+      </w:rPr>
+    </w:lvl>
+    <w:lvl w:ilvl="7" w:tplc="04090003" w:tentative="1">
+      <w:start w:val="1"/>
+      <w:numFmt w:val="bullet"/>
+      <w:lvlText w:val="o"/>
+      <w:lvlJc w:val="left"/>
+      <w:pPr>
+        <w:ind w:left="6480" w:hanging="360"/>
+      </w:pPr>
+      <w:rPr>
+        <w:rFonts w:ascii="Courier New" w:hAnsi="Courier New" w:cs="Courier New" w:hint="default"/>
+      </w:rPr>
+    </w:lvl>
+    <w:lvl w:ilvl="8" w:tplc="04090005" w:tentative="1">
+      <w:start w:val="1"/>
+      <w:numFmt w:val="bullet"/>
+      <w:lvlText w:val=""/>
+      <w:lvlJc w:val="left"/>
+      <w:pPr>
+        <w:ind w:left="7200" w:hanging="360"/>
+      </w:pPr>
+      <w:rPr>
+        <w:rFonts w:ascii="Wingdings" w:hAnsi="Wingdings" w:hint="default"/>
+      </w:rPr>
+    </w:lvl>
+  </w:abstractNum>
+  <w:abstractNum w:abstractNumId="30" w15:restartNumberingAfterBreak="0">
+    <w:nsid w:val="66190FE0"/>
     <w:multiLevelType w:val="multilevel"/>
     <w:tmpl w:val="364E971A"/>
     <w:lvl w:ilvl="0">
@@ -30829,10 +32279,10 @@
       </w:rPr>
     </w:lvl>
   </w:abstractNum>
-  <w:abstractNum w:abstractNumId="29" w15:restartNumberingAfterBreak="0">
-    <w:nsid w:val="6F960A57"/>
+  <w:abstractNum w:abstractNumId="31" w15:restartNumberingAfterBreak="0">
+    <w:nsid w:val="6C623258"/>
     <w:multiLevelType w:val="multilevel"/>
-    <w:tmpl w:val="A2042338"/>
+    <w:tmpl w:val="364E971A"/>
     <w:lvl w:ilvl="0">
       <w:start w:val="1"/>
       <w:numFmt w:val="bullet"/>
@@ -30978,10 +32428,10 @@
       </w:rPr>
     </w:lvl>
   </w:abstractNum>
-  <w:abstractNum w:abstractNumId="30" w15:restartNumberingAfterBreak="0">
-    <w:nsid w:val="71A7731A"/>
+  <w:abstractNum w:abstractNumId="32" w15:restartNumberingAfterBreak="0">
+    <w:nsid w:val="6F960A57"/>
     <w:multiLevelType w:val="multilevel"/>
-    <w:tmpl w:val="364E971A"/>
+    <w:tmpl w:val="A2042338"/>
     <w:lvl w:ilvl="0">
       <w:start w:val="1"/>
       <w:numFmt w:val="bullet"/>
@@ -31127,7 +32577,156 @@
       </w:rPr>
     </w:lvl>
   </w:abstractNum>
-  <w:abstractNum w:abstractNumId="31" w15:restartNumberingAfterBreak="0">
+  <w:abstractNum w:abstractNumId="33" w15:restartNumberingAfterBreak="0">
+    <w:nsid w:val="71A7731A"/>
+    <w:multiLevelType w:val="multilevel"/>
+    <w:tmpl w:val="364E971A"/>
+    <w:lvl w:ilvl="0">
+      <w:start w:val="1"/>
+      <w:numFmt w:val="bullet"/>
+      <w:lvlText w:val=""/>
+      <w:lvlJc w:val="left"/>
+      <w:pPr>
+        <w:tabs>
+          <w:tab w:val="num" w:pos="720"/>
+        </w:tabs>
+        <w:ind w:left="720" w:hanging="360"/>
+      </w:pPr>
+      <w:rPr>
+        <w:rFonts w:ascii="Symbol" w:hAnsi="Symbol" w:hint="default"/>
+        <w:sz w:val="20"/>
+      </w:rPr>
+    </w:lvl>
+    <w:lvl w:ilvl="1" w:tentative="1">
+      <w:start w:val="1"/>
+      <w:numFmt w:val="bullet"/>
+      <w:lvlText w:val="o"/>
+      <w:lvlJc w:val="left"/>
+      <w:pPr>
+        <w:tabs>
+          <w:tab w:val="num" w:pos="1440"/>
+        </w:tabs>
+        <w:ind w:left="1440" w:hanging="360"/>
+      </w:pPr>
+      <w:rPr>
+        <w:rFonts w:ascii="Courier New" w:hAnsi="Courier New" w:hint="default"/>
+        <w:sz w:val="20"/>
+      </w:rPr>
+    </w:lvl>
+    <w:lvl w:ilvl="2" w:tentative="1">
+      <w:start w:val="1"/>
+      <w:numFmt w:val="bullet"/>
+      <w:lvlText w:val=""/>
+      <w:lvlJc w:val="left"/>
+      <w:pPr>
+        <w:tabs>
+          <w:tab w:val="num" w:pos="2160"/>
+        </w:tabs>
+        <w:ind w:left="2160" w:hanging="360"/>
+      </w:pPr>
+      <w:rPr>
+        <w:rFonts w:ascii="Wingdings" w:hAnsi="Wingdings" w:hint="default"/>
+        <w:sz w:val="20"/>
+      </w:rPr>
+    </w:lvl>
+    <w:lvl w:ilvl="3" w:tentative="1">
+      <w:start w:val="1"/>
+      <w:numFmt w:val="bullet"/>
+      <w:lvlText w:val=""/>
+      <w:lvlJc w:val="left"/>
+      <w:pPr>
+        <w:tabs>
+          <w:tab w:val="num" w:pos="2880"/>
+        </w:tabs>
+        <w:ind w:left="2880" w:hanging="360"/>
+      </w:pPr>
+      <w:rPr>
+        <w:rFonts w:ascii="Wingdings" w:hAnsi="Wingdings" w:hint="default"/>
+        <w:sz w:val="20"/>
+      </w:rPr>
+    </w:lvl>
+    <w:lvl w:ilvl="4" w:tentative="1">
+      <w:start w:val="1"/>
+      <w:numFmt w:val="bullet"/>
+      <w:lvlText w:val=""/>
+      <w:lvlJc w:val="left"/>
+      <w:pPr>
+        <w:tabs>
+          <w:tab w:val="num" w:pos="3600"/>
+        </w:tabs>
+        <w:ind w:left="3600" w:hanging="360"/>
+      </w:pPr>
+      <w:rPr>
+        <w:rFonts w:ascii="Wingdings" w:hAnsi="Wingdings" w:hint="default"/>
+        <w:sz w:val="20"/>
+      </w:rPr>
+    </w:lvl>
+    <w:lvl w:ilvl="5" w:tentative="1">
+      <w:start w:val="1"/>
+      <w:numFmt w:val="bullet"/>
+      <w:lvlText w:val=""/>
+      <w:lvlJc w:val="left"/>
+      <w:pPr>
+        <w:tabs>
+          <w:tab w:val="num" w:pos="4320"/>
+        </w:tabs>
+        <w:ind w:left="4320" w:hanging="360"/>
+      </w:pPr>
+      <w:rPr>
+        <w:rFonts w:ascii="Wingdings" w:hAnsi="Wingdings" w:hint="default"/>
+        <w:sz w:val="20"/>
+      </w:rPr>
+    </w:lvl>
+    <w:lvl w:ilvl="6" w:tentative="1">
+      <w:start w:val="1"/>
+      <w:numFmt w:val="bullet"/>
+      <w:lvlText w:val=""/>
+      <w:lvlJc w:val="left"/>
+      <w:pPr>
+        <w:tabs>
+          <w:tab w:val="num" w:pos="5040"/>
+        </w:tabs>
+        <w:ind w:left="5040" w:hanging="360"/>
+      </w:pPr>
+      <w:rPr>
+        <w:rFonts w:ascii="Wingdings" w:hAnsi="Wingdings" w:hint="default"/>
+        <w:sz w:val="20"/>
+      </w:rPr>
+    </w:lvl>
+    <w:lvl w:ilvl="7" w:tentative="1">
+      <w:start w:val="1"/>
+      <w:numFmt w:val="bullet"/>
+      <w:lvlText w:val=""/>
+      <w:lvlJc w:val="left"/>
+      <w:pPr>
+        <w:tabs>
+          <w:tab w:val="num" w:pos="5760"/>
+        </w:tabs>
+        <w:ind w:left="5760" w:hanging="360"/>
+      </w:pPr>
+      <w:rPr>
+        <w:rFonts w:ascii="Wingdings" w:hAnsi="Wingdings" w:hint="default"/>
+        <w:sz w:val="20"/>
+      </w:rPr>
+    </w:lvl>
+    <w:lvl w:ilvl="8" w:tentative="1">
+      <w:start w:val="1"/>
+      <w:numFmt w:val="bullet"/>
+      <w:lvlText w:val=""/>
+      <w:lvlJc w:val="left"/>
+      <w:pPr>
+        <w:tabs>
+          <w:tab w:val="num" w:pos="6480"/>
+        </w:tabs>
+        <w:ind w:left="6480" w:hanging="360"/>
+      </w:pPr>
+      <w:rPr>
+        <w:rFonts w:ascii="Wingdings" w:hAnsi="Wingdings" w:hint="default"/>
+        <w:sz w:val="20"/>
+      </w:rPr>
+    </w:lvl>
+  </w:abstractNum>
+  <w:abstractNum w:abstractNumId="34" w15:restartNumberingAfterBreak="0">
     <w:nsid w:val="7A9C0F0F"/>
     <w:multiLevelType w:val="hybridMultilevel"/>
     <w:tmpl w:val="A44C69A0"/>
@@ -31240,7 +32839,7 @@
       </w:rPr>
     </w:lvl>
   </w:abstractNum>
-  <w:abstractNum w:abstractNumId="32" w15:restartNumberingAfterBreak="0">
+  <w:abstractNum w:abstractNumId="35" w15:restartNumberingAfterBreak="0">
     <w:nsid w:val="7CCE439B"/>
     <w:multiLevelType w:val="multilevel"/>
     <w:tmpl w:val="364E971A"/>
@@ -31389,110 +32988,119 @@
       </w:rPr>
     </w:lvl>
   </w:abstractNum>
-  <w:num w:numId="1" w16cid:durableId="191110616">
+  <w:num w:numId="1">
     <w:abstractNumId w:val="13"/>
   </w:num>
-  <w:num w:numId="2" w16cid:durableId="1647784439">
+  <w:num w:numId="2">
     <w:abstractNumId w:val="3"/>
   </w:num>
-  <w:num w:numId="3" w16cid:durableId="1145469256">
+  <w:num w:numId="3">
+    <w:abstractNumId w:val="22"/>
+  </w:num>
+  <w:num w:numId="4">
+    <w:abstractNumId w:val="5"/>
+  </w:num>
+  <w:num w:numId="5">
+    <w:abstractNumId w:val="25"/>
+  </w:num>
+  <w:num w:numId="6">
+    <w:abstractNumId w:val="18"/>
+  </w:num>
+  <w:num w:numId="7">
+    <w:abstractNumId w:val="16"/>
+  </w:num>
+  <w:num w:numId="8">
+    <w:abstractNumId w:val="21"/>
+  </w:num>
+  <w:num w:numId="9">
+    <w:abstractNumId w:val="6"/>
+  </w:num>
+  <w:num w:numId="10">
+    <w:abstractNumId w:val="32"/>
+  </w:num>
+  <w:num w:numId="11">
+    <w:abstractNumId w:val="2"/>
+  </w:num>
+  <w:num w:numId="12">
+    <w:abstractNumId w:val="0"/>
+  </w:num>
+  <w:num w:numId="13">
+    <w:abstractNumId w:val="26"/>
+  </w:num>
+  <w:num w:numId="14">
+    <w:abstractNumId w:val="27"/>
+  </w:num>
+  <w:num w:numId="15">
+    <w:abstractNumId w:val="28"/>
+  </w:num>
+  <w:num w:numId="16">
+    <w:abstractNumId w:val="33"/>
+  </w:num>
+  <w:num w:numId="17">
+    <w:abstractNumId w:val="31"/>
+  </w:num>
+  <w:num w:numId="18">
+    <w:abstractNumId w:val="30"/>
+  </w:num>
+  <w:num w:numId="19">
+    <w:abstractNumId w:val="12"/>
+  </w:num>
+  <w:num w:numId="20">
+    <w:abstractNumId w:val="11"/>
+  </w:num>
+  <w:num w:numId="21">
+    <w:abstractNumId w:val="35"/>
+  </w:num>
+  <w:num w:numId="22">
+    <w:abstractNumId w:val="7"/>
+  </w:num>
+  <w:num w:numId="23">
+    <w:abstractNumId w:val="10"/>
+  </w:num>
+  <w:num w:numId="24">
+    <w:abstractNumId w:val="4"/>
+  </w:num>
+  <w:num w:numId="25">
     <w:abstractNumId w:val="20"/>
   </w:num>
-  <w:num w:numId="4" w16cid:durableId="88432284">
-    <w:abstractNumId w:val="5"/>
+  <w:num w:numId="26">
+    <w:abstractNumId w:val="29"/>
   </w:num>
-  <w:num w:numId="5" w16cid:durableId="1496457602">
-    <w:abstractNumId w:val="22"/>
+  <w:num w:numId="27">
+    <w:abstractNumId w:val="34"/>
   </w:num>
-  <w:num w:numId="6" w16cid:durableId="1861815664">
-    <w:abstractNumId w:val="16"/>
+  <w:num w:numId="28">
+    <w:abstractNumId w:val="23"/>
   </w:num>
-  <w:num w:numId="7" w16cid:durableId="515196186">
+  <w:num w:numId="29">
+    <w:abstractNumId w:val="17"/>
+  </w:num>
+  <w:num w:numId="30">
+    <w:abstractNumId w:val="8"/>
+  </w:num>
+  <w:num w:numId="31">
+    <w:abstractNumId w:val="1"/>
+  </w:num>
+  <w:num w:numId="32">
+    <w:abstractNumId w:val="9"/>
+  </w:num>
+  <w:num w:numId="33">
+    <w:abstractNumId w:val="19"/>
+  </w:num>
+  <w:num w:numId="34">
     <w:abstractNumId w:val="14"/>
   </w:num>
-  <w:num w:numId="8" w16cid:durableId="711853514">
-    <w:abstractNumId w:val="19"/>
-  </w:num>
-  <w:num w:numId="9" w16cid:durableId="302926694">
-    <w:abstractNumId w:val="6"/>
-  </w:num>
-  <w:num w:numId="10" w16cid:durableId="551580408">
-    <w:abstractNumId w:val="29"/>
-  </w:num>
-  <w:num w:numId="11" w16cid:durableId="441345027">
-    <w:abstractNumId w:val="2"/>
-  </w:num>
-  <w:num w:numId="12" w16cid:durableId="2049984763">
-    <w:abstractNumId w:val="0"/>
-  </w:num>
-  <w:num w:numId="13" w16cid:durableId="1247692982">
-    <w:abstractNumId w:val="23"/>
-  </w:num>
-  <w:num w:numId="14" w16cid:durableId="126435339">
-    <w:abstractNumId w:val="24"/>
-  </w:num>
-  <w:num w:numId="15" w16cid:durableId="227501699">
-    <w:abstractNumId w:val="25"/>
-  </w:num>
-  <w:num w:numId="16" w16cid:durableId="571891041">
-    <w:abstractNumId w:val="30"/>
-  </w:num>
-  <w:num w:numId="17" w16cid:durableId="365109569">
-    <w:abstractNumId w:val="28"/>
-  </w:num>
-  <w:num w:numId="18" w16cid:durableId="1701396970">
-    <w:abstractNumId w:val="27"/>
-  </w:num>
-  <w:num w:numId="19" w16cid:durableId="1503545505">
-    <w:abstractNumId w:val="12"/>
-  </w:num>
-  <w:num w:numId="20" w16cid:durableId="764956490">
-    <w:abstractNumId w:val="11"/>
-  </w:num>
-  <w:num w:numId="21" w16cid:durableId="25105955">
-    <w:abstractNumId w:val="32"/>
-  </w:num>
-  <w:num w:numId="22" w16cid:durableId="968584141">
-    <w:abstractNumId w:val="7"/>
-  </w:num>
-  <w:num w:numId="23" w16cid:durableId="504249009">
-    <w:abstractNumId w:val="10"/>
-  </w:num>
-  <w:num w:numId="24" w16cid:durableId="1313874670">
-    <w:abstractNumId w:val="4"/>
-  </w:num>
-  <w:num w:numId="25" w16cid:durableId="406726922">
-    <w:abstractNumId w:val="18"/>
-  </w:num>
-  <w:num w:numId="26" w16cid:durableId="2088649518">
-    <w:abstractNumId w:val="26"/>
-  </w:num>
-  <w:num w:numId="27" w16cid:durableId="138615032">
-    <w:abstractNumId w:val="31"/>
-  </w:num>
-  <w:num w:numId="28" w16cid:durableId="737946673">
-    <w:abstractNumId w:val="21"/>
-  </w:num>
-  <w:num w:numId="29" w16cid:durableId="1743600181">
+  <w:num w:numId="35">
     <w:abstractNumId w:val="15"/>
   </w:num>
-  <w:num w:numId="30" w16cid:durableId="936983512">
-    <w:abstractNumId w:val="8"/>
-  </w:num>
-  <w:num w:numId="31" w16cid:durableId="544679991">
-    <w:abstractNumId w:val="1"/>
-  </w:num>
-  <w:num w:numId="32" w16cid:durableId="183523094">
-    <w:abstractNumId w:val="9"/>
-  </w:num>
-  <w:num w:numId="33" w16cid:durableId="235750372">
-    <w:abstractNumId w:val="17"/>
+  <w:num w:numId="36">
+    <w:abstractNumId w:val="24"/>
   </w:num>
 </w:numbering>
 </file>
 
 <file path=word/styles.xml><?xml version="1.0" encoding="utf-8"?>
-<w:styles xmlns:mc="http://schemas.openxmlformats.org/markup-compatibility/2006" xmlns:r="http://schemas.openxmlformats.org/officeDocument/2006/relationships" xmlns:w="http://schemas.openxmlformats.org/wordprocessingml/2006/main" xmlns:w14="http://schemas.microsoft.com/office/word/2010/wordml" xmlns:w15="http://schemas.microsoft.com/office/word/2012/wordml" xmlns:w16cex="http://schemas.microsoft.com/office/word/2018/wordml/cex" xmlns:w16cid="http://schemas.microsoft.com/office/word/2016/wordml/cid" xmlns:w16="http://schemas.microsoft.com/office/word/2018/wordml" xmlns:w16du="http://schemas.microsoft.com/office/word/2023/wordml/word16du" xmlns:w16sdtdh="http://schemas.microsoft.com/office/word/2020/wordml/sdtdatahash" xmlns:w16se="http://schemas.microsoft.com/office/word/2015/wordml/symex" mc:Ignorable="w14 w15 w16se w16cid w16 w16cex w16sdtdh w16du">
+<w:styles xmlns:mc="http://schemas.openxmlformats.org/markup-compatibility/2006" xmlns:r="http://schemas.openxmlformats.org/officeDocument/2006/relationships" xmlns:w="http://schemas.openxmlformats.org/wordprocessingml/2006/main" xmlns:w14="http://schemas.microsoft.com/office/word/2010/wordml" xmlns:w15="http://schemas.microsoft.com/office/word/2012/wordml" xmlns:w16cid="http://schemas.microsoft.com/office/word/2016/wordml/cid" xmlns:w16se="http://schemas.microsoft.com/office/word/2015/wordml/symex" mc:Ignorable="w14 w15 w16se w16cid">
   <w:docDefaults>
     <w:rPrDefault>
       <w:rPr>
@@ -31511,7 +33119,7 @@
       </w:pPr>
     </w:pPrDefault>
   </w:docDefaults>
-  <w:latentStyles w:defLockedState="0" w:defUIPriority="99" w:defSemiHidden="0" w:defUnhideWhenUsed="0" w:defQFormat="0" w:count="376">
+  <w:latentStyles w:defLockedState="0" w:defUIPriority="99" w:defSemiHidden="0" w:defUnhideWhenUsed="0" w:defQFormat="0" w:count="375">
     <w:lsdException w:name="Normal" w:uiPriority="0" w:qFormat="1"/>
     <w:lsdException w:name="heading 1" w:uiPriority="9" w:qFormat="1"/>
     <w:lsdException w:name="heading 2" w:semiHidden="1" w:uiPriority="9" w:unhideWhenUsed="1" w:qFormat="1"/>
@@ -31887,7 +33495,6 @@
     <w:lsdException w:name="Smart Hyperlink" w:semiHidden="1" w:unhideWhenUsed="1"/>
     <w:lsdException w:name="Hashtag" w:semiHidden="1" w:unhideWhenUsed="1"/>
     <w:lsdException w:name="Unresolved Mention" w:semiHidden="1" w:unhideWhenUsed="1"/>
-    <w:lsdException w:name="Smart Link" w:semiHidden="1" w:unhideWhenUsed="1"/>
   </w:latentStyles>
   <w:style w:type="paragraph" w:default="1" w:styleId="a">
     <w:name w:val="Normal"/>
@@ -32884,7 +34491,7 @@
 </file>
 
 <file path=customXml/itemProps1.xml><?xml version="1.0" encoding="utf-8"?>
-<ds:datastoreItem xmlns:ds="http://schemas.openxmlformats.org/officeDocument/2006/customXml" ds:itemID="{7E167CBE-609E-4A20-AE55-023D779A6F1A}">
+<ds:datastoreItem xmlns:ds="http://schemas.openxmlformats.org/officeDocument/2006/customXml" ds:itemID="{D584DB28-8DA0-424E-A20F-C5689C303215}">
   <ds:schemaRefs>
     <ds:schemaRef ds:uri="http://schemas.openxmlformats.org/officeDocument/2006/bibliography"/>
   </ds:schemaRefs>

</xml_diff>

<commit_message>
Added explation about buttons
</commit_message>
<xml_diff>
--- a/ספר פרוייקט שלי וסשה.docx
+++ b/ספר פרוייקט שלי וסשה.docx
@@ -495,7 +495,6 @@
           <w:rFonts w:ascii="Tahoma" w:hAnsi="Tahoma" w:cs="Tahoma"/>
           <w:rtl/>
         </w:rPr>
-        <w:lastRenderedPageBreak/>
         <w:t>הפרויקט מתאים לשימושים תעשייתיים, חינוכיים ומשחקיים, והוא מציע גישה גמישה המאפשרת התאמה לתחומים מגוונים, תוך שמירה על עלויות נמוכות ופשטות יחסית ביישום.</w:t>
       </w:r>
     </w:p>
@@ -2798,7 +2797,7 @@
               </wp:inline>
             </w:drawing>
           </mc:Choice>
-          <mc:Fallback xmlns:w16sdtdh="http://schemas.microsoft.com/office/word/2020/wordml/sdtdatahash" xmlns:w16du="http://schemas.microsoft.com/office/word/2023/wordml/word16du" xmlns:w16="http://schemas.microsoft.com/office/word/2018/wordml" xmlns:w16cex="http://schemas.microsoft.com/office/word/2018/wordml/cex" xmlns:oel="http://schemas.microsoft.com/office/2019/extlst">
+          <mc:Fallback xmlns:oel="http://schemas.microsoft.com/office/2019/extlst" xmlns:w16cex="http://schemas.microsoft.com/office/word/2018/wordml/cex" xmlns:w16="http://schemas.microsoft.com/office/word/2018/wordml" xmlns:w16du="http://schemas.microsoft.com/office/word/2023/wordml/word16du" xmlns:w16sdtdh="http://schemas.microsoft.com/office/word/2020/wordml/sdtdatahash">
             <w:pict>
               <v:roundrect w14:anchorId="17ED87AC" id="מלבן מעוגל 6" o:spid="_x0000_s1026" style="width:9.45pt;height:9.45pt;visibility:visible;mso-wrap-style:square;mso-left-percent:-10001;mso-top-percent:-10001;mso-position-horizontal:absolute;mso-position-horizontal-relative:char;mso-position-vertical:absolute;mso-position-vertical-relative:line;mso-left-percent:-10001;mso-top-percent:-10001;v-text-anchor:top" arcsize="10923f" o:gfxdata="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" fillcolor="#a8d08d">
                 <o:lock v:ext="edit" aspectratio="t"/>
@@ -2920,7 +2919,7 @@
               </wp:inline>
             </w:drawing>
           </mc:Choice>
-          <mc:Fallback xmlns:w16sdtdh="http://schemas.microsoft.com/office/word/2020/wordml/sdtdatahash" xmlns:w16du="http://schemas.microsoft.com/office/word/2023/wordml/word16du" xmlns:w16="http://schemas.microsoft.com/office/word/2018/wordml" xmlns:w16cex="http://schemas.microsoft.com/office/word/2018/wordml/cex" xmlns:oel="http://schemas.microsoft.com/office/2019/extlst">
+          <mc:Fallback xmlns:oel="http://schemas.microsoft.com/office/2019/extlst" xmlns:w16cex="http://schemas.microsoft.com/office/word/2018/wordml/cex" xmlns:w16="http://schemas.microsoft.com/office/word/2018/wordml" xmlns:w16du="http://schemas.microsoft.com/office/word/2023/wordml/word16du" xmlns:w16sdtdh="http://schemas.microsoft.com/office/word/2020/wordml/sdtdatahash">
             <w:pict>
               <v:roundrect w14:anchorId="075500E5" id="מלבן מעוגל 5" o:spid="_x0000_s1026" style="width:9.45pt;height:9.45pt;visibility:visible;mso-wrap-style:square;mso-left-percent:-10001;mso-top-percent:-10001;mso-position-horizontal:absolute;mso-position-horizontal-relative:char;mso-position-vertical:absolute;mso-position-vertical-relative:line;mso-left-percent:-10001;mso-top-percent:-10001;v-text-anchor:top" arcsize="10923f" o:gfxdata="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">
                 <o:lock v:ext="edit" aspectratio="t"/>
@@ -3392,7 +3391,15 @@
           <w:rFonts w:ascii="Tahoma" w:hAnsi="Tahoma" w:cs="Tahoma"/>
           <w:rtl/>
         </w:rPr>
-        <w:t>ושומרת על מרחק בטוח ממנה</w:t>
+        <w:t xml:space="preserve">ושומרת על מרחק בטוח </w:t>
+      </w:r>
+      <w:r>
+        <w:rPr>
+          <w:rFonts w:ascii="Tahoma" w:hAnsi="Tahoma" w:cs="Tahoma"/>
+          <w:rtl/>
+        </w:rPr>
+        <w:lastRenderedPageBreak/>
+        <w:t>ממנה</w:t>
       </w:r>
       <w:r>
         <w:rPr>
@@ -3527,7 +3534,6 @@
           <w:rFonts w:ascii="Tahoma" w:hAnsi="Tahoma" w:cs="Tahoma"/>
           <w:rtl/>
         </w:rPr>
-        <w:lastRenderedPageBreak/>
         <w:t>3.</w:t>
       </w:r>
       <w:r>
@@ -4243,7 +4249,15 @@
           <w:rFonts w:ascii="Tahoma" w:hAnsi="Tahoma" w:cs="Tahoma"/>
           <w:rtl/>
         </w:rPr>
-        <w:t>: שם פרטי: _________ שם משפחה: ____________ מס' זהות: _______________</w:t>
+        <w:t xml:space="preserve">: שם פרטי: _________ שם משפחה: ____________ מס' זהות: </w:t>
+      </w:r>
+      <w:r>
+        <w:rPr>
+          <w:rFonts w:ascii="Tahoma" w:hAnsi="Tahoma" w:cs="Tahoma"/>
+          <w:rtl/>
+        </w:rPr>
+        <w:lastRenderedPageBreak/>
+        <w:t>_______________</w:t>
       </w:r>
       <w:r>
         <w:rPr>
@@ -4312,13 +4326,6 @@
           <w:rtl/>
         </w:rPr>
         <w:br/>
-      </w:r>
-      <w:r>
-        <w:rPr>
-          <w:rFonts w:ascii="Tahoma" w:hAnsi="Tahoma" w:cs="Tahoma"/>
-          <w:rtl/>
-        </w:rPr>
-        <w:lastRenderedPageBreak/>
         <w:t>3. ___________________________________________________________________</w:t>
       </w:r>
       <w:r>
@@ -4886,6 +4893,13 @@
           <w:rtl/>
         </w:rPr>
         <w:br/>
+      </w:r>
+      <w:r>
+        <w:rPr>
+          <w:rFonts w:ascii="Tahoma" w:hAnsi="Tahoma" w:cs="Tahoma"/>
+          <w:rtl/>
+        </w:rPr>
+        <w:lastRenderedPageBreak/>
         <w:t xml:space="preserve">      תאריך: _</w:t>
       </w:r>
       <w:r>
@@ -5068,7 +5082,6 @@
           <w:bCs/>
           <w:rtl/>
         </w:rPr>
-        <w:lastRenderedPageBreak/>
         <w:t>ביבליוגרפיה</w:t>
       </w:r>
       <w:r>
@@ -5603,7 +5616,7 @@
               </wp:inline>
             </w:drawing>
           </mc:Choice>
-          <mc:Fallback xmlns:w16sdtdh="http://schemas.microsoft.com/office/word/2020/wordml/sdtdatahash" xmlns:w16du="http://schemas.microsoft.com/office/word/2023/wordml/word16du" xmlns:w16="http://schemas.microsoft.com/office/word/2018/wordml" xmlns:w16cex="http://schemas.microsoft.com/office/word/2018/wordml/cex" xmlns:oel="http://schemas.microsoft.com/office/2019/extlst">
+          <mc:Fallback xmlns:oel="http://schemas.microsoft.com/office/2019/extlst" xmlns:w16cex="http://schemas.microsoft.com/office/word/2018/wordml/cex" xmlns:w16="http://schemas.microsoft.com/office/word/2018/wordml" xmlns:w16du="http://schemas.microsoft.com/office/word/2023/wordml/word16du" xmlns:w16sdtdh="http://schemas.microsoft.com/office/word/2020/wordml/sdtdatahash">
             <w:pict>
               <v:roundrect w14:anchorId="1D42CF48" id="מלבן מעוגל 4" o:spid="_x0000_s1026" style="width:9.45pt;height:9.45pt;visibility:visible;mso-wrap-style:square;mso-left-percent:-10001;mso-top-percent:-10001;mso-position-horizontal:absolute;mso-position-horizontal-relative:char;mso-position-vertical:absolute;mso-position-vertical-relative:line;mso-left-percent:-10001;mso-top-percent:-10001;v-text-anchor:top" arcsize="10923f" o:gfxdata="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">
                 <o:lock v:ext="edit" aspectratio="t"/>
@@ -5691,7 +5704,7 @@
               </wp:inline>
             </w:drawing>
           </mc:Choice>
-          <mc:Fallback xmlns:w16sdtdh="http://schemas.microsoft.com/office/word/2020/wordml/sdtdatahash" xmlns:w16du="http://schemas.microsoft.com/office/word/2023/wordml/word16du" xmlns:w16="http://schemas.microsoft.com/office/word/2018/wordml" xmlns:w16cex="http://schemas.microsoft.com/office/word/2018/wordml/cex" xmlns:oel="http://schemas.microsoft.com/office/2019/extlst">
+          <mc:Fallback xmlns:oel="http://schemas.microsoft.com/office/2019/extlst" xmlns:w16cex="http://schemas.microsoft.com/office/word/2018/wordml/cex" xmlns:w16="http://schemas.microsoft.com/office/word/2018/wordml" xmlns:w16du="http://schemas.microsoft.com/office/word/2023/wordml/word16du" xmlns:w16sdtdh="http://schemas.microsoft.com/office/word/2020/wordml/sdtdatahash">
             <w:pict>
               <v:roundrect w14:anchorId="070688B8" id="מלבן מעוגל 3" o:spid="_x0000_s1026" style="width:9.45pt;height:9.45pt;visibility:visible;mso-wrap-style:square;mso-left-percent:-10001;mso-top-percent:-10001;mso-position-horizontal:absolute;mso-position-horizontal-relative:char;mso-position-vertical:absolute;mso-position-vertical-relative:line;mso-left-percent:-10001;mso-top-percent:-10001;v-text-anchor:top" arcsize="10923f" o:gfxdata="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">
                 <o:lock v:ext="edit" aspectratio="t"/>
@@ -5707,7 +5720,15 @@
           <w:rFonts w:ascii="Tahoma" w:hAnsi="Tahoma" w:cs="Tahoma"/>
           <w:rtl/>
         </w:rPr>
-        <w:t xml:space="preserve"> הבקשה מאושרת. יש להכניס בה את השינויים שלהלן: ______________________________</w:t>
+        <w:t xml:space="preserve"> הבקשה מאושרת. יש להכניס בה את השינויים שלהלן: </w:t>
+      </w:r>
+      <w:r>
+        <w:rPr>
+          <w:rFonts w:ascii="Tahoma" w:hAnsi="Tahoma" w:cs="Tahoma"/>
+          <w:rtl/>
+        </w:rPr>
+        <w:lastRenderedPageBreak/>
+        <w:t>______________________________</w:t>
       </w:r>
       <w:r>
         <w:rPr>
@@ -5825,7 +5846,7 @@
               </wp:inline>
             </w:drawing>
           </mc:Choice>
-          <mc:Fallback xmlns:w16sdtdh="http://schemas.microsoft.com/office/word/2020/wordml/sdtdatahash" xmlns:w16du="http://schemas.microsoft.com/office/word/2023/wordml/word16du" xmlns:w16="http://schemas.microsoft.com/office/word/2018/wordml" xmlns:w16cex="http://schemas.microsoft.com/office/word/2018/wordml/cex" xmlns:oel="http://schemas.microsoft.com/office/2019/extlst">
+          <mc:Fallback xmlns:oel="http://schemas.microsoft.com/office/2019/extlst" xmlns:w16cex="http://schemas.microsoft.com/office/word/2018/wordml/cex" xmlns:w16="http://schemas.microsoft.com/office/word/2018/wordml" xmlns:w16du="http://schemas.microsoft.com/office/word/2023/wordml/word16du" xmlns:w16sdtdh="http://schemas.microsoft.com/office/word/2020/wordml/sdtdatahash">
             <w:pict>
               <v:roundrect w14:anchorId="10070B32" id="מלבן מעוגל 2" o:spid="_x0000_s1026" style="width:9.45pt;height:9.45pt;visibility:visible;mso-wrap-style:square;mso-left-percent:-10001;mso-top-percent:-10001;mso-position-horizontal:absolute;mso-position-horizontal-relative:char;mso-position-vertical:absolute;mso-position-vertical-relative:line;mso-left-percent:-10001;mso-top-percent:-10001;v-text-anchor:top" arcsize="10923f" o:gfxdata="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">
                 <o:lock v:ext="edit" aspectratio="t"/>
@@ -5969,7 +5990,7 @@
               </wp:inline>
             </w:drawing>
           </mc:Choice>
-          <mc:Fallback xmlns:w16sdtdh="http://schemas.microsoft.com/office/word/2020/wordml/sdtdatahash" xmlns:w16du="http://schemas.microsoft.com/office/word/2023/wordml/word16du" xmlns:w16="http://schemas.microsoft.com/office/word/2018/wordml" xmlns:w16cex="http://schemas.microsoft.com/office/word/2018/wordml/cex" xmlns:oel="http://schemas.microsoft.com/office/2019/extlst">
+          <mc:Fallback xmlns:oel="http://schemas.microsoft.com/office/2019/extlst" xmlns:w16cex="http://schemas.microsoft.com/office/word/2018/wordml/cex" xmlns:w16="http://schemas.microsoft.com/office/word/2018/wordml" xmlns:w16du="http://schemas.microsoft.com/office/word/2023/wordml/word16du" xmlns:w16sdtdh="http://schemas.microsoft.com/office/word/2020/wordml/sdtdatahash">
             <w:pict>
               <v:roundrect w14:anchorId="4AE4CB54" id="מלבן מעוגל 1" o:spid="_x0000_s1026" style="width:9.45pt;height:9.45pt;visibility:visible;mso-wrap-style:square;mso-left-percent:-10001;mso-top-percent:-10001;mso-position-horizontal:absolute;mso-position-horizontal-relative:char;mso-position-vertical:absolute;mso-position-vertical-relative:line;mso-left-percent:-10001;mso-top-percent:-10001;v-text-anchor:top" arcsize="10923f" o:gfxdata="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">
                 <o:lock v:ext="edit" aspectratio="t"/>
@@ -5985,15 +6006,7 @@
           <w:rFonts w:ascii="Tahoma" w:hAnsi="Tahoma" w:cs="Tahoma"/>
           <w:rtl/>
         </w:rPr>
-        <w:t xml:space="preserve"> הבקשה אינה מאושרת מהנימוק(ים) שלהלן: </w:t>
-      </w:r>
-      <w:r>
-        <w:rPr>
-          <w:rFonts w:ascii="Tahoma" w:hAnsi="Tahoma" w:cs="Tahoma"/>
-          <w:rtl/>
-        </w:rPr>
-        <w:lastRenderedPageBreak/>
-        <w:t>____________________________________</w:t>
+        <w:t xml:space="preserve"> הבקשה אינה מאושרת מהנימוק(ים) שלהלן: ____________________________________</w:t>
       </w:r>
       <w:r>
         <w:rPr>
@@ -6540,15 +6553,7 @@
           <w:rFonts w:ascii="Tahoma" w:hAnsi="Tahoma" w:cs="Tahoma"/>
           <w:rtl/>
         </w:rPr>
-        <w:t xml:space="preserve">, תכנון אלגוריתמים חכמים, ואינטגרציה של מערכות חומרה ותוכנה מתקדמות. המערכת שפותחה כאן היא דוגמה </w:t>
-      </w:r>
-      <w:r>
-        <w:rPr>
-          <w:rFonts w:ascii="Tahoma" w:hAnsi="Tahoma" w:cs="Tahoma"/>
-          <w:rtl/>
-        </w:rPr>
-        <w:lastRenderedPageBreak/>
-        <w:t>לפיתוח טכנולוגי המשלב חשיבה יצירתית עם כלים הנדסיים וטכנולוגיים מתקדמים, תוך התאמה למגמות עתידיות בעולם הרכב והמערכות האוטונומיות.</w:t>
+        <w:t>, תכנון אלגוריתמים חכמים, ואינטגרציה של מערכות חומרה ותוכנה מתקדמות. המערכת שפותחה כאן היא דוגמה לפיתוח טכנולוגי המשלב חשיבה יצירתית עם כלים הנדסיים וטכנולוגיים מתקדמים, תוך התאמה למגמות עתידיות בעולם הרכב והמערכות האוטונומיות.</w:t>
       </w:r>
       <w:r>
         <w:rPr>
@@ -6681,7 +6686,6 @@
         <w:rPr>
           <w:rtl/>
         </w:rPr>
-        <w:lastRenderedPageBreak/>
         <w:t xml:space="preserve">מכונית </w:t>
       </w:r>
       <w:r>
@@ -7434,6 +7438,7 @@
         <w:rPr>
           <w:rFonts w:ascii="Tahoma" w:hAnsi="Tahoma" w:cs="Tahoma"/>
         </w:rPr>
+        <w:lastRenderedPageBreak/>
         <w:t>LDR</w:t>
       </w:r>
       <w:r>
@@ -7500,7 +7505,6 @@
           <w:rFonts w:ascii="Tahoma" w:hAnsi="Tahoma" w:cs="Tahoma"/>
           <w:rtl/>
         </w:rPr>
-        <w:lastRenderedPageBreak/>
         <w:t xml:space="preserve">מסך </w:t>
       </w:r>
       <w:r>
@@ -9073,6 +9077,7 @@
           <w:rFonts w:ascii="Tahoma" w:hAnsi="Tahoma" w:cs="Tahoma"/>
           <w:rtl/>
         </w:rPr>
+        <w:lastRenderedPageBreak/>
         <w:t>מחובר ל-</w:t>
       </w:r>
       <w:r>
@@ -9127,7 +9132,6 @@
           <w:rFonts w:ascii="Tahoma" w:hAnsi="Tahoma" w:cs="Tahoma"/>
           <w:rtl/>
         </w:rPr>
-        <w:lastRenderedPageBreak/>
         <w:br w:type="page"/>
       </w:r>
     </w:p>
@@ -9850,6 +9854,7 @@
           <w:sz w:val="24"/>
           <w:szCs w:val="24"/>
         </w:rPr>
+        <w:lastRenderedPageBreak/>
         <w:t>PMU (Power Management Unit</w:t>
       </w:r>
       <w:proofErr w:type="gramStart"/>
@@ -9910,7 +9915,6 @@
           <w:sz w:val="24"/>
           <w:szCs w:val="24"/>
         </w:rPr>
-        <w:lastRenderedPageBreak/>
         <w:t xml:space="preserve">ULP </w:t>
       </w:r>
       <w:proofErr w:type="gramStart"/>
@@ -11334,6 +11338,7 @@
           <w:sz w:val="24"/>
           <w:szCs w:val="24"/>
         </w:rPr>
+        <w:lastRenderedPageBreak/>
         <w:t>Timers</w:t>
       </w:r>
       <w:r>
@@ -11553,7 +11558,6 @@
           <w:sz w:val="24"/>
           <w:szCs w:val="24"/>
         </w:rPr>
-        <w:lastRenderedPageBreak/>
         <w:t>RSA (</w:t>
       </w:r>
       <w:proofErr w:type="spellStart"/>
@@ -12070,6 +12074,7 @@
           <w:szCs w:val="24"/>
           <w:rtl/>
         </w:rPr>
+        <w:lastRenderedPageBreak/>
         <w:t>בזכות התכונות האלחוטיות המתקדמות שלו, ה-</w:t>
       </w:r>
       <w:r>
@@ -12234,7 +12239,6 @@
           <w:szCs w:val="24"/>
           <w:rtl/>
         </w:rPr>
-        <w:lastRenderedPageBreak/>
         <w:t>ה-</w:t>
       </w:r>
       <w:r>
@@ -12818,6 +12822,7 @@
           <w:szCs w:val="28"/>
           <w:rtl/>
         </w:rPr>
+        <w:lastRenderedPageBreak/>
         <w:t>זיכרון</w:t>
       </w:r>
     </w:p>
@@ -13023,7 +13028,6 @@
           <w:szCs w:val="24"/>
           <w:rtl/>
         </w:rPr>
-        <w:lastRenderedPageBreak/>
         <w:t>מתח כניסה (</w:t>
       </w:r>
       <w:r>
@@ -13790,6 +13794,7 @@
           <w:szCs w:val="24"/>
           <w:rtl/>
         </w:rPr>
+        <w:lastRenderedPageBreak/>
         <w:t>ה</w:t>
       </w:r>
       <w:r>
@@ -14023,7 +14028,6 @@
           <w:szCs w:val="28"/>
           <w:rtl/>
         </w:rPr>
-        <w:lastRenderedPageBreak/>
         <w:t>יכולת עיבוד חזקה</w:t>
       </w:r>
       <w:r>
@@ -14587,6 +14591,7 @@
           <w:szCs w:val="24"/>
           <w:rtl/>
         </w:rPr>
+        <w:lastRenderedPageBreak/>
         <w:t>ל״חכמים</w:t>
       </w:r>
       <w:proofErr w:type="spellEnd"/>
@@ -14843,17 +14848,7 @@
           <w:szCs w:val="24"/>
           <w:rtl/>
         </w:rPr>
-        <w:t xml:space="preserve"> חדשניות מבטיח אמינות ומוכנות לטכנולוגיות מתקדמות, מה שהופך אותו לבחירה מועדפת לפיתוח </w:t>
-      </w:r>
-      <w:r>
-        <w:rPr>
-          <w:rFonts w:ascii="Tahoma" w:hAnsi="Tahoma" w:cs="Tahoma"/>
-          <w:sz w:val="24"/>
-          <w:szCs w:val="24"/>
-          <w:rtl/>
-        </w:rPr>
-        <w:lastRenderedPageBreak/>
-        <w:t>פרויקטים חכמים. היכולת להשתמש בניסיון ובידע המצטבר של הקהילה מקלה על פיתוח פתרונות מותאמים אישית וביצוע אינטגרציה עם מערכות קיימות.</w:t>
+        <w:t xml:space="preserve"> חדשניות מבטיח אמינות ומוכנות לטכנולוגיות מתקדמות, מה שהופך אותו לבחירה מועדפת לפיתוח פרויקטים חכמים. היכולת להשתמש בניסיון ובידע המצטבר של הקהילה מקלה על פיתוח פתרונות מותאמים אישית וביצוע אינטגרציה עם מערכות קיימות.</w:t>
       </w:r>
     </w:p>
     <w:p>
@@ -15127,51 +15122,41 @@
         </w:rPr>
         <w:t xml:space="preserve"> </w:t>
       </w:r>
-      <w:bookmarkStart w:id="17" w:name="_GoBack"/>
-      <w:bookmarkEnd w:id="17"/>
-    </w:p>
-    <w:p>
-      <w:pPr>
+    </w:p>
+    <w:p>
+      <w:pPr>
+        <w:rPr>
+          <w:rFonts w:cs="Calibri"/>
+          <w:sz w:val="24"/>
+          <w:szCs w:val="24"/>
+          <w:rtl/>
+        </w:rPr>
+      </w:pPr>
+      <w:r>
+        <w:rPr>
+          <w:rFonts w:cs="Calibri"/>
+          <w:sz w:val="24"/>
+          <w:szCs w:val="24"/>
+          <w:rtl/>
+        </w:rPr>
+        <w:t xml:space="preserve">נורת </w:t>
+      </w:r>
+      <w:r>
         <w:rPr>
           <w:rFonts w:cs="Calibri" w:hint="cs"/>
           <w:sz w:val="24"/>
           <w:szCs w:val="24"/>
           <w:rtl/>
         </w:rPr>
-      </w:pPr>
+        <w:t>ה</w:t>
+      </w:r>
       <w:r>
         <w:rPr>
           <w:rFonts w:cs="Calibri"/>
           <w:sz w:val="24"/>
           <w:szCs w:val="24"/>
-          <w:rtl/>
-        </w:rPr>
-        <w:t xml:space="preserve">נורת </w:t>
-      </w:r>
-      <w:r>
-        <w:rPr>
-          <w:rFonts w:cs="Calibri" w:hint="cs"/>
-          <w:sz w:val="24"/>
-          <w:szCs w:val="24"/>
-          <w:rtl/>
-        </w:rPr>
-        <w:t>ה</w:t>
-      </w:r>
-      <w:r>
-        <w:rPr>
-          <w:rFonts w:cs="Calibri"/>
-          <w:sz w:val="24"/>
-          <w:szCs w:val="24"/>
-        </w:rPr>
-        <w:t xml:space="preserve"> </w:t>
-      </w:r>
-      <w:r>
-        <w:rPr>
-          <w:rFonts w:cs="Calibri"/>
-          <w:sz w:val="24"/>
-          <w:szCs w:val="24"/>
-        </w:rPr>
-        <w:t>RGB LED</w:t>
+        </w:rPr>
+        <w:t xml:space="preserve"> RGB LED</w:t>
       </w:r>
       <w:r>
         <w:rPr>
@@ -16029,8 +16014,17 @@
       <w:pPr>
         <w:rPr>
           <w:rFonts w:cs="Calibri"/>
-          <w:sz w:val="24"/>
-          <w:szCs w:val="24"/>
+          <w:b/>
+          <w:bCs/>
+          <w:sz w:val="24"/>
+          <w:szCs w:val="24"/>
+          <w:rtl/>
+        </w:rPr>
+      </w:pPr>
+    </w:p>
+    <w:p>
+      <w:pPr>
+        <w:rPr>
           <w:rtl/>
         </w:rPr>
       </w:pPr>
@@ -16087,13 +16081,32 @@
           <w:szCs w:val="24"/>
           <w:rtl/>
         </w:rPr>
-        <w:t>תאורת אווירה, תצוגות דינמיות ופרויקטים אלקטרוניים יצירתיים. השימוש בשליטת</w:t>
+        <w:t>תאורת אווירה, תצוגות דינמיות ופרויקטים אלקטרוניים</w:t>
+      </w:r>
+      <w:r>
+        <w:rPr>
+          <w:rFonts w:cs="Calibri" w:hint="cs"/>
+          <w:sz w:val="24"/>
+          <w:szCs w:val="24"/>
+          <w:rtl/>
+        </w:rPr>
+        <w:t xml:space="preserve"> </w:t>
       </w:r>
       <w:r>
         <w:rPr>
           <w:rFonts w:cs="Calibri"/>
           <w:sz w:val="24"/>
           <w:szCs w:val="24"/>
+          <w:rtl/>
+        </w:rPr>
+        <w:lastRenderedPageBreak/>
+        <w:t>יצירתיים. השימוש בשליטת</w:t>
+      </w:r>
+      <w:r>
+        <w:rPr>
+          <w:rFonts w:cs="Calibri"/>
+          <w:sz w:val="24"/>
+          <w:szCs w:val="24"/>
         </w:rPr>
         <w:t xml:space="preserve"> PWM </w:t>
       </w:r>
@@ -16114,6 +16127,13 @@
         </w:rPr>
         <w:t>.</w:t>
       </w:r>
+    </w:p>
+    <w:p>
+      <w:pPr>
+        <w:rPr>
+          <w:rtl/>
+        </w:rPr>
+      </w:pPr>
       <w:r>
         <w:rPr>
           <w:rtl/>
@@ -16126,7 +16146,575 @@
         <w:pStyle w:val="1"/>
         <w:rPr>
           <w:rtl/>
-          <w:lang/>
+        </w:rPr>
+      </w:pPr>
+      <w:r>
+        <w:rPr>
+          <w:rFonts w:hint="cs"/>
+          <w:rtl/>
+        </w:rPr>
+        <w:lastRenderedPageBreak/>
+        <w:t>לחצנים</w:t>
+      </w:r>
+    </w:p>
+    <w:p>
+      <w:pPr>
+        <w:rPr>
+          <w:rFonts w:cstheme="minorHAnsi"/>
+          <w:sz w:val="24"/>
+          <w:szCs w:val="24"/>
+          <w:rtl/>
+        </w:rPr>
+      </w:pPr>
+      <w:r>
+        <w:rPr>
+          <w:rFonts w:cstheme="minorHAnsi"/>
+          <w:sz w:val="24"/>
+          <w:szCs w:val="24"/>
+          <w:rtl/>
+        </w:rPr>
+        <w:t>בקר ה-</w:t>
+      </w:r>
+      <w:r>
+        <w:rPr>
+          <w:rFonts w:cstheme="minorHAnsi"/>
+          <w:sz w:val="24"/>
+          <w:szCs w:val="24"/>
+        </w:rPr>
+        <w:t>ESP32</w:t>
+      </w:r>
+      <w:r>
+        <w:rPr>
+          <w:rFonts w:cstheme="minorHAnsi"/>
+          <w:sz w:val="24"/>
+          <w:szCs w:val="24"/>
+          <w:rtl/>
+        </w:rPr>
+        <w:t xml:space="preserve"> כולל מספר רב של הדקים (</w:t>
+      </w:r>
+      <w:r>
+        <w:rPr>
+          <w:rFonts w:cstheme="minorHAnsi"/>
+          <w:sz w:val="24"/>
+          <w:szCs w:val="24"/>
+        </w:rPr>
+        <w:t>GPIO</w:t>
+      </w:r>
+      <w:r>
+        <w:rPr>
+          <w:rFonts w:cstheme="minorHAnsi"/>
+          <w:sz w:val="24"/>
+          <w:szCs w:val="24"/>
+          <w:rtl/>
+        </w:rPr>
+        <w:t>) שניתן להגדיר כקלט (</w:t>
+      </w:r>
+      <w:r>
+        <w:rPr>
+          <w:rFonts w:cstheme="minorHAnsi"/>
+          <w:sz w:val="24"/>
+          <w:szCs w:val="24"/>
+        </w:rPr>
+        <w:t>Input</w:t>
+      </w:r>
+      <w:r>
+        <w:rPr>
+          <w:rFonts w:cstheme="minorHAnsi"/>
+          <w:sz w:val="24"/>
+          <w:szCs w:val="24"/>
+          <w:rtl/>
+        </w:rPr>
+        <w:t>) או פלט (</w:t>
+      </w:r>
+      <w:r>
+        <w:rPr>
+          <w:rFonts w:cstheme="minorHAnsi"/>
+          <w:sz w:val="24"/>
+          <w:szCs w:val="24"/>
+        </w:rPr>
+        <w:t>Output</w:t>
+      </w:r>
+      <w:r>
+        <w:rPr>
+          <w:rFonts w:cstheme="minorHAnsi"/>
+          <w:sz w:val="24"/>
+          <w:szCs w:val="24"/>
+          <w:rtl/>
+        </w:rPr>
+        <w:t xml:space="preserve">). לחצנים מחוברים להדקים 19 ו-23 משמשים </w:t>
+      </w:r>
+      <w:proofErr w:type="spellStart"/>
+      <w:r>
+        <w:rPr>
+          <w:rFonts w:cstheme="minorHAnsi"/>
+          <w:sz w:val="24"/>
+          <w:szCs w:val="24"/>
+          <w:rtl/>
+        </w:rPr>
+        <w:t>כקלטים</w:t>
+      </w:r>
+      <w:proofErr w:type="spellEnd"/>
+      <w:r>
+        <w:rPr>
+          <w:rFonts w:cstheme="minorHAnsi"/>
+          <w:sz w:val="24"/>
+          <w:szCs w:val="24"/>
+          <w:rtl/>
+        </w:rPr>
+        <w:t xml:space="preserve"> דיגיטליים, ומטרתם לקרוא את מצב הלחצן—האם הוא לחוץ (</w:t>
+      </w:r>
+      <w:r>
+        <w:rPr>
+          <w:rFonts w:cstheme="minorHAnsi"/>
+          <w:sz w:val="24"/>
+          <w:szCs w:val="24"/>
+        </w:rPr>
+        <w:t>pressed</w:t>
+      </w:r>
+      <w:r>
+        <w:rPr>
+          <w:rFonts w:cstheme="minorHAnsi"/>
+          <w:sz w:val="24"/>
+          <w:szCs w:val="24"/>
+          <w:rtl/>
+        </w:rPr>
+        <w:t>) או משוחרר (</w:t>
+      </w:r>
+      <w:r>
+        <w:rPr>
+          <w:rFonts w:cstheme="minorHAnsi"/>
+          <w:sz w:val="24"/>
+          <w:szCs w:val="24"/>
+        </w:rPr>
+        <w:t>released</w:t>
+      </w:r>
+      <w:r>
+        <w:rPr>
+          <w:rFonts w:cstheme="minorHAnsi"/>
+          <w:sz w:val="24"/>
+          <w:szCs w:val="24"/>
+          <w:rtl/>
+        </w:rPr>
+        <w:t>).</w:t>
+      </w:r>
+      <w:r>
+        <w:rPr>
+          <w:rFonts w:cs="Arial" w:hint="cs"/>
+          <w:rtl/>
+        </w:rPr>
+        <w:t xml:space="preserve"> </w:t>
+      </w:r>
+    </w:p>
+    <w:p>
+      <w:pPr>
+        <w:rPr>
+          <w:rFonts w:cstheme="minorHAnsi"/>
+          <w:b/>
+          <w:bCs/>
+          <w:sz w:val="24"/>
+          <w:szCs w:val="24"/>
+          <w:rtl/>
+        </w:rPr>
+      </w:pPr>
+    </w:p>
+    <w:p>
+      <w:pPr>
+        <w:rPr>
+          <w:rFonts w:cstheme="minorHAnsi"/>
+          <w:b/>
+          <w:bCs/>
+          <w:sz w:val="24"/>
+          <w:szCs w:val="24"/>
+          <w:rtl/>
+        </w:rPr>
+      </w:pPr>
+      <w:r>
+        <w:rPr>
+          <w:rFonts w:cstheme="minorHAnsi"/>
+          <w:b/>
+          <w:bCs/>
+          <w:sz w:val="24"/>
+          <w:szCs w:val="24"/>
+          <w:rtl/>
+        </w:rPr>
+        <w:t>עקרון פעולה של הלחצנים:</w:t>
+      </w:r>
+    </w:p>
+    <w:p>
+      <w:pPr>
+        <w:rPr>
+          <w:rFonts w:cstheme="minorHAnsi"/>
+          <w:sz w:val="24"/>
+          <w:szCs w:val="24"/>
+          <w:rtl/>
+        </w:rPr>
+      </w:pPr>
+      <w:r>
+        <w:rPr>
+          <w:rFonts w:cstheme="minorHAnsi"/>
+          <w:sz w:val="24"/>
+          <w:szCs w:val="24"/>
+          <w:rtl/>
+        </w:rPr>
+        <w:t xml:space="preserve">לחצן הוא מתג פשוט שיוצר חיבור (סגירה - </w:t>
+      </w:r>
+      <w:r>
+        <w:rPr>
+          <w:rFonts w:cstheme="minorHAnsi"/>
+          <w:sz w:val="24"/>
+          <w:szCs w:val="24"/>
+        </w:rPr>
+        <w:t>LOW</w:t>
+      </w:r>
+      <w:r>
+        <w:rPr>
+          <w:rFonts w:cstheme="minorHAnsi"/>
+          <w:sz w:val="24"/>
+          <w:szCs w:val="24"/>
+          <w:rtl/>
+        </w:rPr>
+        <w:t xml:space="preserve">) או ניתוק (פתיחה - </w:t>
+      </w:r>
+      <w:r>
+        <w:rPr>
+          <w:rFonts w:cstheme="minorHAnsi"/>
+          <w:sz w:val="24"/>
+          <w:szCs w:val="24"/>
+        </w:rPr>
+        <w:t>HIGH</w:t>
+      </w:r>
+      <w:r>
+        <w:rPr>
+          <w:rFonts w:cstheme="minorHAnsi"/>
+          <w:sz w:val="24"/>
+          <w:szCs w:val="24"/>
+          <w:rtl/>
+        </w:rPr>
+        <w:t>) של מעגל חשמלי.</w:t>
+      </w:r>
+    </w:p>
+    <w:p>
+      <w:pPr>
+        <w:rPr>
+          <w:rFonts w:cstheme="minorHAnsi"/>
+          <w:sz w:val="24"/>
+          <w:szCs w:val="24"/>
+          <w:rtl/>
+        </w:rPr>
+      </w:pPr>
+      <w:r>
+        <w:rPr>
+          <w:rFonts w:cstheme="minorHAnsi"/>
+          <w:sz w:val="24"/>
+          <w:szCs w:val="24"/>
+          <w:rtl/>
+        </w:rPr>
+        <w:t>כאשר הלחצן נלחץ, ה</w:t>
+      </w:r>
+      <w:r>
+        <w:rPr>
+          <w:rFonts w:cstheme="minorHAnsi" w:hint="cs"/>
+          <w:sz w:val="24"/>
+          <w:szCs w:val="24"/>
+          <w:rtl/>
+        </w:rPr>
+        <w:t>הדק</w:t>
+      </w:r>
+      <w:r>
+        <w:rPr>
+          <w:rFonts w:cstheme="minorHAnsi"/>
+          <w:sz w:val="24"/>
+          <w:szCs w:val="24"/>
+          <w:rtl/>
+        </w:rPr>
+        <w:t xml:space="preserve"> המחובר אליו נקרא כמצב </w:t>
+      </w:r>
+      <w:r>
+        <w:rPr>
+          <w:rFonts w:cstheme="minorHAnsi"/>
+          <w:sz w:val="24"/>
+          <w:szCs w:val="24"/>
+        </w:rPr>
+        <w:t>LOW</w:t>
+      </w:r>
+      <w:r>
+        <w:rPr>
+          <w:rFonts w:cstheme="minorHAnsi" w:hint="cs"/>
+          <w:sz w:val="24"/>
+          <w:szCs w:val="24"/>
+          <w:rtl/>
+        </w:rPr>
+        <w:t xml:space="preserve">, </w:t>
+      </w:r>
+      <w:r>
+        <w:rPr>
+          <w:rFonts w:cstheme="minorHAnsi"/>
+          <w:sz w:val="24"/>
+          <w:szCs w:val="24"/>
+          <w:rtl/>
+        </w:rPr>
+        <w:t xml:space="preserve">כאשר הלחצן משוחרר, </w:t>
+      </w:r>
+      <w:r>
+        <w:rPr>
+          <w:rFonts w:cstheme="minorHAnsi" w:hint="cs"/>
+          <w:sz w:val="24"/>
+          <w:szCs w:val="24"/>
+          <w:rtl/>
+        </w:rPr>
+        <w:t>ההדק</w:t>
+      </w:r>
+      <w:r>
+        <w:rPr>
+          <w:rFonts w:cstheme="minorHAnsi"/>
+          <w:sz w:val="24"/>
+          <w:szCs w:val="24"/>
+          <w:rtl/>
+        </w:rPr>
+        <w:t xml:space="preserve"> נקרא כמצב </w:t>
+      </w:r>
+      <w:r>
+        <w:rPr>
+          <w:rFonts w:cstheme="minorHAnsi"/>
+          <w:sz w:val="24"/>
+          <w:szCs w:val="24"/>
+        </w:rPr>
+        <w:t>HIGH</w:t>
+      </w:r>
+      <w:r>
+        <w:rPr>
+          <w:rFonts w:cstheme="minorHAnsi"/>
+          <w:sz w:val="24"/>
+          <w:szCs w:val="24"/>
+          <w:rtl/>
+        </w:rPr>
+        <w:t xml:space="preserve"> אם הופעלה נגד פנימי </w:t>
+      </w:r>
+      <w:r>
+        <w:rPr>
+          <w:rFonts w:cstheme="minorHAnsi"/>
+          <w:sz w:val="24"/>
+          <w:szCs w:val="24"/>
+        </w:rPr>
+        <w:t>Pull-up</w:t>
+      </w:r>
+      <w:r>
+        <w:rPr>
+          <w:rFonts w:cstheme="minorHAnsi"/>
+          <w:sz w:val="24"/>
+          <w:szCs w:val="24"/>
+          <w:rtl/>
+        </w:rPr>
+        <w:t xml:space="preserve"> (התנגדות פנימית שמחזיקה את המתח גבוה כאשר אין לחיצה)</w:t>
+      </w:r>
+      <w:r>
+        <w:rPr>
+          <w:rFonts w:cstheme="minorHAnsi" w:hint="cs"/>
+          <w:sz w:val="24"/>
+          <w:szCs w:val="24"/>
+          <w:rtl/>
+        </w:rPr>
+        <w:t xml:space="preserve">. </w:t>
+      </w:r>
+    </w:p>
+    <w:p>
+      <w:pPr>
+        <w:rPr>
+          <w:rFonts w:cs="Arial"/>
+          <w:rtl/>
+        </w:rPr>
+      </w:pPr>
+    </w:p>
+    <w:p>
+      <w:pPr>
+        <w:rPr>
+          <w:rFonts w:cs="Arial"/>
+          <w:rtl/>
+        </w:rPr>
+      </w:pPr>
+      <w:r>
+        <w:rPr>
+          <w:rFonts w:cs="Arial"/>
+          <w:b/>
+          <w:bCs/>
+          <w:rtl/>
+        </w:rPr>
+        <w:t xml:space="preserve">תכונות טכניות של </w:t>
+      </w:r>
+      <w:r>
+        <w:rPr>
+          <w:b/>
+          <w:bCs/>
+        </w:rPr>
+        <w:t>GPIO 19</w:t>
+      </w:r>
+      <w:r>
+        <w:rPr>
+          <w:rFonts w:cs="Arial"/>
+          <w:b/>
+          <w:bCs/>
+          <w:rtl/>
+        </w:rPr>
+        <w:t xml:space="preserve"> ו-</w:t>
+      </w:r>
+      <w:r>
+        <w:rPr>
+          <w:b/>
+          <w:bCs/>
+        </w:rPr>
+        <w:t>GPIO 23</w:t>
+      </w:r>
+      <w:r>
+        <w:rPr>
+          <w:rFonts w:cs="Arial" w:hint="cs"/>
+          <w:b/>
+          <w:bCs/>
+          <w:rtl/>
+        </w:rPr>
+        <w:t xml:space="preserve"> אליהם מחוברים הלחצנים בפרויקט שלנו</w:t>
+      </w:r>
+      <w:r>
+        <w:rPr>
+          <w:rFonts w:cs="Arial"/>
+          <w:rtl/>
+        </w:rPr>
+        <w:t xml:space="preserve"> </w:t>
+      </w:r>
+    </w:p>
+    <w:p>
+      <w:pPr>
+        <w:rPr>
+          <w:b/>
+          <w:bCs/>
+          <w:rtl/>
+        </w:rPr>
+      </w:pPr>
+      <w:r>
+        <w:rPr>
+          <w:rFonts w:cs="Arial"/>
+          <w:rtl/>
+        </w:rPr>
+        <w:t>נתמך כקלט דיגיטלי (</w:t>
+      </w:r>
+      <w:r>
+        <w:t>Input</w:t>
+      </w:r>
+      <w:r>
+        <w:rPr>
+          <w:rFonts w:cs="Arial"/>
+          <w:rtl/>
+        </w:rPr>
+        <w:t>) וכפלט דיגיטלי (</w:t>
+      </w:r>
+      <w:r>
+        <w:t>Output</w:t>
+      </w:r>
+      <w:r>
+        <w:rPr>
+          <w:rFonts w:cs="Arial"/>
+          <w:rtl/>
+        </w:rPr>
+        <w:t>).</w:t>
+      </w:r>
+    </w:p>
+    <w:p>
+      <w:pPr>
+        <w:rPr>
+          <w:rtl/>
+        </w:rPr>
+      </w:pPr>
+      <w:r>
+        <w:rPr>
+          <w:rFonts w:cs="Arial"/>
+          <w:rtl/>
+        </w:rPr>
+        <w:t>תומך ב-</w:t>
+      </w:r>
+      <w:r>
+        <w:t>PWM</w:t>
+      </w:r>
+      <w:r>
+        <w:rPr>
+          <w:rFonts w:cs="Arial"/>
+          <w:rtl/>
+        </w:rPr>
+        <w:t xml:space="preserve"> לשליטה בעוצמות אות.</w:t>
+      </w:r>
+    </w:p>
+    <w:p>
+      <w:pPr>
+        <w:rPr>
+          <w:rtl/>
+        </w:rPr>
+      </w:pPr>
+      <w:r>
+        <w:rPr>
+          <w:rFonts w:cs="Arial"/>
+          <w:rtl/>
+        </w:rPr>
+        <w:t>תומך ב-</w:t>
+      </w:r>
+      <w:r>
+        <w:t>Interrupts</w:t>
+      </w:r>
+      <w:r>
+        <w:rPr>
+          <w:rFonts w:cs="Arial"/>
+          <w:rtl/>
+        </w:rPr>
+        <w:t xml:space="preserve"> (פסיקות) כדי לזהות שינויים במצב הלחצן במהירות.</w:t>
+      </w:r>
+    </w:p>
+    <w:p>
+      <w:pPr>
+        <w:rPr>
+          <w:rtl/>
+        </w:rPr>
+      </w:pPr>
+      <w:r>
+        <w:rPr>
+          <w:rFonts w:cs="Arial"/>
+          <w:rtl/>
+        </w:rPr>
+        <w:t>בעל התנגדות פנימית (</w:t>
+      </w:r>
+      <w:r>
+        <w:t>Pull-up/Pull-</w:t>
+      </w:r>
+      <w:bookmarkStart w:id="17" w:name="_GoBack"/>
+      <w:bookmarkEnd w:id="17"/>
+      <w:r>
+        <w:t>down</w:t>
+      </w:r>
+      <w:r>
+        <w:rPr>
+          <w:rFonts w:cs="Arial"/>
+          <w:rtl/>
+        </w:rPr>
+        <w:t>) ניתנת להגדרה.</w:t>
+      </w:r>
+    </w:p>
+    <w:p>
+      <w:pPr>
+        <w:rPr>
+          <w:rFonts w:cstheme="minorHAnsi" w:hint="cs"/>
+          <w:sz w:val="24"/>
+          <w:szCs w:val="24"/>
+          <w:rtl/>
+        </w:rPr>
+      </w:pPr>
+      <w:r>
+        <w:rPr>
+          <w:rtl/>
+        </w:rPr>
+        <w:br w:type="page"/>
+      </w:r>
+    </w:p>
+    <w:p>
+      <w:pPr>
+        <w:pStyle w:val="1"/>
+        <w:rPr>
+          <w:rtl/>
         </w:rPr>
       </w:pPr>
       <w:r>
@@ -16152,9 +16740,6 @@
         <w:t xml:space="preserve"> </w:t>
       </w:r>
       <w:r>
-        <w:rPr>
-          <w:lang/>
-        </w:rPr>
         <w:t>Arduino IDE</w:t>
       </w:r>
     </w:p>
@@ -16162,215 +16747,188 @@
       <w:pPr>
         <w:rPr>
           <w:rtl/>
-          <w:lang/>
-        </w:rPr>
-      </w:pPr>
-    </w:p>
-    <w:p>
-      <w:pPr>
-        <w:rPr>
-          <w:rtl/>
-          <w:lang/>
-        </w:rPr>
-      </w:pPr>
-    </w:p>
-    <w:p>
-      <w:pPr>
-        <w:rPr>
-          <w:rtl/>
-          <w:lang/>
-        </w:rPr>
-      </w:pPr>
-    </w:p>
-    <w:p>
-      <w:pPr>
-        <w:rPr>
-          <w:rtl/>
-          <w:lang/>
-        </w:rPr>
-      </w:pPr>
-    </w:p>
-    <w:p>
-      <w:pPr>
-        <w:rPr>
-          <w:rtl/>
-          <w:lang/>
-        </w:rPr>
-      </w:pPr>
-    </w:p>
-    <w:p>
-      <w:pPr>
-        <w:rPr>
-          <w:rtl/>
-          <w:lang/>
-        </w:rPr>
-      </w:pPr>
-    </w:p>
-    <w:p>
-      <w:pPr>
-        <w:rPr>
-          <w:rtl/>
-          <w:lang/>
-        </w:rPr>
-      </w:pPr>
-    </w:p>
-    <w:p>
-      <w:pPr>
-        <w:rPr>
-          <w:rtl/>
-          <w:lang/>
-        </w:rPr>
-      </w:pPr>
-    </w:p>
-    <w:p>
-      <w:pPr>
-        <w:rPr>
-          <w:rtl/>
-          <w:lang/>
-        </w:rPr>
-      </w:pPr>
-    </w:p>
-    <w:p>
-      <w:pPr>
-        <w:rPr>
-          <w:rtl/>
-          <w:lang/>
-        </w:rPr>
-      </w:pPr>
-    </w:p>
-    <w:p>
-      <w:pPr>
-        <w:rPr>
-          <w:rtl/>
-          <w:lang/>
-        </w:rPr>
-      </w:pPr>
-    </w:p>
-    <w:p>
-      <w:pPr>
-        <w:rPr>
-          <w:rtl/>
-          <w:lang/>
-        </w:rPr>
-      </w:pPr>
-    </w:p>
-    <w:p>
-      <w:pPr>
-        <w:rPr>
-          <w:rtl/>
-          <w:lang/>
-        </w:rPr>
-      </w:pPr>
-    </w:p>
-    <w:p>
-      <w:pPr>
-        <w:rPr>
-          <w:rtl/>
-          <w:lang/>
-        </w:rPr>
-      </w:pPr>
-    </w:p>
-    <w:p>
-      <w:pPr>
-        <w:rPr>
-          <w:rtl/>
-          <w:lang/>
-        </w:rPr>
-      </w:pPr>
-    </w:p>
-    <w:p>
-      <w:pPr>
-        <w:rPr>
-          <w:rtl/>
-          <w:lang/>
-        </w:rPr>
-      </w:pPr>
-    </w:p>
-    <w:p>
-      <w:pPr>
-        <w:rPr>
-          <w:rtl/>
-          <w:lang/>
-        </w:rPr>
-      </w:pPr>
-    </w:p>
-    <w:p>
-      <w:pPr>
-        <w:rPr>
-          <w:rtl/>
-          <w:lang/>
-        </w:rPr>
-      </w:pPr>
-    </w:p>
-    <w:p>
-      <w:pPr>
-        <w:rPr>
-          <w:rtl/>
-          <w:lang/>
-        </w:rPr>
-      </w:pPr>
-    </w:p>
-    <w:p>
-      <w:pPr>
-        <w:rPr>
-          <w:rtl/>
-          <w:lang/>
-        </w:rPr>
-      </w:pPr>
-    </w:p>
-    <w:p>
-      <w:pPr>
-        <w:rPr>
-          <w:rtl/>
-          <w:lang/>
-        </w:rPr>
-      </w:pPr>
-    </w:p>
-    <w:p>
-      <w:pPr>
-        <w:rPr>
-          <w:rtl/>
-          <w:lang/>
-        </w:rPr>
-      </w:pPr>
-    </w:p>
-    <w:p>
-      <w:pPr>
-        <w:rPr>
-          <w:rtl/>
-          <w:lang/>
-        </w:rPr>
-      </w:pPr>
-    </w:p>
-    <w:p>
-      <w:pPr>
-        <w:rPr>
-          <w:rtl/>
-          <w:lang/>
-        </w:rPr>
-      </w:pPr>
-    </w:p>
-    <w:p>
-      <w:pPr>
-        <w:rPr>
-          <w:rtl/>
-          <w:lang/>
-        </w:rPr>
-      </w:pPr>
-    </w:p>
-    <w:p>
-      <w:pPr>
-        <w:rPr>
-          <w:rtl/>
-          <w:lang/>
-        </w:rPr>
-      </w:pPr>
-    </w:p>
-    <w:p>
-      <w:pPr>
-        <w:rPr>
-          <w:rtl/>
-          <w:lang/>
+        </w:rPr>
+      </w:pPr>
+    </w:p>
+    <w:p>
+      <w:pPr>
+        <w:rPr>
+          <w:rtl/>
+        </w:rPr>
+      </w:pPr>
+    </w:p>
+    <w:p>
+      <w:pPr>
+        <w:rPr>
+          <w:rtl/>
+        </w:rPr>
+      </w:pPr>
+    </w:p>
+    <w:p>
+      <w:pPr>
+        <w:rPr>
+          <w:rtl/>
+        </w:rPr>
+      </w:pPr>
+    </w:p>
+    <w:p>
+      <w:pPr>
+        <w:rPr>
+          <w:rtl/>
+        </w:rPr>
+      </w:pPr>
+    </w:p>
+    <w:p>
+      <w:pPr>
+        <w:rPr>
+          <w:rtl/>
+        </w:rPr>
+      </w:pPr>
+    </w:p>
+    <w:p>
+      <w:pPr>
+        <w:rPr>
+          <w:rtl/>
+        </w:rPr>
+      </w:pPr>
+    </w:p>
+    <w:p>
+      <w:pPr>
+        <w:rPr>
+          <w:rtl/>
+        </w:rPr>
+      </w:pPr>
+    </w:p>
+    <w:p>
+      <w:pPr>
+        <w:rPr>
+          <w:rtl/>
+        </w:rPr>
+      </w:pPr>
+    </w:p>
+    <w:p>
+      <w:pPr>
+        <w:rPr>
+          <w:rtl/>
+        </w:rPr>
+      </w:pPr>
+    </w:p>
+    <w:p>
+      <w:pPr>
+        <w:rPr>
+          <w:rtl/>
+        </w:rPr>
+      </w:pPr>
+    </w:p>
+    <w:p>
+      <w:pPr>
+        <w:rPr>
+          <w:rtl/>
+        </w:rPr>
+      </w:pPr>
+    </w:p>
+    <w:p>
+      <w:pPr>
+        <w:rPr>
+          <w:rtl/>
+        </w:rPr>
+      </w:pPr>
+    </w:p>
+    <w:p>
+      <w:pPr>
+        <w:rPr>
+          <w:rtl/>
+        </w:rPr>
+      </w:pPr>
+    </w:p>
+    <w:p>
+      <w:pPr>
+        <w:rPr>
+          <w:rtl/>
+        </w:rPr>
+      </w:pPr>
+    </w:p>
+    <w:p>
+      <w:pPr>
+        <w:rPr>
+          <w:rtl/>
+        </w:rPr>
+      </w:pPr>
+    </w:p>
+    <w:p>
+      <w:pPr>
+        <w:rPr>
+          <w:rtl/>
+        </w:rPr>
+      </w:pPr>
+    </w:p>
+    <w:p>
+      <w:pPr>
+        <w:rPr>
+          <w:rtl/>
+        </w:rPr>
+      </w:pPr>
+    </w:p>
+    <w:p>
+      <w:pPr>
+        <w:rPr>
+          <w:rtl/>
+        </w:rPr>
+      </w:pPr>
+    </w:p>
+    <w:p>
+      <w:pPr>
+        <w:rPr>
+          <w:rtl/>
+        </w:rPr>
+      </w:pPr>
+    </w:p>
+    <w:p>
+      <w:pPr>
+        <w:rPr>
+          <w:rtl/>
+        </w:rPr>
+      </w:pPr>
+    </w:p>
+    <w:p>
+      <w:pPr>
+        <w:rPr>
+          <w:rtl/>
+        </w:rPr>
+      </w:pPr>
+    </w:p>
+    <w:p>
+      <w:pPr>
+        <w:rPr>
+          <w:rtl/>
+        </w:rPr>
+      </w:pPr>
+    </w:p>
+    <w:p>
+      <w:pPr>
+        <w:rPr>
+          <w:rtl/>
+        </w:rPr>
+      </w:pPr>
+    </w:p>
+    <w:p>
+      <w:pPr>
+        <w:rPr>
+          <w:rtl/>
+        </w:rPr>
+      </w:pPr>
+    </w:p>
+    <w:p>
+      <w:pPr>
+        <w:rPr>
+          <w:rtl/>
+        </w:rPr>
+      </w:pPr>
+    </w:p>
+    <w:p>
+      <w:pPr>
+        <w:rPr>
+          <w:rtl/>
         </w:rPr>
       </w:pPr>
     </w:p>
@@ -16387,7 +16945,6 @@
           <w:rFonts w:hint="cs"/>
           <w:rtl/>
         </w:rPr>
-        <w:lastRenderedPageBreak/>
         <w:t xml:space="preserve">ניסוי ראשון </w:t>
       </w:r>
       <w:r>
@@ -16764,7 +17321,6 @@
       <w:r>
         <w:rPr>
           <w:rFonts w:ascii="Tahoma" w:hAnsi="Tahoma" w:cs="Tahoma"/>
-          <w:lang/>
         </w:rPr>
         <w:t>Arduino IDE</w:t>
       </w:r>
@@ -17047,6 +17603,7 @@
           <w:rFonts w:ascii="Tahoma" w:hAnsi="Tahoma" w:cs="Tahoma" w:hint="cs"/>
           <w:rtl/>
         </w:rPr>
+        <w:lastRenderedPageBreak/>
         <w:t xml:space="preserve">אופן מעשי - </w:t>
       </w:r>
       <w:r>
@@ -17157,7 +17714,6 @@
           <w:rFonts w:ascii="Tahoma" w:hAnsi="Tahoma" w:cs="Tahoma"/>
           <w:rtl/>
         </w:rPr>
-        <w:lastRenderedPageBreak/>
         <w:t xml:space="preserve">במהלך הניסוי למדתי כיצד לתכנת נורת </w:t>
       </w:r>
       <w:r>
@@ -17640,6 +18196,7 @@
           <w:sz w:val="21"/>
           <w:szCs w:val="21"/>
         </w:rPr>
+        <w:lastRenderedPageBreak/>
         <w:t>#define</w:t>
       </w:r>
       <w:r>
@@ -20502,7 +21059,6 @@
           <w:sz w:val="32"/>
           <w:szCs w:val="32"/>
         </w:rPr>
-        <w:lastRenderedPageBreak/>
         <w:drawing>
           <wp:inline distT="0" distB="0" distL="0" distR="0" wp14:anchorId="30E6D977" wp14:editId="50927319">
             <wp:extent cx="6415115" cy="1263650"/>
@@ -20987,13 +21543,14 @@
         </w:rPr>
         <w:t xml:space="preserve">תצוגת </w:t>
       </w:r>
-      <w:r>
-        <w:rPr>
-          <w:rFonts w:ascii="Tahoma" w:hAnsi="Tahoma" w:cs="Tahoma"/>
-          <w:lang/>
+      <w:proofErr w:type="spellStart"/>
+      <w:r>
+        <w:rPr>
+          <w:rFonts w:ascii="Tahoma" w:hAnsi="Tahoma" w:cs="Tahoma"/>
         </w:rPr>
         <w:t>Oled</w:t>
       </w:r>
+      <w:proofErr w:type="spellEnd"/>
     </w:p>
     <w:p>
       <w:pPr>
@@ -21018,7 +21575,6 @@
       <w:r>
         <w:rPr>
           <w:rFonts w:ascii="Tahoma" w:hAnsi="Tahoma" w:cs="Tahoma"/>
-          <w:lang/>
         </w:rPr>
         <w:t>Arduino IDE</w:t>
       </w:r>
@@ -21111,7 +21667,6 @@
           <w:rFonts w:ascii="Tahoma" w:hAnsi="Tahoma" w:cs="Tahoma"/>
           <w:rtl/>
         </w:rPr>
-        <w:lastRenderedPageBreak/>
         <w:t xml:space="preserve">תחילה </w:t>
       </w:r>
       <w:r>
@@ -21797,6 +22352,7 @@
           <w:szCs w:val="24"/>
           <w:rtl/>
         </w:rPr>
+        <w:lastRenderedPageBreak/>
         <w:t>סימולציה ב</w:t>
       </w:r>
       <w:r>
@@ -21850,7 +22406,6 @@
           <w:szCs w:val="24"/>
           <w:rtl/>
         </w:rPr>
-        <w:lastRenderedPageBreak/>
         <w:drawing>
           <wp:inline distT="0" distB="0" distL="0" distR="0" wp14:anchorId="64398488" wp14:editId="60E1BE41">
             <wp:extent cx="2152950" cy="3212935"/>
@@ -22838,6 +23393,7 @@
           <w:sz w:val="21"/>
           <w:szCs w:val="21"/>
         </w:rPr>
+        <w:lastRenderedPageBreak/>
         <w:t xml:space="preserve">  </w:t>
       </w:r>
       <w:proofErr w:type="spellStart"/>
@@ -24103,7 +24659,6 @@
         <w:rPr>
           <w:rFonts w:ascii="Tahoma" w:hAnsi="Tahoma" w:cs="Tahoma"/>
           <w:rtl/>
-          <w:lang/>
         </w:rPr>
       </w:pPr>
       <w:r>
@@ -24116,7 +24671,6 @@
       <w:r>
         <w:rPr>
           <w:rFonts w:ascii="Tahoma" w:hAnsi="Tahoma" w:cs="Tahoma"/>
-          <w:lang/>
         </w:rPr>
         <w:t>Ultrasonic</w:t>
       </w:r>
@@ -24131,20 +24685,12 @@
         <w:rPr>
           <w:rFonts w:ascii="Tahoma" w:hAnsi="Tahoma" w:cs="Tahoma"/>
         </w:rPr>
-        <w:t>O</w:t>
-      </w:r>
-      <w:r>
-        <w:rPr>
-          <w:rFonts w:ascii="Tahoma" w:hAnsi="Tahoma" w:cs="Tahoma"/>
-          <w:lang/>
-        </w:rPr>
-        <w:t>led</w:t>
-      </w:r>
-      <w:r>
-        <w:rPr>
-          <w:rFonts w:ascii="Tahoma" w:hAnsi="Tahoma" w:cs="Tahoma"/>
-          <w:rtl/>
-          <w:lang/>
+        <w:t>Oled</w:t>
+      </w:r>
+      <w:r>
+        <w:rPr>
+          <w:rFonts w:ascii="Tahoma" w:hAnsi="Tahoma" w:cs="Tahoma"/>
+          <w:rtl/>
         </w:rPr>
         <w:t>.</w:t>
       </w:r>
@@ -24177,7 +24723,6 @@
           <w:szCs w:val="28"/>
           <w:rtl/>
         </w:rPr>
-        <w:lastRenderedPageBreak/>
         <w:t>מטרת הניסי</w:t>
       </w:r>
     </w:p>
@@ -24198,7 +24743,6 @@
       <w:r>
         <w:rPr>
           <w:rFonts w:ascii="Tahoma" w:hAnsi="Tahoma" w:cs="Tahoma"/>
-          <w:lang/>
         </w:rPr>
         <w:t>Ultrasonic</w:t>
       </w:r>
@@ -24308,7 +24852,6 @@
       <w:r>
         <w:rPr>
           <w:rFonts w:ascii="Tahoma" w:hAnsi="Tahoma" w:cs="Tahoma"/>
-          <w:lang/>
         </w:rPr>
         <w:t>Oled</w:t>
       </w:r>
@@ -24336,7 +24879,6 @@
       <w:r>
         <w:rPr>
           <w:rFonts w:ascii="Tahoma" w:hAnsi="Tahoma" w:cs="Tahoma"/>
-          <w:lang/>
         </w:rPr>
         <w:t>Ultrasonic</w:t>
       </w:r>
@@ -24364,7 +24906,6 @@
       <w:r>
         <w:rPr>
           <w:rFonts w:ascii="Tahoma" w:hAnsi="Tahoma" w:cs="Tahoma"/>
-          <w:lang/>
         </w:rPr>
         <w:t>Arduino IDE</w:t>
       </w:r>
@@ -24487,14 +25028,7 @@
         <w:rPr>
           <w:rFonts w:ascii="Tahoma" w:hAnsi="Tahoma" w:cs="Tahoma"/>
         </w:rPr>
-        <w:t>O</w:t>
-      </w:r>
-      <w:r>
-        <w:rPr>
-          <w:rFonts w:ascii="Tahoma" w:hAnsi="Tahoma" w:cs="Tahoma"/>
-          <w:lang/>
-        </w:rPr>
-        <w:t>led</w:t>
+        <w:t>Oled</w:t>
       </w:r>
       <w:r>
         <w:rPr>
@@ -24506,7 +25040,6 @@
       <w:r>
         <w:rPr>
           <w:rFonts w:ascii="Tahoma" w:hAnsi="Tahoma" w:cs="Tahoma"/>
-          <w:lang/>
         </w:rPr>
         <w:t>Ultrasonic</w:t>
       </w:r>
@@ -24520,7 +25053,6 @@
       <w:r>
         <w:rPr>
           <w:rFonts w:ascii="Tahoma" w:hAnsi="Tahoma" w:cs="Tahoma"/>
-          <w:lang/>
         </w:rPr>
         <w:t>Oled</w:t>
       </w:r>
@@ -24560,7 +25092,6 @@
       <w:r>
         <w:rPr>
           <w:rFonts w:ascii="Tahoma" w:hAnsi="Tahoma" w:cs="Tahoma"/>
-          <w:lang/>
         </w:rPr>
         <w:t>Ultrasonic</w:t>
       </w:r>
@@ -24603,7 +25134,6 @@
         <w:rPr>
           <w:rFonts w:ascii="Tahoma" w:hAnsi="Tahoma" w:cs="Tahoma"/>
           <w:rtl/>
-          <w:lang/>
         </w:rPr>
       </w:pPr>
       <w:r>
@@ -24632,7 +25162,6 @@
       <w:r>
         <w:rPr>
           <w:rFonts w:ascii="Tahoma" w:hAnsi="Tahoma" w:cs="Tahoma"/>
-          <w:lang/>
         </w:rPr>
         <w:t>Arduino IDE</w:t>
       </w:r>
@@ -24640,14 +25169,12 @@
         <w:rPr>
           <w:rFonts w:ascii="Tahoma" w:hAnsi="Tahoma" w:cs="Tahoma"/>
           <w:rtl/>
-          <w:lang/>
         </w:rPr>
         <w:t xml:space="preserve"> וחיברנו בין הבקר למחשב בעזרת כבל </w:t>
       </w:r>
       <w:r>
         <w:rPr>
           <w:rFonts w:ascii="Tahoma" w:hAnsi="Tahoma" w:cs="Tahoma"/>
-          <w:lang/>
         </w:rPr>
         <w:t>USB</w:t>
       </w:r>
@@ -24655,7 +25182,6 @@
         <w:rPr>
           <w:rFonts w:ascii="Tahoma" w:hAnsi="Tahoma" w:cs="Tahoma"/>
           <w:rtl/>
-          <w:lang/>
         </w:rPr>
         <w:t xml:space="preserve"> כדי לצרוב את התוכנית. לאחר צריבה לקחנו דף והתחלנו להזיז אותו במרחקים שונים מהחיישן כדי לראות את תוצאות הניסוי.</w:t>
       </w:r>
@@ -24705,20 +25231,14 @@
           <w:rFonts w:ascii="Tahoma" w:hAnsi="Tahoma" w:cs="Tahoma"/>
           <w:rtl/>
         </w:rPr>
+        <w:lastRenderedPageBreak/>
         <w:t>כאשר הזזנו את הדף(המכשול) מול החיישן, הוא קלת את המרחק שהדף נמצא ממנו, והציג את זה ישר על מסך ה</w:t>
       </w:r>
       <w:r>
         <w:rPr>
           <w:rFonts w:ascii="Tahoma" w:hAnsi="Tahoma" w:cs="Tahoma"/>
         </w:rPr>
-        <w:t>O</w:t>
-      </w:r>
-      <w:r>
-        <w:rPr>
-          <w:rFonts w:ascii="Tahoma" w:hAnsi="Tahoma" w:cs="Tahoma"/>
-          <w:lang/>
-        </w:rPr>
-        <w:t>led</w:t>
+        <w:t>Oled</w:t>
       </w:r>
       <w:r>
         <w:rPr>
@@ -24975,13 +25495,11 @@
         <w:rPr>
           <w:rFonts w:ascii="Tahoma" w:hAnsi="Tahoma" w:cs="Tahoma"/>
           <w:rtl/>
-          <w:lang/>
-        </w:rPr>
-      </w:pPr>
-      <w:r>
-        <w:rPr>
-          <w:rFonts w:ascii="Tahoma" w:hAnsi="Tahoma" w:cs="Tahoma"/>
-          <w:lang/>
+        </w:rPr>
+      </w:pPr>
+      <w:r>
+        <w:rPr>
+          <w:rFonts w:ascii="Tahoma" w:hAnsi="Tahoma" w:cs="Tahoma"/>
         </w:rPr>
         <w:t>https://wokwi.com/projects/417704377996250113</w:t>
       </w:r>
@@ -25103,6 +25621,7 @@
           <w:sz w:val="21"/>
           <w:szCs w:val="21"/>
         </w:rPr>
+        <w:lastRenderedPageBreak/>
         <w:t>#include</w:t>
       </w:r>
       <w:r>
@@ -26011,7 +26530,6 @@
           <w:sz w:val="21"/>
           <w:szCs w:val="21"/>
         </w:rPr>
-        <w:lastRenderedPageBreak/>
         <w:t>display</w:t>
       </w:r>
       <w:r>
@@ -27549,6 +28067,7 @@
           <w:sz w:val="21"/>
           <w:szCs w:val="21"/>
         </w:rPr>
+        <w:lastRenderedPageBreak/>
         <w:t>display</w:t>
       </w:r>
       <w:r>
@@ -28121,6 +28640,7 @@
       </w:r>
     </w:p>
     <w:p/>
+    <w:p/>
   </w:endnote>
   <w:endnote w:type="continuationSeparator" w:id="0">
     <w:p>
@@ -28131,6 +28651,7 @@
         <w:continuationSeparator/>
       </w:r>
     </w:p>
+    <w:p/>
     <w:p/>
   </w:endnote>
 </w:endnotes>
@@ -28184,6 +28705,7 @@
     </w:pPr>
   </w:p>
   <w:p/>
+  <w:p/>
 </w:ftr>
 </file>
 
@@ -28199,6 +28721,7 @@
       </w:r>
     </w:p>
     <w:p/>
+    <w:p/>
   </w:footnote>
   <w:footnote w:type="continuationSeparator" w:id="0">
     <w:p>
@@ -28209,6 +28732,7 @@
         <w:continuationSeparator/>
       </w:r>
     </w:p>
+    <w:p/>
     <w:p/>
   </w:footnote>
 </w:footnotes>
@@ -28282,6 +28806,7 @@
     </w:r>
   </w:p>
   <w:p/>
+  <w:p/>
 </w:hdr>
 </file>
 
@@ -28978,6 +29503,119 @@
     </w:lvl>
   </w:abstractNum>
   <w:abstractNum w:abstractNumId="6" w15:restartNumberingAfterBreak="0">
+    <w:nsid w:val="0D692FD7"/>
+    <w:multiLevelType w:val="hybridMultilevel"/>
+    <w:tmpl w:val="F3BE5AD4"/>
+    <w:lvl w:ilvl="0" w:tplc="04090001">
+      <w:start w:val="1"/>
+      <w:numFmt w:val="bullet"/>
+      <w:lvlText w:val=""/>
+      <w:lvlJc w:val="left"/>
+      <w:pPr>
+        <w:ind w:left="720" w:hanging="360"/>
+      </w:pPr>
+      <w:rPr>
+        <w:rFonts w:ascii="Symbol" w:hAnsi="Symbol" w:hint="default"/>
+      </w:rPr>
+    </w:lvl>
+    <w:lvl w:ilvl="1" w:tplc="04090003" w:tentative="1">
+      <w:start w:val="1"/>
+      <w:numFmt w:val="bullet"/>
+      <w:lvlText w:val="o"/>
+      <w:lvlJc w:val="left"/>
+      <w:pPr>
+        <w:ind w:left="1440" w:hanging="360"/>
+      </w:pPr>
+      <w:rPr>
+        <w:rFonts w:ascii="Courier New" w:hAnsi="Courier New" w:cs="Courier New" w:hint="default"/>
+      </w:rPr>
+    </w:lvl>
+    <w:lvl w:ilvl="2" w:tplc="04090005" w:tentative="1">
+      <w:start w:val="1"/>
+      <w:numFmt w:val="bullet"/>
+      <w:lvlText w:val=""/>
+      <w:lvlJc w:val="left"/>
+      <w:pPr>
+        <w:ind w:left="2160" w:hanging="360"/>
+      </w:pPr>
+      <w:rPr>
+        <w:rFonts w:ascii="Wingdings" w:hAnsi="Wingdings" w:hint="default"/>
+      </w:rPr>
+    </w:lvl>
+    <w:lvl w:ilvl="3" w:tplc="04090001" w:tentative="1">
+      <w:start w:val="1"/>
+      <w:numFmt w:val="bullet"/>
+      <w:lvlText w:val=""/>
+      <w:lvlJc w:val="left"/>
+      <w:pPr>
+        <w:ind w:left="2880" w:hanging="360"/>
+      </w:pPr>
+      <w:rPr>
+        <w:rFonts w:ascii="Symbol" w:hAnsi="Symbol" w:hint="default"/>
+      </w:rPr>
+    </w:lvl>
+    <w:lvl w:ilvl="4" w:tplc="04090003" w:tentative="1">
+      <w:start w:val="1"/>
+      <w:numFmt w:val="bullet"/>
+      <w:lvlText w:val="o"/>
+      <w:lvlJc w:val="left"/>
+      <w:pPr>
+        <w:ind w:left="3600" w:hanging="360"/>
+      </w:pPr>
+      <w:rPr>
+        <w:rFonts w:ascii="Courier New" w:hAnsi="Courier New" w:cs="Courier New" w:hint="default"/>
+      </w:rPr>
+    </w:lvl>
+    <w:lvl w:ilvl="5" w:tplc="04090005" w:tentative="1">
+      <w:start w:val="1"/>
+      <w:numFmt w:val="bullet"/>
+      <w:lvlText w:val=""/>
+      <w:lvlJc w:val="left"/>
+      <w:pPr>
+        <w:ind w:left="4320" w:hanging="360"/>
+      </w:pPr>
+      <w:rPr>
+        <w:rFonts w:ascii="Wingdings" w:hAnsi="Wingdings" w:hint="default"/>
+      </w:rPr>
+    </w:lvl>
+    <w:lvl w:ilvl="6" w:tplc="04090001" w:tentative="1">
+      <w:start w:val="1"/>
+      <w:numFmt w:val="bullet"/>
+      <w:lvlText w:val=""/>
+      <w:lvlJc w:val="left"/>
+      <w:pPr>
+        <w:ind w:left="5040" w:hanging="360"/>
+      </w:pPr>
+      <w:rPr>
+        <w:rFonts w:ascii="Symbol" w:hAnsi="Symbol" w:hint="default"/>
+      </w:rPr>
+    </w:lvl>
+    <w:lvl w:ilvl="7" w:tplc="04090003" w:tentative="1">
+      <w:start w:val="1"/>
+      <w:numFmt w:val="bullet"/>
+      <w:lvlText w:val="o"/>
+      <w:lvlJc w:val="left"/>
+      <w:pPr>
+        <w:ind w:left="5760" w:hanging="360"/>
+      </w:pPr>
+      <w:rPr>
+        <w:rFonts w:ascii="Courier New" w:hAnsi="Courier New" w:cs="Courier New" w:hint="default"/>
+      </w:rPr>
+    </w:lvl>
+    <w:lvl w:ilvl="8" w:tplc="04090005" w:tentative="1">
+      <w:start w:val="1"/>
+      <w:numFmt w:val="bullet"/>
+      <w:lvlText w:val=""/>
+      <w:lvlJc w:val="left"/>
+      <w:pPr>
+        <w:ind w:left="6480" w:hanging="360"/>
+      </w:pPr>
+      <w:rPr>
+        <w:rFonts w:ascii="Wingdings" w:hAnsi="Wingdings" w:hint="default"/>
+      </w:rPr>
+    </w:lvl>
+  </w:abstractNum>
+  <w:abstractNum w:abstractNumId="7" w15:restartNumberingAfterBreak="0">
     <w:nsid w:val="0D971551"/>
     <w:multiLevelType w:val="multilevel"/>
     <w:tmpl w:val="0E703A82"/>
@@ -29126,7 +29764,7 @@
       </w:rPr>
     </w:lvl>
   </w:abstractNum>
-  <w:abstractNum w:abstractNumId="7" w15:restartNumberingAfterBreak="0">
+  <w:abstractNum w:abstractNumId="8" w15:restartNumberingAfterBreak="0">
     <w:nsid w:val="19D129E9"/>
     <w:multiLevelType w:val="multilevel"/>
     <w:tmpl w:val="3998F61A"/>
@@ -29243,7 +29881,7 @@
       </w:pPr>
     </w:lvl>
   </w:abstractNum>
-  <w:abstractNum w:abstractNumId="8" w15:restartNumberingAfterBreak="0">
+  <w:abstractNum w:abstractNumId="9" w15:restartNumberingAfterBreak="0">
     <w:nsid w:val="1A4B5A99"/>
     <w:multiLevelType w:val="hybridMultilevel"/>
     <w:tmpl w:val="B520FD0A"/>
@@ -29356,7 +29994,7 @@
       </w:rPr>
     </w:lvl>
   </w:abstractNum>
-  <w:abstractNum w:abstractNumId="9" w15:restartNumberingAfterBreak="0">
+  <w:abstractNum w:abstractNumId="10" w15:restartNumberingAfterBreak="0">
     <w:nsid w:val="20115213"/>
     <w:multiLevelType w:val="hybridMultilevel"/>
     <w:tmpl w:val="BF025068"/>
@@ -29469,7 +30107,7 @@
       </w:rPr>
     </w:lvl>
   </w:abstractNum>
-  <w:abstractNum w:abstractNumId="10" w15:restartNumberingAfterBreak="0">
+  <w:abstractNum w:abstractNumId="11" w15:restartNumberingAfterBreak="0">
     <w:nsid w:val="24E4722C"/>
     <w:multiLevelType w:val="hybridMultilevel"/>
     <w:tmpl w:val="96024918"/>
@@ -29582,7 +30220,7 @@
       </w:rPr>
     </w:lvl>
   </w:abstractNum>
-  <w:abstractNum w:abstractNumId="11" w15:restartNumberingAfterBreak="0">
+  <w:abstractNum w:abstractNumId="12" w15:restartNumberingAfterBreak="0">
     <w:nsid w:val="26776F1D"/>
     <w:multiLevelType w:val="multilevel"/>
     <w:tmpl w:val="364E971A"/>
@@ -29731,7 +30369,7 @@
       </w:rPr>
     </w:lvl>
   </w:abstractNum>
-  <w:abstractNum w:abstractNumId="12" w15:restartNumberingAfterBreak="0">
+  <w:abstractNum w:abstractNumId="13" w15:restartNumberingAfterBreak="0">
     <w:nsid w:val="29B25BC8"/>
     <w:multiLevelType w:val="multilevel"/>
     <w:tmpl w:val="364E971A"/>
@@ -29880,7 +30518,7 @@
       </w:rPr>
     </w:lvl>
   </w:abstractNum>
-  <w:abstractNum w:abstractNumId="13" w15:restartNumberingAfterBreak="0">
+  <w:abstractNum w:abstractNumId="14" w15:restartNumberingAfterBreak="0">
     <w:nsid w:val="2F15694B"/>
     <w:multiLevelType w:val="hybridMultilevel"/>
     <w:tmpl w:val="D1DA1542"/>
@@ -29998,7 +30636,7 @@
       </w:pPr>
     </w:lvl>
   </w:abstractNum>
-  <w:abstractNum w:abstractNumId="14" w15:restartNumberingAfterBreak="0">
+  <w:abstractNum w:abstractNumId="15" w15:restartNumberingAfterBreak="0">
     <w:nsid w:val="2F755D9F"/>
     <w:multiLevelType w:val="multilevel"/>
     <w:tmpl w:val="CD802FD4"/>
@@ -30147,7 +30785,7 @@
       </w:rPr>
     </w:lvl>
   </w:abstractNum>
-  <w:abstractNum w:abstractNumId="15" w15:restartNumberingAfterBreak="0">
+  <w:abstractNum w:abstractNumId="16" w15:restartNumberingAfterBreak="0">
     <w:nsid w:val="306C5342"/>
     <w:multiLevelType w:val="multilevel"/>
     <w:tmpl w:val="C2F25F70"/>
@@ -30296,7 +30934,7 @@
       </w:rPr>
     </w:lvl>
   </w:abstractNum>
-  <w:abstractNum w:abstractNumId="16" w15:restartNumberingAfterBreak="0">
+  <w:abstractNum w:abstractNumId="17" w15:restartNumberingAfterBreak="0">
     <w:nsid w:val="30C76C83"/>
     <w:multiLevelType w:val="multilevel"/>
     <w:tmpl w:val="614E4446"/>
@@ -30445,7 +31083,7 @@
       </w:rPr>
     </w:lvl>
   </w:abstractNum>
-  <w:abstractNum w:abstractNumId="17" w15:restartNumberingAfterBreak="0">
+  <w:abstractNum w:abstractNumId="18" w15:restartNumberingAfterBreak="0">
     <w:nsid w:val="33005739"/>
     <w:multiLevelType w:val="hybridMultilevel"/>
     <w:tmpl w:val="61D6B394"/>
@@ -30558,7 +31196,7 @@
       </w:rPr>
     </w:lvl>
   </w:abstractNum>
-  <w:abstractNum w:abstractNumId="18" w15:restartNumberingAfterBreak="0">
+  <w:abstractNum w:abstractNumId="19" w15:restartNumberingAfterBreak="0">
     <w:nsid w:val="36634361"/>
     <w:multiLevelType w:val="multilevel"/>
     <w:tmpl w:val="494E9E0A"/>
@@ -30707,7 +31345,7 @@
       </w:rPr>
     </w:lvl>
   </w:abstractNum>
-  <w:abstractNum w:abstractNumId="19" w15:restartNumberingAfterBreak="0">
+  <w:abstractNum w:abstractNumId="20" w15:restartNumberingAfterBreak="0">
     <w:nsid w:val="36D8307D"/>
     <w:multiLevelType w:val="hybridMultilevel"/>
     <w:tmpl w:val="9AC287E8"/>
@@ -30820,7 +31458,7 @@
       </w:rPr>
     </w:lvl>
   </w:abstractNum>
-  <w:abstractNum w:abstractNumId="20" w15:restartNumberingAfterBreak="0">
+  <w:abstractNum w:abstractNumId="21" w15:restartNumberingAfterBreak="0">
     <w:nsid w:val="36E64821"/>
     <w:multiLevelType w:val="hybridMultilevel"/>
     <w:tmpl w:val="BCFCC672"/>
@@ -30933,7 +31571,7 @@
       </w:rPr>
     </w:lvl>
   </w:abstractNum>
-  <w:abstractNum w:abstractNumId="21" w15:restartNumberingAfterBreak="0">
+  <w:abstractNum w:abstractNumId="22" w15:restartNumberingAfterBreak="0">
     <w:nsid w:val="4055325D"/>
     <w:multiLevelType w:val="multilevel"/>
     <w:tmpl w:val="91B07514"/>
@@ -31082,7 +31720,7 @@
       </w:rPr>
     </w:lvl>
   </w:abstractNum>
-  <w:abstractNum w:abstractNumId="22" w15:restartNumberingAfterBreak="0">
+  <w:abstractNum w:abstractNumId="23" w15:restartNumberingAfterBreak="0">
     <w:nsid w:val="41AC2C42"/>
     <w:multiLevelType w:val="hybridMultilevel"/>
     <w:tmpl w:val="44A4A964"/>
@@ -31195,7 +31833,7 @@
       </w:rPr>
     </w:lvl>
   </w:abstractNum>
-  <w:abstractNum w:abstractNumId="23" w15:restartNumberingAfterBreak="0">
+  <w:abstractNum w:abstractNumId="24" w15:restartNumberingAfterBreak="0">
     <w:nsid w:val="4A7937CD"/>
     <w:multiLevelType w:val="hybridMultilevel"/>
     <w:tmpl w:val="C5AAC1E0"/>
@@ -31308,7 +31946,7 @@
       </w:rPr>
     </w:lvl>
   </w:abstractNum>
-  <w:abstractNum w:abstractNumId="24" w15:restartNumberingAfterBreak="0">
+  <w:abstractNum w:abstractNumId="25" w15:restartNumberingAfterBreak="0">
     <w:nsid w:val="4F437FED"/>
     <w:multiLevelType w:val="multilevel"/>
     <w:tmpl w:val="0A6C0AF2"/>
@@ -31457,7 +32095,7 @@
       </w:rPr>
     </w:lvl>
   </w:abstractNum>
-  <w:abstractNum w:abstractNumId="25" w15:restartNumberingAfterBreak="0">
+  <w:abstractNum w:abstractNumId="26" w15:restartNumberingAfterBreak="0">
     <w:nsid w:val="54C30D42"/>
     <w:multiLevelType w:val="multilevel"/>
     <w:tmpl w:val="BB74C04A"/>
@@ -31606,7 +32244,7 @@
       </w:rPr>
     </w:lvl>
   </w:abstractNum>
-  <w:abstractNum w:abstractNumId="26" w15:restartNumberingAfterBreak="0">
+  <w:abstractNum w:abstractNumId="27" w15:restartNumberingAfterBreak="0">
     <w:nsid w:val="5D7E72F4"/>
     <w:multiLevelType w:val="multilevel"/>
     <w:tmpl w:val="364E971A"/>
@@ -31755,7 +32393,7 @@
       </w:rPr>
     </w:lvl>
   </w:abstractNum>
-  <w:abstractNum w:abstractNumId="27" w15:restartNumberingAfterBreak="0">
+  <w:abstractNum w:abstractNumId="28" w15:restartNumberingAfterBreak="0">
     <w:nsid w:val="628960A5"/>
     <w:multiLevelType w:val="hybridMultilevel"/>
     <w:tmpl w:val="683A0DBA"/>
@@ -31868,7 +32506,7 @@
       </w:rPr>
     </w:lvl>
   </w:abstractNum>
-  <w:abstractNum w:abstractNumId="28" w15:restartNumberingAfterBreak="0">
+  <w:abstractNum w:abstractNumId="29" w15:restartNumberingAfterBreak="0">
     <w:nsid w:val="632D6FBA"/>
     <w:multiLevelType w:val="multilevel"/>
     <w:tmpl w:val="364E971A"/>
@@ -32017,7 +32655,7 @@
       </w:rPr>
     </w:lvl>
   </w:abstractNum>
-  <w:abstractNum w:abstractNumId="29" w15:restartNumberingAfterBreak="0">
+  <w:abstractNum w:abstractNumId="30" w15:restartNumberingAfterBreak="0">
     <w:nsid w:val="64CD65C7"/>
     <w:multiLevelType w:val="hybridMultilevel"/>
     <w:tmpl w:val="7A429F20"/>
@@ -32130,7 +32768,7 @@
       </w:rPr>
     </w:lvl>
   </w:abstractNum>
-  <w:abstractNum w:abstractNumId="30" w15:restartNumberingAfterBreak="0">
+  <w:abstractNum w:abstractNumId="31" w15:restartNumberingAfterBreak="0">
     <w:nsid w:val="66190FE0"/>
     <w:multiLevelType w:val="multilevel"/>
     <w:tmpl w:val="364E971A"/>
@@ -32279,7 +32917,7 @@
       </w:rPr>
     </w:lvl>
   </w:abstractNum>
-  <w:abstractNum w:abstractNumId="31" w15:restartNumberingAfterBreak="0">
+  <w:abstractNum w:abstractNumId="32" w15:restartNumberingAfterBreak="0">
     <w:nsid w:val="6C623258"/>
     <w:multiLevelType w:val="multilevel"/>
     <w:tmpl w:val="364E971A"/>
@@ -32428,7 +33066,7 @@
       </w:rPr>
     </w:lvl>
   </w:abstractNum>
-  <w:abstractNum w:abstractNumId="32" w15:restartNumberingAfterBreak="0">
+  <w:abstractNum w:abstractNumId="33" w15:restartNumberingAfterBreak="0">
     <w:nsid w:val="6F960A57"/>
     <w:multiLevelType w:val="multilevel"/>
     <w:tmpl w:val="A2042338"/>
@@ -32577,7 +33215,7 @@
       </w:rPr>
     </w:lvl>
   </w:abstractNum>
-  <w:abstractNum w:abstractNumId="33" w15:restartNumberingAfterBreak="0">
+  <w:abstractNum w:abstractNumId="34" w15:restartNumberingAfterBreak="0">
     <w:nsid w:val="71A7731A"/>
     <w:multiLevelType w:val="multilevel"/>
     <w:tmpl w:val="364E971A"/>
@@ -32726,7 +33364,7 @@
       </w:rPr>
     </w:lvl>
   </w:abstractNum>
-  <w:abstractNum w:abstractNumId="34" w15:restartNumberingAfterBreak="0">
+  <w:abstractNum w:abstractNumId="35" w15:restartNumberingAfterBreak="0">
     <w:nsid w:val="7A9C0F0F"/>
     <w:multiLevelType w:val="hybridMultilevel"/>
     <w:tmpl w:val="A44C69A0"/>
@@ -32839,7 +33477,7 @@
       </w:rPr>
     </w:lvl>
   </w:abstractNum>
-  <w:abstractNum w:abstractNumId="35" w15:restartNumberingAfterBreak="0">
+  <w:abstractNum w:abstractNumId="36" w15:restartNumberingAfterBreak="0">
     <w:nsid w:val="7CCE439B"/>
     <w:multiLevelType w:val="multilevel"/>
     <w:tmpl w:val="364E971A"/>
@@ -32989,34 +33627,34 @@
     </w:lvl>
   </w:abstractNum>
   <w:num w:numId="1">
-    <w:abstractNumId w:val="13"/>
+    <w:abstractNumId w:val="14"/>
   </w:num>
   <w:num w:numId="2">
     <w:abstractNumId w:val="3"/>
   </w:num>
   <w:num w:numId="3">
-    <w:abstractNumId w:val="22"/>
+    <w:abstractNumId w:val="23"/>
   </w:num>
   <w:num w:numId="4">
     <w:abstractNumId w:val="5"/>
   </w:num>
   <w:num w:numId="5">
-    <w:abstractNumId w:val="25"/>
+    <w:abstractNumId w:val="26"/>
   </w:num>
   <w:num w:numId="6">
-    <w:abstractNumId w:val="18"/>
+    <w:abstractNumId w:val="19"/>
   </w:num>
   <w:num w:numId="7">
-    <w:abstractNumId w:val="16"/>
+    <w:abstractNumId w:val="17"/>
   </w:num>
   <w:num w:numId="8">
-    <w:abstractNumId w:val="21"/>
+    <w:abstractNumId w:val="22"/>
   </w:num>
   <w:num w:numId="9">
-    <w:abstractNumId w:val="6"/>
+    <w:abstractNumId w:val="7"/>
   </w:num>
   <w:num w:numId="10">
-    <w:abstractNumId w:val="32"/>
+    <w:abstractNumId w:val="33"/>
   </w:num>
   <w:num w:numId="11">
     <w:abstractNumId w:val="2"/>
@@ -33025,76 +33663,79 @@
     <w:abstractNumId w:val="0"/>
   </w:num>
   <w:num w:numId="13">
-    <w:abstractNumId w:val="26"/>
+    <w:abstractNumId w:val="27"/>
   </w:num>
   <w:num w:numId="14">
-    <w:abstractNumId w:val="27"/>
+    <w:abstractNumId w:val="28"/>
   </w:num>
   <w:num w:numId="15">
-    <w:abstractNumId w:val="28"/>
+    <w:abstractNumId w:val="29"/>
   </w:num>
   <w:num w:numId="16">
-    <w:abstractNumId w:val="33"/>
+    <w:abstractNumId w:val="34"/>
   </w:num>
   <w:num w:numId="17">
+    <w:abstractNumId w:val="32"/>
+  </w:num>
+  <w:num w:numId="18">
     <w:abstractNumId w:val="31"/>
   </w:num>
-  <w:num w:numId="18">
-    <w:abstractNumId w:val="30"/>
+  <w:num w:numId="19">
+    <w:abstractNumId w:val="13"/>
   </w:num>
-  <w:num w:numId="19">
+  <w:num w:numId="20">
     <w:abstractNumId w:val="12"/>
   </w:num>
-  <w:num w:numId="20">
-    <w:abstractNumId w:val="11"/>
-  </w:num>
   <w:num w:numId="21">
-    <w:abstractNumId w:val="35"/>
+    <w:abstractNumId w:val="36"/>
   </w:num>
   <w:num w:numId="22">
-    <w:abstractNumId w:val="7"/>
+    <w:abstractNumId w:val="8"/>
   </w:num>
   <w:num w:numId="23">
-    <w:abstractNumId w:val="10"/>
+    <w:abstractNumId w:val="11"/>
   </w:num>
   <w:num w:numId="24">
     <w:abstractNumId w:val="4"/>
   </w:num>
   <w:num w:numId="25">
-    <w:abstractNumId w:val="20"/>
+    <w:abstractNumId w:val="21"/>
   </w:num>
   <w:num w:numId="26">
-    <w:abstractNumId w:val="29"/>
+    <w:abstractNumId w:val="30"/>
   </w:num>
   <w:num w:numId="27">
-    <w:abstractNumId w:val="34"/>
+    <w:abstractNumId w:val="35"/>
   </w:num>
   <w:num w:numId="28">
-    <w:abstractNumId w:val="23"/>
+    <w:abstractNumId w:val="24"/>
   </w:num>
   <w:num w:numId="29">
-    <w:abstractNumId w:val="17"/>
+    <w:abstractNumId w:val="18"/>
   </w:num>
   <w:num w:numId="30">
-    <w:abstractNumId w:val="8"/>
+    <w:abstractNumId w:val="9"/>
   </w:num>
   <w:num w:numId="31">
     <w:abstractNumId w:val="1"/>
   </w:num>
   <w:num w:numId="32">
-    <w:abstractNumId w:val="9"/>
+    <w:abstractNumId w:val="10"/>
   </w:num>
   <w:num w:numId="33">
-    <w:abstractNumId w:val="19"/>
+    <w:abstractNumId w:val="20"/>
   </w:num>
   <w:num w:numId="34">
-    <w:abstractNumId w:val="14"/>
+    <w:abstractNumId w:val="15"/>
   </w:num>
   <w:num w:numId="35">
-    <w:abstractNumId w:val="15"/>
+    <w:abstractNumId w:val="16"/>
   </w:num>
   <w:num w:numId="36">
-    <w:abstractNumId w:val="24"/>
+    <w:abstractNumId w:val="25"/>
+  </w:num>
+  <w:num w:numId="37">
+    <w:abstractNumId w:val="6"/>
   </w:num>
 </w:numbering>
 </file>
@@ -33708,6 +34349,7 @@
   <w:style w:type="character" w:default="1" w:styleId="a0">
     <w:name w:val="Default Paragraph Font"/>
     <w:uiPriority w:val="1"/>
+    <w:semiHidden/>
     <w:unhideWhenUsed/>
   </w:style>
   <w:style w:type="table" w:default="1" w:styleId="a1">
@@ -34491,7 +35133,7 @@
 </file>
 
 <file path=customXml/itemProps1.xml><?xml version="1.0" encoding="utf-8"?>
-<ds:datastoreItem xmlns:ds="http://schemas.openxmlformats.org/officeDocument/2006/customXml" ds:itemID="{D584DB28-8DA0-424E-A20F-C5689C303215}">
+<ds:datastoreItem xmlns:ds="http://schemas.openxmlformats.org/officeDocument/2006/customXml" ds:itemID="{BDB9DA8F-5754-4856-B106-A26B1E09CDD8}">
   <ds:schemaRefs>
     <ds:schemaRef ds:uri="http://schemas.openxmlformats.org/officeDocument/2006/bibliography"/>
   </ds:schemaRefs>

</xml_diff>